<commit_message>
docs: align report A with template and verify encryption evidence
</commit_message>
<xml_diff>
--- a/reports/成员A_选票编码与Paillier加密模块_报告.docx
+++ b/reports/成员A_选票编码与Paillier加密模块_报告.docx
@@ -187,7 +187,7 @@
         <w:tabs>
           <w:tab w:val="left" w:pos="6870"/>
         </w:tabs>
-        <w:ind w:firstLine="1078" w:firstLineChars="245"/>
+        <w:ind w:firstLine="0" w:left="1080"/>
         <w:rPr>
           <w:sz w:val="44"/>
           <w:szCs w:val="44"/>
@@ -196,14 +196,18 @@
       </w:pPr>
       <w:r>
         <w:rPr>
-          <w:rFonts w:hint="eastAsia" w:ascii="黑体" w:eastAsia="黑体"/>
+          <w:rFonts w:hint="eastAsia" w:ascii="黑体" w:eastAsia="黑体" w:hAnsi="黑体"/>
+          <w:b w:val="0"/>
+          <w:color w:val="000000"/>
           <w:sz w:val="44"/>
         </w:rPr>
         <w:t>题   目：基于同态加密的</w:t>
       </w:r>
       <w:r>
         <w:rPr>
-          <w:rFonts w:hint="eastAsia"/>
+          <w:rFonts w:hint="eastAsia" w:ascii="黑体" w:hAnsi="黑体" w:eastAsia="黑体"/>
+          <w:b w:val="0"/>
+          <w:color w:val="000000"/>
           <w:sz w:val="44"/>
           <w:szCs w:val="44"/>
           <w:u w:val="single"/>
@@ -211,6 +215,9 @@
       </w:r>
       <w:r>
         <w:rPr>
+          <w:rFonts w:ascii="黑体" w:hAnsi="黑体" w:eastAsia="黑体"/>
+          <w:b w:val="0"/>
+          <w:color w:val="000000"/>
           <w:sz w:val="44"/>
           <w:szCs w:val="44"/>
           <w:u w:val="single"/>
@@ -218,7 +225,9 @@
       </w:r>
       <w:r>
         <w:rPr>
-          <w:rFonts w:hint="eastAsia"/>
+          <w:rFonts w:hint="eastAsia" w:ascii="黑体" w:hAnsi="黑体" w:eastAsia="黑体"/>
+          <w:b w:val="0"/>
+          <w:color w:val="000000"/>
           <w:sz w:val="44"/>
           <w:szCs w:val="44"/>
           <w:u w:val="single"/>
@@ -230,7 +239,7 @@
         <w:tabs>
           <w:tab w:val="left" w:pos="6870"/>
         </w:tabs>
-        <w:ind w:firstLine="1078" w:firstLineChars="245"/>
+        <w:ind w:firstLine="0" w:left="3060"/>
         <w:rPr>
           <w:sz w:val="44"/>
           <w:szCs w:val="44"/>
@@ -239,7 +248,9 @@
       </w:pPr>
       <w:r>
         <w:rPr>
-          <w:rFonts w:hint="eastAsia"/>
+          <w:rFonts w:hint="eastAsia" w:ascii="黑体" w:hAnsi="黑体" w:eastAsia="黑体"/>
+          <w:b w:val="0"/>
+          <w:color w:val="000000"/>
           <w:sz w:val="44"/>
           <w:szCs w:val="44"/>
         </w:rPr>
@@ -247,7 +258,9 @@
       </w:r>
       <w:r>
         <w:rPr>
-          <w:rFonts w:hint="eastAsia"/>
+          <w:rFonts w:hint="eastAsia" w:ascii="黑体" w:hAnsi="黑体" w:eastAsia="黑体"/>
+          <w:b w:val="0"/>
+          <w:color w:val="000000"/>
           <w:sz w:val="44"/>
           <w:szCs w:val="44"/>
           <w:u w:val="single"/>
@@ -255,6 +268,9 @@
       </w:r>
       <w:r>
         <w:rPr>
+          <w:rFonts w:ascii="黑体" w:hAnsi="黑体" w:eastAsia="黑体"/>
+          <w:b w:val="0"/>
+          <w:color w:val="000000"/>
           <w:sz w:val="44"/>
           <w:szCs w:val="44"/>
           <w:u w:val="single"/>
@@ -262,7 +278,9 @@
       </w:r>
       <w:r>
         <w:rPr>
-          <w:rFonts w:hint="eastAsia"/>
+          <w:rFonts w:hint="eastAsia" w:ascii="黑体" w:hAnsi="黑体" w:eastAsia="黑体"/>
+          <w:b w:val="0"/>
+          <w:color w:val="000000"/>
           <w:sz w:val="44"/>
           <w:szCs w:val="44"/>
           <w:u w:val="single"/>
@@ -450,10 +468,10 @@
             </w:pPr>
             <w:r>
               <w:rPr>
-                <w:rFonts w:ascii="宋体" w:hAnsi="宋体" w:eastAsia="宋体"/>
+                <w:rFonts w:ascii="Times New Roman" w:hAnsi="Times New Roman" w:eastAsia="宋体"/>
                 <w:b w:val="0"/>
                 <w:color w:val="000000"/>
-                <w:sz w:val="24"/>
+                <w:sz w:val="30"/>
               </w:rPr>
               <w:t>成员A  姓名：________</w:t>
             </w:r>
@@ -522,10 +540,10 @@
             </w:pPr>
             <w:r>
               <w:rPr>
-                <w:rFonts w:ascii="宋体" w:hAnsi="宋体" w:eastAsia="宋体"/>
+                <w:rFonts w:ascii="Times New Roman" w:hAnsi="Times New Roman" w:eastAsia="宋体"/>
                 <w:b w:val="0"/>
                 <w:color w:val="000000"/>
-                <w:sz w:val="24"/>
+                <w:sz w:val="30"/>
               </w:rPr>
               <w:t>B230414  学号：________</w:t>
             </w:r>
@@ -738,67 +756,67 @@
             </w:pPr>
             <w:r>
               <w:rPr>
-                <w:rFonts w:ascii="宋体" w:hAnsi="宋体" w:cs="Times New Roman" w:eastAsia="宋体"/>
+                <w:rFonts w:ascii="Times New Roman" w:hAnsi="Times New Roman" w:cs="Times New Roman" w:eastAsia="宋体"/>
                 <w:b w:val="0"/>
                 <w:color w:val="000000"/>
-                <w:sz w:val="24"/>
+                <w:sz w:val="30"/>
                 <w:szCs w:val="30"/>
               </w:rPr>
               <w:t>2026.10.26—2026.11.06</w:t>
             </w:r>
             <w:r>
               <w:rPr>
-                <w:rFonts w:hint="eastAsia" w:ascii="宋体" w:hAnsi="宋体" w:cs="Times New Roman" w:eastAsia="宋体"/>
+                <w:rFonts w:hint="eastAsia" w:ascii="Times New Roman" w:hAnsi="Times New Roman" w:cs="Times New Roman" w:eastAsia="宋体"/>
                 <w:b w:val="0"/>
                 <w:color w:val="000000"/>
-                <w:sz w:val="24"/>
+                <w:sz w:val="30"/>
                 <w:szCs w:val="30"/>
                 <w:lang w:val="en-US" w:eastAsia="zh-CN"/>
               </w:rPr>
             </w:r>
             <w:r>
               <w:rPr>
-                <w:rFonts w:ascii="宋体" w:hAnsi="宋体" w:cs="Times New Roman" w:eastAsia="宋体"/>
+                <w:rFonts w:ascii="Times New Roman" w:hAnsi="Times New Roman" w:cs="Times New Roman" w:eastAsia="宋体"/>
                 <w:b w:val="0"/>
                 <w:color w:val="000000"/>
-                <w:sz w:val="24"/>
+                <w:sz w:val="30"/>
                 <w:szCs w:val="30"/>
               </w:rPr>
             </w:r>
             <w:r>
               <w:rPr>
-                <w:rFonts w:hint="eastAsia" w:ascii="宋体" w:hAnsi="宋体" w:cs="Times New Roman" w:eastAsia="宋体"/>
+                <w:rFonts w:hint="eastAsia" w:ascii="Times New Roman" w:hAnsi="Times New Roman" w:cs="Times New Roman" w:eastAsia="宋体"/>
                 <w:b w:val="0"/>
                 <w:color w:val="000000"/>
-                <w:sz w:val="24"/>
+                <w:sz w:val="30"/>
                 <w:szCs w:val="30"/>
                 <w:lang w:val="en-US" w:eastAsia="zh-CN"/>
               </w:rPr>
             </w:r>
             <w:r>
               <w:rPr>
-                <w:rFonts w:ascii="宋体" w:hAnsi="宋体" w:cs="Times New Roman" w:eastAsia="宋体"/>
+                <w:rFonts w:ascii="Times New Roman" w:hAnsi="Times New Roman" w:cs="Times New Roman" w:eastAsia="宋体"/>
                 <w:b w:val="0"/>
                 <w:color w:val="000000"/>
-                <w:sz w:val="24"/>
+                <w:sz w:val="30"/>
                 <w:szCs w:val="30"/>
               </w:rPr>
             </w:r>
             <w:r>
               <w:rPr>
-                <w:rFonts w:hint="eastAsia" w:ascii="宋体" w:hAnsi="宋体" w:cs="Times New Roman" w:eastAsia="宋体"/>
+                <w:rFonts w:hint="eastAsia" w:ascii="Times New Roman" w:hAnsi="Times New Roman" w:cs="Times New Roman" w:eastAsia="宋体"/>
                 <w:b w:val="0"/>
                 <w:color w:val="000000"/>
-                <w:sz w:val="24"/>
+                <w:sz w:val="30"/>
                 <w:szCs w:val="30"/>
               </w:rPr>
             </w:r>
             <w:r>
               <w:rPr>
-                <w:rFonts w:ascii="宋体" w:hAnsi="宋体" w:cs="Times New Roman" w:eastAsia="宋体"/>
+                <w:rFonts w:ascii="Times New Roman" w:hAnsi="Times New Roman" w:cs="Times New Roman" w:eastAsia="宋体"/>
                 <w:b w:val="0"/>
                 <w:color w:val="000000"/>
-                <w:sz w:val="24"/>
+                <w:sz w:val="30"/>
                 <w:szCs w:val="30"/>
               </w:rPr>
             </w:r>
@@ -808,27 +826,14 @@
     </w:tbl>
     <w:p>
       <w:pPr>
-        <w:tabs>
-          <w:tab w:val="left" w:pos="6870"/>
-        </w:tabs>
-        <w:rPr>
-          <w:rFonts w:ascii="黑体" w:eastAsia="黑体"/>
-          <w:sz w:val="21"/>
-          <w:szCs w:val="21"/>
-        </w:rPr>
-      </w:pPr>
-    </w:p>
-    <w:p>
-      <w:pPr>
-        <w:tabs>
-          <w:tab w:val="left" w:pos="6870"/>
-        </w:tabs>
-        <w:rPr>
-          <w:rFonts w:ascii="黑体" w:eastAsia="黑体"/>
-          <w:sz w:val="21"/>
-          <w:szCs w:val="21"/>
-        </w:rPr>
-      </w:pPr>
+        <w:pageBreakBefore/>
+        <w:spacing w:after="0" w:before="0" w:line="20" w:lineRule="exact"/>
+      </w:pPr>
+      <w:r>
+        <w:rPr>
+          <w:sz w:val="2"/>
+        </w:rPr>
+      </w:r>
     </w:p>
     <w:tbl>
       <w:tblPr>
@@ -2146,154 +2151,193 @@
     </w:tbl>
     <w:p>
       <w:pPr>
-        <w:keepNext/>
+        <w:pStyle w:val="ReportTitle"/>
         <w:pageBreakBefore/>
-        <w:spacing w:line="300" w:lineRule="auto" w:after="160"/>
-      </w:pPr>
-      <w:r>
-        <w:rPr>
-          <w:rFonts w:ascii="宋体" w:hAnsi="宋体" w:eastAsia="宋体"/>
+      </w:pPr>
+      <w:r>
+        <w:rPr>
+          <w:rFonts w:ascii="Times New Roman" w:hAnsi="Times New Roman" w:eastAsia="宋体"/>
+          <w:b/>
+          <w:color w:val="000000"/>
+          <w:sz w:val="32"/>
+        </w:rPr>
+        <w:t>基于同态加密的隐私保护投票系统</w:t>
+      </w:r>
+    </w:p>
+    <w:p>
+      <w:pPr>
+        <w:pStyle w:val="ReportH2"/>
+        <w:spacing w:after="120"/>
+      </w:pPr>
+      <w:r>
+        <w:rPr>
+          <w:rFonts w:ascii="Times New Roman" w:hAnsi="Times New Roman" w:eastAsia="宋体"/>
+          <w:b/>
+          <w:color w:val="000000"/>
+          <w:sz w:val="24"/>
+        </w:rPr>
+        <w:t>成员A分工报告  选票编码与Paillier加密模块</w:t>
+      </w:r>
+    </w:p>
+    <w:p>
+      <w:pPr>
+        <w:pStyle w:val="ReportH1"/>
+      </w:pPr>
+      <w:r>
+        <w:rPr>
+          <w:rFonts w:ascii="Times New Roman" w:hAnsi="Times New Roman" w:eastAsia="宋体"/>
           <w:b/>
           <w:color w:val="000000"/>
           <w:sz w:val="28"/>
         </w:rPr>
-        <w:t>基于同态加密的隐私保护投票系统</w:t>
-      </w:r>
-    </w:p>
-    <w:p>
-      <w:pPr>
-        <w:spacing w:line="300" w:lineRule="auto" w:after="160"/>
-      </w:pPr>
-      <w:r>
-        <w:rPr>
-          <w:rFonts w:ascii="宋体" w:hAnsi="宋体" w:eastAsia="宋体"/>
+        <w:t>一、课题内容和要求</w:t>
+      </w:r>
+    </w:p>
+    <w:p>
+      <w:pPr>
+        <w:pStyle w:val="ReportH2"/>
+      </w:pPr>
+      <w:r>
+        <w:rPr>
+          <w:rFonts w:ascii="Times New Roman" w:hAnsi="Times New Roman" w:eastAsia="宋体"/>
           <w:b/>
           <w:color w:val="000000"/>
           <w:sz w:val="24"/>
         </w:rPr>
-        <w:t>成员A分工报告  选票编码与Paillier加密模块</w:t>
-      </w:r>
-    </w:p>
-    <w:p>
-      <w:pPr>
-        <w:keepNext/>
-        <w:pageBreakBefore w:val="0"/>
-        <w:spacing w:line="300" w:lineRule="auto" w:after="160"/>
-      </w:pPr>
-      <w:r>
-        <w:rPr>
-          <w:rFonts w:ascii="宋体" w:hAnsi="宋体" w:eastAsia="宋体"/>
+        <w:t>1.1 课题内容</w:t>
+      </w:r>
+    </w:p>
+    <w:p>
+      <w:pPr>
+        <w:pStyle w:val="ReportBody"/>
+      </w:pPr>
+      <w:r>
+        <w:rPr>
+          <w:rFonts w:ascii="Times New Roman" w:hAnsi="Times New Roman" w:eastAsia="宋体"/>
+          <w:b w:val="0"/>
+          <w:color w:val="000000"/>
+          <w:sz w:val="24"/>
+        </w:rPr>
+        <w:t>系统使用Paillier加法同态加密实现本地可视化投票。投票端生成加密选票，计票端只访问公开数据并汇总密文，独立解密进程在投票关闭后返回各选项总票数。额外实现投票关闭与Ed25519签名清单审计，检测已接收选票的删除和修改。</w:t>
+      </w:r>
+    </w:p>
+    <w:p>
+      <w:pPr>
+        <w:pStyle w:val="ReportBody"/>
+      </w:pPr>
+      <w:r>
+        <w:rPr>
+          <w:rFonts w:ascii="Times New Roman" w:hAnsi="Times New Roman" w:eastAsia="宋体"/>
+          <w:b w:val="0"/>
+          <w:color w:val="000000"/>
+          <w:sz w:val="24"/>
+        </w:rPr>
+        <w:t>把用户的单选意图转换为固定维度的加密向量，生成并保护密钥，使计票端不接触明文选择。重点解决随机化加密、动态选项、序列化和错误输入问题。</w:t>
+      </w:r>
+    </w:p>
+    <w:p>
+      <w:pPr>
+        <w:pStyle w:val="ReportH2"/>
+      </w:pPr>
+      <w:r>
+        <w:rPr>
+          <w:rFonts w:ascii="Times New Roman" w:hAnsi="Times New Roman" w:eastAsia="宋体"/>
+          <w:b/>
+          <w:color w:val="000000"/>
+          <w:sz w:val="24"/>
+        </w:rPr>
+        <w:t>1.2 课题要求与本分工责任</w:t>
+      </w:r>
+    </w:p>
+    <w:p>
+      <w:pPr>
+        <w:pStyle w:val="ReportBody"/>
+      </w:pPr>
+      <w:r>
+        <w:rPr>
+          <w:rFonts w:ascii="Times New Roman" w:hAnsi="Times New Roman" w:eastAsia="宋体"/>
+          <w:b w:val="0"/>
+          <w:color w:val="000000"/>
+          <w:sz w:val="24"/>
+        </w:rPr>
+        <w:t>输入为本轮配置、投票者ID和一个选项索引。输出只包含轮次、ID、票型、时间戳、随机标识及密文向量。选项索引必须是整数且在范围内，ID必须位于授权名单。支持2至8个选项，现场变化通过新建投票轮次处理。</w:t>
+      </w:r>
+    </w:p>
+    <w:p>
+      <w:pPr>
+        <w:pStyle w:val="ReportBody"/>
+      </w:pPr>
+      <w:r>
+        <w:rPr>
+          <w:rFonts w:ascii="Times New Roman" w:hAnsi="Times New Roman" w:eastAsia="宋体"/>
+          <w:b w:val="0"/>
+          <w:color w:val="000000"/>
+          <w:sz w:val="24"/>
+        </w:rPr>
+        <w:t>本报告对应的代码范围：crypto_service.py；experiments.py中的同态、随机化、口令和编码实验。</w:t>
+      </w:r>
+    </w:p>
+    <w:p>
+      <w:pPr>
+        <w:pStyle w:val="ReportH1"/>
+      </w:pPr>
+      <w:r>
+        <w:rPr>
+          <w:rFonts w:ascii="Times New Roman" w:hAnsi="Times New Roman" w:eastAsia="宋体"/>
           <w:b/>
           <w:color w:val="000000"/>
           <w:sz w:val="28"/>
         </w:rPr>
-        <w:t>一 课题内容和要求</w:t>
-      </w:r>
-    </w:p>
-    <w:p>
-      <w:pPr>
+        <w:t>二、需求分析和总体设计</w:t>
+      </w:r>
+    </w:p>
+    <w:p>
+      <w:pPr>
+        <w:pStyle w:val="ReportH2"/>
+      </w:pPr>
+      <w:r>
+        <w:t>2.1 本课题的主要功能</w:t>
+      </w:r>
+    </w:p>
+    <w:p>
+      <w:pPr>
+        <w:pStyle w:val="ReportBody"/>
+      </w:pPr>
+      <w:r>
+        <w:t>本模块接收本轮配置、名单ID和一个选项索引，输出固定维度的随机密文向量。创建流程生成2048位Paillier密钥，登记流程生成Ed25519签名密钥，口令保护的保管库保存私钥材料。选择为单选，选项数量可以变化，选票中不保存明文索引。</w:t>
+      </w:r>
+    </w:p>
+    <w:p>
+      <w:pPr>
+        <w:pStyle w:val="ReportH2"/>
+      </w:pPr>
+      <w:r>
+        <w:t>2.2 本课题的设计过程</w:t>
+      </w:r>
+    </w:p>
+    <w:p>
+      <w:pPr>
+        <w:pStyle w:val="ReportBody"/>
+      </w:pPr>
+      <w:r>
+        <w:t>先用独热向量约束客户端表达方式，再逐分量调用raw_encrypt；把公开随机标识nonce与加密内部随机数r区分，避免公开r。选项维度来自配置，不把三选项写死。密钥保管采用scrypt与AES-GCM，错误口令通过认证标签校验失败返回。</w:t>
+      </w:r>
+    </w:p>
+    <w:p>
+      <w:pPr>
+        <w:pStyle w:val="ReportH2"/>
+      </w:pPr>
+      <w:r>
+        <w:t>2.3 模块接口与分工</w:t>
+      </w:r>
+    </w:p>
+    <w:p>
+      <w:pPr>
+        <w:pStyle w:val="ReportCaption"/>
         <w:keepNext/>
-        <w:spacing w:line="300" w:lineRule="auto" w:after="100"/>
-      </w:pPr>
-      <w:r>
-        <w:rPr>
-          <w:rFonts w:ascii="宋体" w:hAnsi="宋体" w:eastAsia="宋体"/>
-          <w:b/>
-          <w:color w:val="000000"/>
-          <w:sz w:val="24"/>
-        </w:rPr>
-        <w:t>1.1 课题内容</w:t>
-      </w:r>
-    </w:p>
-    <w:p>
-      <w:pPr>
-        <w:spacing w:line="300" w:lineRule="auto" w:after="100"/>
-        <w:ind w:firstLine="480"/>
-      </w:pPr>
-      <w:r>
-        <w:rPr>
-          <w:rFonts w:ascii="宋体" w:hAnsi="宋体" w:eastAsia="宋体"/>
-          <w:b w:val="0"/>
-          <w:color w:val="000000"/>
-          <w:sz w:val="24"/>
-        </w:rPr>
-        <w:t>系统使用Paillier加法同态加密实现本地可视化投票。投票端生成加密选票，计票端只访问公开数据并汇总密文，独立解密进程在投票关闭后返回各选项总票数。额外实现投票关闭与Ed25519签名清单审计，检测已接收选票的删除和修改。</w:t>
-      </w:r>
-    </w:p>
-    <w:p>
-      <w:pPr>
-        <w:spacing w:line="300" w:lineRule="auto" w:after="100"/>
-        <w:ind w:firstLine="480"/>
-      </w:pPr>
-      <w:r>
-        <w:rPr>
-          <w:rFonts w:ascii="宋体" w:hAnsi="宋体" w:eastAsia="宋体"/>
-          <w:b w:val="0"/>
-          <w:color w:val="000000"/>
-          <w:sz w:val="24"/>
-        </w:rPr>
-        <w:t>把用户的单选意图转换为固定维度的加密向量，生成并保护密钥，使计票端不接触明文选择。重点解决随机化加密、动态选项、序列化和错误输入问题。</w:t>
-      </w:r>
-    </w:p>
-    <w:p>
-      <w:pPr>
-        <w:keepNext/>
-        <w:spacing w:line="300" w:lineRule="auto" w:after="100"/>
-      </w:pPr>
-      <w:r>
-        <w:rPr>
-          <w:rFonts w:ascii="宋体" w:hAnsi="宋体" w:eastAsia="宋体"/>
-          <w:b/>
-          <w:color w:val="000000"/>
-          <w:sz w:val="24"/>
-        </w:rPr>
-        <w:t>1.2 课题要求与本分工责任</w:t>
-      </w:r>
-    </w:p>
-    <w:p>
-      <w:pPr>
-        <w:spacing w:line="300" w:lineRule="auto" w:after="100"/>
-        <w:ind w:firstLine="480"/>
-      </w:pPr>
-      <w:r>
-        <w:rPr>
-          <w:rFonts w:ascii="宋体" w:hAnsi="宋体" w:eastAsia="宋体"/>
-          <w:b w:val="0"/>
-          <w:color w:val="000000"/>
-          <w:sz w:val="24"/>
-        </w:rPr>
-        <w:t>输入为本轮配置、投票者ID和一个选项索引。输出只包含轮次、ID、票型、时间戳、随机标识及密文向量。选项索引必须是整数且在范围内，ID必须位于授权名单。支持2至8个选项，现场变化通过新建投票轮次处理。</w:t>
-      </w:r>
-    </w:p>
-    <w:p>
-      <w:pPr>
-        <w:spacing w:line="300" w:lineRule="auto" w:after="100"/>
-        <w:ind w:firstLine="480"/>
-      </w:pPr>
-      <w:r>
-        <w:rPr>
-          <w:rFonts w:ascii="宋体" w:hAnsi="宋体" w:eastAsia="宋体"/>
-          <w:b w:val="0"/>
-          <w:color w:val="000000"/>
-          <w:sz w:val="24"/>
-        </w:rPr>
-        <w:t>本报告对应的代码范围：crypto_service.py；experiments.py中的同态、随机化、口令和编码实验。</w:t>
-      </w:r>
-    </w:p>
-    <w:p>
-      <w:pPr>
-        <w:keepNext/>
-        <w:pageBreakBefore w:val="0"/>
-        <w:spacing w:line="300" w:lineRule="auto" w:after="160"/>
-      </w:pPr>
-      <w:r>
-        <w:rPr>
-          <w:rFonts w:ascii="宋体" w:hAnsi="宋体" w:eastAsia="宋体"/>
-          <w:b/>
-          <w:color w:val="000000"/>
-          <w:sz w:val="28"/>
-        </w:rPr>
-        <w:t>二 需求分析和总体设计</w:t>
+      </w:pPr>
+      <w:r>
+        <w:t>表1 小组模块划分</w:t>
       </w:r>
     </w:p>
     <w:tbl>
@@ -2311,12 +2355,17 @@
       <w:tr>
         <w:trPr>
           <w:tblHeader/>
+          <w:tblHeader/>
         </w:trPr>
         <w:tc>
           <w:tcPr>
             <w:tcW w:type="dxa" w:w="794"/>
             <w:vAlign w:val="center"/>
             <w:tcBorders>
+              <w:top w:val="single" w:sz="4" w:color="D9D9D9"/>
+              <w:left w:val="single" w:sz="4" w:color="D9D9D9"/>
+              <w:bottom w:val="single" w:sz="4" w:color="D9D9D9"/>
+              <w:right w:val="single" w:sz="4" w:color="D9D9D9"/>
               <w:top w:val="single" w:sz="4" w:color="D9D9D9"/>
               <w:left w:val="single" w:sz="4" w:color="D9D9D9"/>
               <w:bottom w:val="single" w:sz="4" w:color="D9D9D9"/>
@@ -2332,11 +2381,12 @@
           </w:tcPr>
           <w:p>
             <w:pPr>
-              <w:spacing w:after="40" w:line="264" w:lineRule="auto"/>
-            </w:pPr>
-            <w:r>
-              <w:rPr>
-                <w:rFonts w:ascii="宋体" w:hAnsi="宋体" w:eastAsia="宋体"/>
+              <w:keepNext/>
+              <w:spacing w:after="40" w:line="288" w:lineRule="auto" w:before="40"/>
+            </w:pPr>
+            <w:r>
+              <w:rPr>
+                <w:rFonts w:ascii="Times New Roman" w:hAnsi="Times New Roman" w:eastAsia="宋体"/>
                 <w:b/>
                 <w:color w:val="000000"/>
                 <w:sz w:val="21"/>
@@ -2350,6 +2400,10 @@
             <w:tcW w:type="dxa" w:w="2665"/>
             <w:vAlign w:val="center"/>
             <w:tcBorders>
+              <w:top w:val="single" w:sz="4" w:color="D9D9D9"/>
+              <w:left w:val="single" w:sz="4" w:color="D9D9D9"/>
+              <w:bottom w:val="single" w:sz="4" w:color="D9D9D9"/>
+              <w:right w:val="single" w:sz="4" w:color="D9D9D9"/>
               <w:top w:val="single" w:sz="4" w:color="D9D9D9"/>
               <w:left w:val="single" w:sz="4" w:color="D9D9D9"/>
               <w:bottom w:val="single" w:sz="4" w:color="D9D9D9"/>
@@ -2365,11 +2419,12 @@
           </w:tcPr>
           <w:p>
             <w:pPr>
-              <w:spacing w:after="40" w:line="264" w:lineRule="auto"/>
-            </w:pPr>
-            <w:r>
-              <w:rPr>
-                <w:rFonts w:ascii="宋体" w:hAnsi="宋体" w:eastAsia="宋体"/>
+              <w:keepNext/>
+              <w:spacing w:after="40" w:line="288" w:lineRule="auto" w:before="40"/>
+            </w:pPr>
+            <w:r>
+              <w:rPr>
+                <w:rFonts w:ascii="Times New Roman" w:hAnsi="Times New Roman" w:eastAsia="宋体"/>
                 <w:b/>
                 <w:color w:val="000000"/>
                 <w:sz w:val="21"/>
@@ -2383,6 +2438,10 @@
             <w:tcW w:type="dxa" w:w="5726"/>
             <w:vAlign w:val="center"/>
             <w:tcBorders>
+              <w:top w:val="single" w:sz="4" w:color="D9D9D9"/>
+              <w:left w:val="single" w:sz="4" w:color="D9D9D9"/>
+              <w:bottom w:val="single" w:sz="4" w:color="D9D9D9"/>
+              <w:right w:val="single" w:sz="4" w:color="D9D9D9"/>
               <w:top w:val="single" w:sz="4" w:color="D9D9D9"/>
               <w:left w:val="single" w:sz="4" w:color="D9D9D9"/>
               <w:bottom w:val="single" w:sz="4" w:color="D9D9D9"/>
@@ -2398,11 +2457,12 @@
           </w:tcPr>
           <w:p>
             <w:pPr>
-              <w:spacing w:after="40" w:line="264" w:lineRule="auto"/>
-            </w:pPr>
-            <w:r>
-              <w:rPr>
-                <w:rFonts w:ascii="宋体" w:hAnsi="宋体" w:eastAsia="宋体"/>
+              <w:keepNext/>
+              <w:spacing w:after="40" w:line="288" w:lineRule="auto" w:before="40"/>
+            </w:pPr>
+            <w:r>
+              <w:rPr>
+                <w:rFonts w:ascii="Times New Roman" w:hAnsi="Times New Roman" w:eastAsia="宋体"/>
                 <w:b/>
                 <w:color w:val="000000"/>
                 <w:sz w:val="21"/>
@@ -2413,11 +2473,16 @@
         </w:tc>
       </w:tr>
       <w:tr>
+        <w:trPr/>
         <w:tc>
           <w:tcPr>
             <w:tcW w:type="dxa" w:w="794"/>
             <w:vAlign w:val="center"/>
             <w:tcBorders>
+              <w:top w:val="single" w:sz="4" w:color="D9D9D9"/>
+              <w:left w:val="single" w:sz="4" w:color="D9D9D9"/>
+              <w:bottom w:val="single" w:sz="4" w:color="D9D9D9"/>
+              <w:right w:val="single" w:sz="4" w:color="D9D9D9"/>
               <w:top w:val="single" w:sz="4" w:color="D9D9D9"/>
               <w:left w:val="single" w:sz="4" w:color="D9D9D9"/>
               <w:bottom w:val="single" w:sz="4" w:color="D9D9D9"/>
@@ -2432,11 +2497,12 @@
           </w:tcPr>
           <w:p>
             <w:pPr>
-              <w:spacing w:after="40" w:line="264" w:lineRule="auto"/>
-            </w:pPr>
-            <w:r>
-              <w:rPr>
-                <w:rFonts w:ascii="宋体" w:hAnsi="宋体" w:eastAsia="宋体"/>
+              <w:keepNext/>
+              <w:spacing w:after="40" w:line="288" w:lineRule="auto" w:before="40"/>
+            </w:pPr>
+            <w:r>
+              <w:rPr>
+                <w:rFonts w:ascii="Times New Roman" w:hAnsi="Times New Roman" w:eastAsia="宋体"/>
                 <w:b w:val="0"/>
                 <w:color w:val="000000"/>
                 <w:sz w:val="21"/>
@@ -2450,6 +2516,10 @@
             <w:tcW w:type="dxa" w:w="2665"/>
             <w:vAlign w:val="center"/>
             <w:tcBorders>
+              <w:top w:val="single" w:sz="4" w:color="D9D9D9"/>
+              <w:left w:val="single" w:sz="4" w:color="D9D9D9"/>
+              <w:bottom w:val="single" w:sz="4" w:color="D9D9D9"/>
+              <w:right w:val="single" w:sz="4" w:color="D9D9D9"/>
               <w:top w:val="single" w:sz="4" w:color="D9D9D9"/>
               <w:left w:val="single" w:sz="4" w:color="D9D9D9"/>
               <w:bottom w:val="single" w:sz="4" w:color="D9D9D9"/>
@@ -2464,11 +2534,12 @@
           </w:tcPr>
           <w:p>
             <w:pPr>
-              <w:spacing w:after="40" w:line="264" w:lineRule="auto"/>
-            </w:pPr>
-            <w:r>
-              <w:rPr>
-                <w:rFonts w:ascii="宋体" w:hAnsi="宋体" w:eastAsia="宋体"/>
+              <w:keepNext/>
+              <w:spacing w:after="40" w:line="288" w:lineRule="auto" w:before="40"/>
+            </w:pPr>
+            <w:r>
+              <w:rPr>
+                <w:rFonts w:ascii="Times New Roman" w:hAnsi="Times New Roman" w:eastAsia="宋体"/>
                 <w:b w:val="0"/>
                 <w:color w:val="000000"/>
                 <w:sz w:val="21"/>
@@ -2482,6 +2553,10 @@
             <w:tcW w:type="dxa" w:w="5726"/>
             <w:vAlign w:val="center"/>
             <w:tcBorders>
+              <w:top w:val="single" w:sz="4" w:color="D9D9D9"/>
+              <w:left w:val="single" w:sz="4" w:color="D9D9D9"/>
+              <w:bottom w:val="single" w:sz="4" w:color="D9D9D9"/>
+              <w:right w:val="single" w:sz="4" w:color="D9D9D9"/>
               <w:top w:val="single" w:sz="4" w:color="D9D9D9"/>
               <w:left w:val="single" w:sz="4" w:color="D9D9D9"/>
               <w:bottom w:val="single" w:sz="4" w:color="D9D9D9"/>
@@ -2496,11 +2571,12 @@
           </w:tcPr>
           <w:p>
             <w:pPr>
-              <w:spacing w:after="40" w:line="264" w:lineRule="auto"/>
-            </w:pPr>
-            <w:r>
-              <w:rPr>
-                <w:rFonts w:ascii="宋体" w:hAnsi="宋体" w:eastAsia="宋体"/>
+              <w:keepNext/>
+              <w:spacing w:after="40" w:line="288" w:lineRule="auto" w:before="40"/>
+            </w:pPr>
+            <w:r>
+              <w:rPr>
+                <w:rFonts w:ascii="Times New Roman" w:hAnsi="Times New Roman" w:eastAsia="宋体"/>
                 <w:b w:val="0"/>
                 <w:color w:val="000000"/>
                 <w:sz w:val="21"/>
@@ -2511,11 +2587,16 @@
         </w:tc>
       </w:tr>
       <w:tr>
+        <w:trPr/>
         <w:tc>
           <w:tcPr>
             <w:tcW w:type="dxa" w:w="794"/>
             <w:vAlign w:val="center"/>
             <w:tcBorders>
+              <w:top w:val="single" w:sz="4" w:color="D9D9D9"/>
+              <w:left w:val="single" w:sz="4" w:color="D9D9D9"/>
+              <w:bottom w:val="single" w:sz="4" w:color="D9D9D9"/>
+              <w:right w:val="single" w:sz="4" w:color="D9D9D9"/>
               <w:top w:val="single" w:sz="4" w:color="D9D9D9"/>
               <w:left w:val="single" w:sz="4" w:color="D9D9D9"/>
               <w:bottom w:val="single" w:sz="4" w:color="D9D9D9"/>
@@ -2530,11 +2611,12 @@
           </w:tcPr>
           <w:p>
             <w:pPr>
-              <w:spacing w:after="40" w:line="264" w:lineRule="auto"/>
-            </w:pPr>
-            <w:r>
-              <w:rPr>
-                <w:rFonts w:ascii="宋体" w:hAnsi="宋体" w:eastAsia="宋体"/>
+              <w:keepNext/>
+              <w:spacing w:after="40" w:line="288" w:lineRule="auto" w:before="40"/>
+            </w:pPr>
+            <w:r>
+              <w:rPr>
+                <w:rFonts w:ascii="Times New Roman" w:hAnsi="Times New Roman" w:eastAsia="宋体"/>
                 <w:b w:val="0"/>
                 <w:color w:val="000000"/>
                 <w:sz w:val="21"/>
@@ -2548,6 +2630,10 @@
             <w:tcW w:type="dxa" w:w="2665"/>
             <w:vAlign w:val="center"/>
             <w:tcBorders>
+              <w:top w:val="single" w:sz="4" w:color="D9D9D9"/>
+              <w:left w:val="single" w:sz="4" w:color="D9D9D9"/>
+              <w:bottom w:val="single" w:sz="4" w:color="D9D9D9"/>
+              <w:right w:val="single" w:sz="4" w:color="D9D9D9"/>
               <w:top w:val="single" w:sz="4" w:color="D9D9D9"/>
               <w:left w:val="single" w:sz="4" w:color="D9D9D9"/>
               <w:bottom w:val="single" w:sz="4" w:color="D9D9D9"/>
@@ -2562,11 +2648,12 @@
           </w:tcPr>
           <w:p>
             <w:pPr>
-              <w:spacing w:after="40" w:line="264" w:lineRule="auto"/>
-            </w:pPr>
-            <w:r>
-              <w:rPr>
-                <w:rFonts w:ascii="宋体" w:hAnsi="宋体" w:eastAsia="宋体"/>
+              <w:keepNext/>
+              <w:spacing w:after="40" w:line="288" w:lineRule="auto" w:before="40"/>
+            </w:pPr>
+            <w:r>
+              <w:rPr>
+                <w:rFonts w:ascii="Times New Roman" w:hAnsi="Times New Roman" w:eastAsia="宋体"/>
                 <w:b w:val="0"/>
                 <w:color w:val="000000"/>
                 <w:sz w:val="21"/>
@@ -2580,6 +2667,10 @@
             <w:tcW w:type="dxa" w:w="5726"/>
             <w:vAlign w:val="center"/>
             <w:tcBorders>
+              <w:top w:val="single" w:sz="4" w:color="D9D9D9"/>
+              <w:left w:val="single" w:sz="4" w:color="D9D9D9"/>
+              <w:bottom w:val="single" w:sz="4" w:color="D9D9D9"/>
+              <w:right w:val="single" w:sz="4" w:color="D9D9D9"/>
               <w:top w:val="single" w:sz="4" w:color="D9D9D9"/>
               <w:left w:val="single" w:sz="4" w:color="D9D9D9"/>
               <w:bottom w:val="single" w:sz="4" w:color="D9D9D9"/>
@@ -2594,11 +2685,12 @@
           </w:tcPr>
           <w:p>
             <w:pPr>
-              <w:spacing w:after="40" w:line="264" w:lineRule="auto"/>
-            </w:pPr>
-            <w:r>
-              <w:rPr>
-                <w:rFonts w:ascii="宋体" w:hAnsi="宋体" w:eastAsia="宋体"/>
+              <w:keepNext/>
+              <w:spacing w:after="40" w:line="288" w:lineRule="auto" w:before="40"/>
+            </w:pPr>
+            <w:r>
+              <w:rPr>
+                <w:rFonts w:ascii="Times New Roman" w:hAnsi="Times New Roman" w:eastAsia="宋体"/>
                 <w:b w:val="0"/>
                 <w:color w:val="000000"/>
                 <w:sz w:val="21"/>
@@ -2609,11 +2701,16 @@
         </w:tc>
       </w:tr>
       <w:tr>
+        <w:trPr/>
         <w:tc>
           <w:tcPr>
             <w:tcW w:type="dxa" w:w="794"/>
             <w:vAlign w:val="center"/>
             <w:tcBorders>
+              <w:top w:val="single" w:sz="4" w:color="D9D9D9"/>
+              <w:left w:val="single" w:sz="4" w:color="D9D9D9"/>
+              <w:bottom w:val="single" w:sz="4" w:color="D9D9D9"/>
+              <w:right w:val="single" w:sz="4" w:color="D9D9D9"/>
               <w:top w:val="single" w:sz="4" w:color="D9D9D9"/>
               <w:left w:val="single" w:sz="4" w:color="D9D9D9"/>
               <w:bottom w:val="single" w:sz="4" w:color="D9D9D9"/>
@@ -2628,11 +2725,12 @@
           </w:tcPr>
           <w:p>
             <w:pPr>
-              <w:spacing w:after="40" w:line="264" w:lineRule="auto"/>
-            </w:pPr>
-            <w:r>
-              <w:rPr>
-                <w:rFonts w:ascii="宋体" w:hAnsi="宋体" w:eastAsia="宋体"/>
+              <w:keepNext w:val="0"/>
+              <w:spacing w:after="40" w:line="288" w:lineRule="auto" w:before="40"/>
+            </w:pPr>
+            <w:r>
+              <w:rPr>
+                <w:rFonts w:ascii="Times New Roman" w:hAnsi="Times New Roman" w:eastAsia="宋体"/>
                 <w:b w:val="0"/>
                 <w:color w:val="000000"/>
                 <w:sz w:val="21"/>
@@ -2646,6 +2744,10 @@
             <w:tcW w:type="dxa" w:w="2665"/>
             <w:vAlign w:val="center"/>
             <w:tcBorders>
+              <w:top w:val="single" w:sz="4" w:color="D9D9D9"/>
+              <w:left w:val="single" w:sz="4" w:color="D9D9D9"/>
+              <w:bottom w:val="single" w:sz="4" w:color="D9D9D9"/>
+              <w:right w:val="single" w:sz="4" w:color="D9D9D9"/>
               <w:top w:val="single" w:sz="4" w:color="D9D9D9"/>
               <w:left w:val="single" w:sz="4" w:color="D9D9D9"/>
               <w:bottom w:val="single" w:sz="4" w:color="D9D9D9"/>
@@ -2660,11 +2762,12 @@
           </w:tcPr>
           <w:p>
             <w:pPr>
-              <w:spacing w:after="40" w:line="264" w:lineRule="auto"/>
-            </w:pPr>
-            <w:r>
-              <w:rPr>
-                <w:rFonts w:ascii="宋体" w:hAnsi="宋体" w:eastAsia="宋体"/>
+              <w:keepNext w:val="0"/>
+              <w:spacing w:after="40" w:line="288" w:lineRule="auto" w:before="40"/>
+            </w:pPr>
+            <w:r>
+              <w:rPr>
+                <w:rFonts w:ascii="Times New Roman" w:hAnsi="Times New Roman" w:eastAsia="宋体"/>
                 <w:b w:val="0"/>
                 <w:color w:val="000000"/>
                 <w:sz w:val="21"/>
@@ -2678,6 +2781,10 @@
             <w:tcW w:type="dxa" w:w="5726"/>
             <w:vAlign w:val="center"/>
             <w:tcBorders>
+              <w:top w:val="single" w:sz="4" w:color="D9D9D9"/>
+              <w:left w:val="single" w:sz="4" w:color="D9D9D9"/>
+              <w:bottom w:val="single" w:sz="4" w:color="D9D9D9"/>
+              <w:right w:val="single" w:sz="4" w:color="D9D9D9"/>
               <w:top w:val="single" w:sz="4" w:color="D9D9D9"/>
               <w:left w:val="single" w:sz="4" w:color="D9D9D9"/>
               <w:bottom w:val="single" w:sz="4" w:color="D9D9D9"/>
@@ -2692,11 +2799,12 @@
           </w:tcPr>
           <w:p>
             <w:pPr>
-              <w:spacing w:after="40" w:line="264" w:lineRule="auto"/>
-            </w:pPr>
-            <w:r>
-              <w:rPr>
-                <w:rFonts w:ascii="宋体" w:hAnsi="宋体" w:eastAsia="宋体"/>
+              <w:keepNext w:val="0"/>
+              <w:spacing w:after="40" w:line="288" w:lineRule="auto" w:before="40"/>
+            </w:pPr>
+            <w:r>
+              <w:rPr>
+                <w:rFonts w:ascii="Times New Roman" w:hAnsi="Times New Roman" w:eastAsia="宋体"/>
                 <w:b w:val="0"/>
                 <w:color w:val="000000"/>
                 <w:sz w:val="21"/>
@@ -2709,43 +2817,33 @@
     </w:tbl>
     <w:p>
       <w:pPr>
-        <w:spacing w:line="300" w:lineRule="auto" w:after="100"/>
-        <w:ind w:firstLine="480"/>
-      </w:pPr>
-      <w:r>
-        <w:rPr>
-          <w:rFonts w:ascii="宋体" w:hAnsi="宋体" w:eastAsia="宋体"/>
-          <w:b w:val="0"/>
-          <w:color w:val="000000"/>
-          <w:sz w:val="22"/>
-        </w:rPr>
-        <w:t>共同接口以JSON公开配置、加密选票和签名清单为中心。A不在选票文件保存明文选择；B不在计票目录放置私钥；C在每次关键操作前检查签名和状态。报告按责任模块划分，实际学生完成情况需在复现和现场修改后由本人确认。</w:t>
-      </w:r>
-    </w:p>
-    <w:p>
-      <w:pPr>
-        <w:keepNext/>
-        <w:pageBreakBefore/>
-        <w:spacing w:line="300" w:lineRule="auto" w:after="160"/>
-      </w:pPr>
-      <w:r>
-        <w:rPr>
-          <w:rFonts w:ascii="宋体" w:hAnsi="宋体" w:eastAsia="宋体"/>
+        <w:pStyle w:val="ReportBody"/>
+      </w:pPr>
+      <w:r>
+        <w:t>公开选票由A交给C登记，C把签名清单与密文交给B汇总，B向保管端提交完整汇总请求。各角色报告分别讨论编码与密钥、汇总与解密、界面与审计；实际姓名、学号和完成记录由成员核对填写。</w:t>
+      </w:r>
+    </w:p>
+    <w:p>
+      <w:pPr>
+        <w:pStyle w:val="ReportH1"/>
+      </w:pPr>
+      <w:r>
+        <w:rPr>
+          <w:rFonts w:ascii="Times New Roman" w:hAnsi="Times New Roman" w:eastAsia="宋体"/>
           <w:b/>
           <w:color w:val="000000"/>
           <w:sz w:val="28"/>
         </w:rPr>
-        <w:t>三 相关功能模块详细设计</w:t>
-      </w:r>
-    </w:p>
-    <w:p>
-      <w:pPr>
-        <w:keepNext/>
-        <w:spacing w:line="300" w:lineRule="auto" w:after="100"/>
-      </w:pPr>
-      <w:r>
-        <w:rPr>
-          <w:rFonts w:ascii="宋体" w:hAnsi="宋体" w:eastAsia="宋体"/>
+        <w:t>三、相关功能模块详细设计</w:t>
+      </w:r>
+    </w:p>
+    <w:p>
+      <w:pPr>
+        <w:pStyle w:val="ReportH2"/>
+      </w:pPr>
+      <w:r>
+        <w:rPr>
+          <w:rFonts w:ascii="Times New Roman" w:hAnsi="Times New Roman" w:eastAsia="宋体"/>
           <w:b/>
           <w:color w:val="000000"/>
           <w:sz w:val="24"/>
@@ -2755,155 +2853,224 @@
     </w:p>
     <w:p>
       <w:pPr>
-        <w:spacing w:line="300" w:lineRule="auto" w:after="100"/>
-        <w:ind w:firstLine="480"/>
-      </w:pPr>
-      <w:r>
-        <w:rPr>
-          <w:rFonts w:ascii="宋体" w:hAnsi="宋体" w:eastAsia="宋体"/>
+        <w:pStyle w:val="ReportBody"/>
+      </w:pPr>
+      <w:r>
+        <w:t>密钥生成取不同大素数p、q，令n=pq、g=n+1；私钥可用λ=lcm(p−1,q−1)与μ表示，其中μ是L(</w:t>
+      </w:r>
+      <w:r>
+        <w:t>g</w:t>
+      </w:r>
+      <w:r>
+        <w:rPr>
+          <w:vertAlign w:val="superscript"/>
+        </w:rPr>
+        <w:t>λ</w:t>
+      </w:r>
+      <w:r>
+        <w:t xml:space="preserve"> mod n²)的模n逆元，L(u)=(u−1)/n。加密为c=</w:t>
+      </w:r>
+      <w:r>
+        <w:t>g</w:t>
+      </w:r>
+      <w:r>
+        <w:rPr>
+          <w:vertAlign w:val="superscript"/>
+        </w:rPr>
+        <w:t>m</w:t>
+      </w:r>
+      <w:r>
+        <w:t xml:space="preserve"> </w:t>
+      </w:r>
+      <w:r>
+        <w:t>r</w:t>
+      </w:r>
+      <w:r>
+        <w:rPr>
+          <w:vertAlign w:val="superscript"/>
+        </w:rPr>
+        <w:t>n</w:t>
+      </w:r>
+      <w:r>
+        <w:t xml:space="preserve"> mod n²，r与n互素；解密为m=L(</w:t>
+      </w:r>
+      <w:r>
+        <w:t>c</w:t>
+      </w:r>
+      <w:r>
+        <w:rPr>
+          <w:vertAlign w:val="superscript"/>
+        </w:rPr>
+        <w:t>λ</w:t>
+      </w:r>
+      <w:r>
+        <w:t xml:space="preserve"> mod n²)μ mod n。phe实现以p、q和CRT加速，教学公式不等同于源码逐行实现。</w:t>
+      </w:r>
+    </w:p>
+    <w:p>
+      <w:pPr>
+        <w:pStyle w:val="ReportBody"/>
+      </w:pPr>
+      <w:r>
+        <w:t>同态关系为E(a;r₁)·E(b;r₂) mod n² = E((a+b) mod n;r₁r₂ mod n)。逐列相乘可累计各选项的0或1，最后只解密各列总票。参与人数上限10000远小于n，不会产生票数模n回绕。该关系由原语接口[2]及E(2)·E(3)解密为5的实测共同核对。</w:t>
+      </w:r>
+    </w:p>
+    <w:p>
+      <w:pPr>
+        <w:pStyle w:val="ReportH2"/>
+      </w:pPr>
+      <w:r>
+        <w:rPr>
+          <w:rFonts w:ascii="Times New Roman" w:hAnsi="Times New Roman" w:eastAsia="宋体"/>
+          <w:b/>
+          <w:color w:val="000000"/>
+          <w:sz w:val="24"/>
+        </w:rPr>
+        <w:t>3.2 独热编码与动态票型</w:t>
+      </w:r>
+    </w:p>
+    <w:p>
+      <w:pPr>
+        <w:pStyle w:val="ReportBody"/>
+      </w:pPr>
+      <w:r>
+        <w:rPr>
+          <w:rFonts w:ascii="Times New Roman" w:hAnsi="Times New Roman" w:eastAsia="宋体"/>
           <w:b w:val="0"/>
           <w:color w:val="000000"/>
           <w:sz w:val="24"/>
         </w:rPr>
-        <w:t>选取不同的大素数p、q，令n=pq，g=n+1。理论形式取λ=lcm(p−1,q−1)，μ=L(g^λ mod n²)的模n逆元，L(u)=(u−1)/n。加密为c=g^m r^n mod n²，其中r从与n互素的随机数中选择。解密为m=L(c^λ mod n²)μ mod n。程序调用phe生成2048位密钥；其私钥实现使用p、q及CRT加速，不能将教学公式误称为源码逐行实现。</w:t>
-      </w:r>
-    </w:p>
-    <w:p>
-      <w:pPr>
-        <w:keepNext/>
-        <w:spacing w:line="300" w:lineRule="auto" w:after="100"/>
-      </w:pPr>
-      <w:r>
-        <w:rPr>
-          <w:rFonts w:ascii="宋体" w:hAnsi="宋体" w:eastAsia="宋体"/>
+        <w:t>三选项的编码分别为[1,0,0]、[0,1,0]、[0,0,1]。对每个分量独立随机加密，维度由本轮options确定。每张票的ballot_type为single_choice，含投票者ID、UTC时间戳和128位随机标识。公开文件不写入choice字段，也不记录Paillier加密随机数r；公开r会削弱对小明文集合的保护。</w:t>
+      </w:r>
+    </w:p>
+    <w:p>
+      <w:pPr>
+        <w:pStyle w:val="ReportH2"/>
+      </w:pPr>
+      <w:r>
+        <w:rPr>
+          <w:rFonts w:ascii="Times New Roman" w:hAnsi="Times New Roman" w:eastAsia="宋体"/>
           <w:b/>
           <w:color w:val="000000"/>
           <w:sz w:val="24"/>
         </w:rPr>
-        <w:t>3.2 独热编码与动态票型</w:t>
-      </w:r>
-    </w:p>
-    <w:p>
-      <w:pPr>
-        <w:spacing w:line="300" w:lineRule="auto" w:after="100"/>
-        <w:ind w:firstLine="480"/>
-      </w:pPr>
-      <w:r>
-        <w:rPr>
-          <w:rFonts w:ascii="宋体" w:hAnsi="宋体" w:eastAsia="宋体"/>
+        <w:t>3.3 密钥生命周期</w:t>
+      </w:r>
+    </w:p>
+    <w:p>
+      <w:pPr>
+        <w:pStyle w:val="ReportBody"/>
+      </w:pPr>
+      <w:r>
+        <w:rPr>
+          <w:rFonts w:ascii="Times New Roman" w:hAnsi="Times New Roman" w:eastAsia="宋体"/>
           <w:b w:val="0"/>
           <w:color w:val="000000"/>
           <w:sz w:val="24"/>
         </w:rPr>
-        <w:t>三选项的编码分别为[1,0,0]、[0,1,0]、[0,0,1]。对每个分量独立随机加密，维度由本轮options确定。每张票的ballot_type为single_choice，含投票者ID、UTC时间戳和128位随机标识。公开文件不写入choice字段，也不记录Paillier加密随机数r；公开r会削弱对小明文集合的保护。</w:t>
-      </w:r>
-    </w:p>
-    <w:p>
-      <w:pPr>
+        <w:t>创建阶段生成Paillier私钥和登记签名密钥，使用scrypt派生32字节密钥，以AES-GCM加密保存到private/trustee.vault。scrypt参数为N=32768、r=8、p=1，盐16字节，nonce为12字节，投票轮次作为附加认证数据。创建后Election对象仅持有登记签名密钥；完整私钥仅在授权操作期间进入内存。Python不保证敏感对象即时擦除。</w:t>
+      </w:r>
+    </w:p>
+    <w:p>
+      <w:pPr>
+        <w:pStyle w:val="ReportH2"/>
+      </w:pPr>
+      <w:r>
+        <w:t>3.4 模块程序流程图设计</w:t>
+      </w:r>
+    </w:p>
+    <w:p>
+      <w:pPr>
+        <w:pStyle w:val="ReportCaption"/>
         <w:keepNext/>
-        <w:spacing w:line="300" w:lineRule="auto" w:after="100"/>
-      </w:pPr>
-      <w:r>
-        <w:rPr>
-          <w:rFonts w:ascii="宋体" w:hAnsi="宋体" w:eastAsia="宋体"/>
+      </w:pPr>
+      <w:r/>
+      <w:r>
+        <w:drawing>
+          <wp:inline xmlns:a="http://schemas.openxmlformats.org/drawingml/2006/main" xmlns:pic="http://schemas.openxmlformats.org/drawingml/2006/picture">
+            <wp:extent cx="5760000" cy="3456000"/>
+            <wp:docPr id="2" name="Picture 2"/>
+            <wp:cNvGraphicFramePr>
+              <a:graphicFrameLocks noChangeAspect="1"/>
+            </wp:cNvGraphicFramePr>
+            <a:graphic>
+              <a:graphicData uri="http://schemas.openxmlformats.org/drawingml/2006/picture">
+                <pic:pic>
+                  <pic:nvPicPr>
+                    <pic:cNvPr id="0" name="flow-A.png"/>
+                    <pic:cNvPicPr/>
+                  </pic:nvPicPr>
+                  <pic:blipFill>
+                    <a:blip r:embed="rId12"/>
+                    <a:stretch>
+                      <a:fillRect/>
+                    </a:stretch>
+                  </pic:blipFill>
+                  <pic:spPr>
+                    <a:xfrm>
+                      <a:off x="0" y="0"/>
+                      <a:ext cx="5760000" cy="3456000"/>
+                    </a:xfrm>
+                    <a:prstGeom prst="rect"/>
+                  </pic:spPr>
+                </pic:pic>
+              </a:graphicData>
+            </a:graphic>
+          </wp:inline>
+        </w:drawing>
+      </w:r>
+    </w:p>
+    <w:p>
+      <w:pPr>
+        <w:pStyle w:val="ReportCaption"/>
+      </w:pPr>
+      <w:r>
+        <w:t>图1 本模块处理流程与失败出口</w:t>
+      </w:r>
+    </w:p>
+    <w:p>
+      <w:pPr>
+        <w:pStyle w:val="ReportH2"/>
+      </w:pPr>
+      <w:r>
+        <w:rPr>
+          <w:rFonts w:ascii="Times New Roman" w:hAnsi="Times New Roman" w:eastAsia="宋体"/>
           <w:b/>
           <w:color w:val="000000"/>
           <w:sz w:val="24"/>
         </w:rPr>
-        <w:t>3.3 密钥生命周期</w:t>
-      </w:r>
-    </w:p>
-    <w:p>
-      <w:pPr>
-        <w:spacing w:line="300" w:lineRule="auto" w:after="100"/>
-        <w:ind w:firstLine="480"/>
-      </w:pPr>
-      <w:r>
-        <w:rPr>
-          <w:rFonts w:ascii="宋体" w:hAnsi="宋体" w:eastAsia="宋体"/>
+        <w:t>3.5 威胁模型与安全边界</w:t>
+      </w:r>
+    </w:p>
+    <w:p>
+      <w:pPr>
+        <w:pStyle w:val="ReportBody"/>
+      </w:pPr>
+      <w:r>
+        <w:rPr>
+          <w:rFonts w:ascii="Times New Roman" w:hAnsi="Times New Roman" w:eastAsia="宋体"/>
           <w:b w:val="0"/>
           <w:color w:val="000000"/>
           <w:sz w:val="24"/>
         </w:rPr>
-        <w:t>创建阶段生成Paillier私钥和登记签名密钥，使用scrypt派生32字节密钥，以AES-GCM加密保存到private/trustee.vault。scrypt参数为N=32768、r=8、p=1，盐16字节，nonce为12字节，投票轮次作为附加认证数据。创建后Election对象仅持有登记签名密钥；完整私钥仅在授权操作期间进入内存。Python不保证敏感对象即时擦除。</w:t>
-      </w:r>
-    </w:p>
-    <w:p>
-      <w:pPr>
+        <w:t>假设攻击者能够读取或修改公开选票目录，但不能获得保管口令和签名私钥，最初的公钥配置已可信确认。保护目标是隐藏单票选择并发现相对于签名清单的文件变化。应用运行在一台电脑上，角色隔离是教学流程；创建与解锁阶段可短暂接触完整密钥材料，不构成互不信任机构之间的物理隔离。</w:t>
+      </w:r>
+    </w:p>
+    <w:p>
+      <w:pPr>
+        <w:pStyle w:val="ReportH2"/>
+      </w:pPr>
+      <w:r>
+        <w:t>3.6 模块界面与数据说明</w:t>
+      </w:r>
+    </w:p>
+    <w:p>
+      <w:pPr>
+        <w:pStyle w:val="ReportBody"/>
         <w:keepNext/>
-        <w:spacing w:line="300" w:lineRule="auto" w:after="100"/>
-      </w:pPr>
-      <w:r>
-        <w:rPr>
-          <w:rFonts w:ascii="宋体" w:hAnsi="宋体" w:eastAsia="宋体"/>
-          <w:b/>
-          <w:color w:val="000000"/>
-          <w:sz w:val="24"/>
-        </w:rPr>
-        <w:t>3.4 模块处理流程</w:t>
-      </w:r>
-    </w:p>
-    <w:p>
-      <w:pPr>
-        <w:spacing w:line="300" w:lineRule="auto" w:after="100"/>
-      </w:pPr>
-      <w:r>
-        <w:rPr>
-          <w:rFonts w:ascii="宋体" w:hAnsi="宋体" w:eastAsia="宋体"/>
-          <w:b w:val="0"/>
-          <w:color w:val="000000"/>
-          <w:sz w:val="22"/>
-        </w:rPr>
-        <w:t>读取选项配置 → 校验ID和索引 → 生成独热向量 → 各分量随机加密 → 封装公开选票 → 交给登记端</w:t>
-      </w:r>
-    </w:p>
-    <w:p>
-      <w:pPr>
-        <w:keepNext/>
-        <w:spacing w:line="300" w:lineRule="auto" w:after="100"/>
-      </w:pPr>
-      <w:r>
-        <w:rPr>
-          <w:rFonts w:ascii="宋体" w:hAnsi="宋体" w:eastAsia="宋体"/>
-          <w:b/>
-          <w:color w:val="000000"/>
-          <w:sz w:val="24"/>
-        </w:rPr>
-        <w:t>3.5 威胁模型与安全边界</w:t>
-      </w:r>
-    </w:p>
-    <w:p>
-      <w:pPr>
-        <w:spacing w:line="300" w:lineRule="auto" w:after="100"/>
-        <w:ind w:firstLine="480"/>
-      </w:pPr>
-      <w:r>
-        <w:rPr>
-          <w:rFonts w:ascii="宋体" w:hAnsi="宋体" w:eastAsia="宋体"/>
-          <w:b w:val="0"/>
-          <w:color w:val="000000"/>
-          <w:sz w:val="24"/>
-        </w:rPr>
-        <w:t>假设攻击者能够读取或修改公开选票目录，但不能获得保管口令和签名私钥，最初的公钥配置已可信确认。保护目标是隐藏单票选择并发现相对于签名清单的文件变化。应用运行在一台电脑上，角色隔离是教学流程；创建与解锁阶段可短暂接触完整密钥材料，不构成互不信任机构之间的物理隔离。</w:t>
-      </w:r>
-    </w:p>
-    <w:p>
-      <w:pPr>
-        <w:keepNext/>
-        <w:pageBreakBefore/>
-        <w:spacing w:line="300" w:lineRule="auto" w:after="160"/>
-      </w:pPr>
-      <w:r>
-        <w:rPr>
-          <w:rFonts w:ascii="宋体" w:hAnsi="宋体" w:eastAsia="宋体"/>
-          <w:b/>
-          <w:color w:val="000000"/>
-          <w:sz w:val="28"/>
-        </w:rPr>
-        <w:t>模块界面与数据说明</w:t>
-      </w:r>
-    </w:p>
-    <w:p>
+        <w:ind w:firstLine="0"/>
+        <w:jc w:val="center"/>
+      </w:pPr>
       <w:r>
         <w:drawing>
           <wp:inline xmlns:a="http://schemas.openxmlformats.org/drawingml/2006/main" xmlns:pic="http://schemas.openxmlformats.org/drawingml/2006/picture">
@@ -2941,407 +3108,283 @@
     </w:p>
     <w:p>
       <w:pPr>
-        <w:spacing w:line="300" w:lineRule="auto" w:after="160"/>
-        <w:jc w:val="center"/>
-      </w:pPr>
-      <w:r>
-        <w:rPr>
-          <w:rFonts w:ascii="宋体" w:hAnsi="宋体" w:eastAsia="宋体"/>
+        <w:pStyle w:val="ReportCaption"/>
+      </w:pPr>
+      <w:r>
+        <w:t>图2 加密投票页的公开元数据</w:t>
+      </w:r>
+    </w:p>
+    <w:p>
+      <w:pPr>
+        <w:pStyle w:val="ReportH2"/>
+      </w:pPr>
+      <w:r>
+        <w:t>3.7 公开数据与私有数据</w:t>
+      </w:r>
+    </w:p>
+    <w:p>
+      <w:pPr>
+        <w:pStyle w:val="ReportBody"/>
+      </w:pPr>
+      <w:r>
+        <w:rPr>
+          <w:rFonts w:ascii="Times New Roman" w:hAnsi="Times New Roman" w:eastAsia="宋体"/>
           <w:b w:val="0"/>
           <w:color w:val="000000"/>
-          <w:sz w:val="21"/>
-        </w:rPr>
-        <w:t>图1 加密投票页只显示投票者ID 时间和摘要</w:t>
-      </w:r>
-    </w:p>
-    <w:p>
-      <w:pPr>
-        <w:keepNext/>
-        <w:spacing w:line="300" w:lineRule="auto" w:after="100"/>
-      </w:pPr>
-      <w:r>
-        <w:rPr>
-          <w:rFonts w:ascii="宋体" w:hAnsi="宋体" w:eastAsia="宋体"/>
+          <w:sz w:val="24"/>
+        </w:rPr>
+        <w:t>public/config.json保存标题、选项、名单、Paillier公钥n和审计公钥；public/ballots保存每张加密选票；public/manifest.json保存签名清单。private/trustee.vault保存加密后的私钥材料。公开包不包含private目录。口令经标准输入管道交给解密子进程，不放入命令行或日志。</w:t>
+      </w:r>
+    </w:p>
+    <w:p>
+      <w:pPr>
+        <w:pStyle w:val="ReportBody"/>
+      </w:pPr>
+      <w:r>
+        <w:rPr>
+          <w:rFonts w:ascii="Times New Roman" w:hAnsi="Times New Roman" w:eastAsia="宋体"/>
+          <w:b w:val="0"/>
+          <w:color w:val="000000"/>
+          <w:sz w:val="24"/>
+        </w:rPr>
+        <w:t>选票的时间戳、ID与随机标识属于公开元数据，隐私目标是投票内容保密，不是投票者匿名。演示和自动实验均使用虚构ID及合成选票。</w:t>
+      </w:r>
+    </w:p>
+    <w:p>
+      <w:pPr>
+        <w:pStyle w:val="ReportH1"/>
+      </w:pPr>
+      <w:r>
+        <w:rPr>
+          <w:rFonts w:ascii="Times New Roman" w:hAnsi="Times New Roman" w:eastAsia="宋体"/>
+          <w:b/>
+          <w:color w:val="000000"/>
+          <w:sz w:val="28"/>
+        </w:rPr>
+        <w:t>四、部分核心代码</w:t>
+      </w:r>
+    </w:p>
+    <w:p>
+      <w:pPr>
+        <w:pStyle w:val="ReportH2"/>
+      </w:pPr>
+      <w:r>
+        <w:rPr>
+          <w:rFonts w:ascii="Times New Roman" w:hAnsi="Times New Roman" w:eastAsia="宋体"/>
           <w:b/>
           <w:color w:val="000000"/>
           <w:sz w:val="24"/>
         </w:rPr>
-        <w:t>公开数据与私有数据</w:t>
-      </w:r>
-    </w:p>
-    <w:p>
-      <w:pPr>
-        <w:spacing w:line="300" w:lineRule="auto" w:after="100"/>
-        <w:ind w:firstLine="480"/>
-      </w:pPr>
-      <w:r>
-        <w:rPr>
-          <w:rFonts w:ascii="宋体" w:hAnsi="宋体" w:eastAsia="宋体"/>
+        <w:t>4.1 核心实现片段</w:t>
+      </w:r>
+    </w:p>
+    <w:p>
+      <w:pPr>
+        <w:pStyle w:val="ReportBody"/>
+        <w:keepNext/>
+      </w:pPr>
+      <w:r>
+        <w:rPr>
+          <w:rFonts w:ascii="Times New Roman" w:hAnsi="Times New Roman" w:eastAsia="宋体"/>
           <w:b w:val="0"/>
           <w:color w:val="000000"/>
           <w:sz w:val="24"/>
         </w:rPr>
-        <w:t>public/config.json保存标题、选项、名单、Paillier公钥n和审计公钥；public/ballots保存每张加密选票；public/manifest.json保存签名清单。private/trustee.vault保存加密后的私钥材料。公开包不包含private目录。口令经标准输入管道交给解密子进程，不放入命令行或日志。</w:t>
-      </w:r>
-    </w:p>
-    <w:p>
-      <w:pPr>
-        <w:spacing w:line="300" w:lineRule="auto" w:after="100"/>
-        <w:ind w:firstLine="480"/>
-      </w:pPr>
-      <w:r>
-        <w:rPr>
-          <w:rFonts w:ascii="宋体" w:hAnsi="宋体" w:eastAsia="宋体"/>
+        <w:t>以下片段摘自 crypto_service.py，完整上下文与异常处理见随附源代码。</w:t>
+      </w:r>
+    </w:p>
+    <w:p>
+      <w:pPr>
+        <w:pStyle w:val="ReportCode"/>
+        <w:keepNext w:val="0"/>
+      </w:pPr>
+      <w:r>
+        <w:rPr>
+          <w:rFonts w:ascii="Consolas" w:hAnsi="Consolas" w:eastAsia="新宋体"/>
+          <w:b w:val="0"/>
+          <w:color w:val="000000"/>
+          <w:sz w:val="20"/>
+        </w:rPr>
+        <w:t xml:space="preserve">    if type(choice) is not int or not 0 &lt;= choice &lt; len(config['options']):</w:t>
+        <w:br/>
+        <w:t xml:space="preserve">        raise VoteError('必须且只能选择一个有效选项')</w:t>
+        <w:br/>
+        <w:t xml:space="preserve">    if voter_id not in config['roster']:</w:t>
+        <w:br/>
+        <w:t xml:space="preserve">        raise VoteError('投票者ID不在授权名单内')</w:t>
+        <w:br/>
+        <w:t xml:space="preserve">    pub = public_key(config)</w:t>
+        <w:br/>
+        <w:t xml:space="preserve">    encrypted = [</w:t>
+        <w:br/>
+        <w:t xml:space="preserve">        str(pub.raw_encrypt(int(i == choice)))</w:t>
+        <w:br/>
+        <w:t xml:space="preserve">        for i in range(len(config['options']))</w:t>
+        <w:br/>
+        <w:t xml:space="preserve">    ]</w:t>
+        <w:br/>
+        <w:t xml:space="preserve">    return {</w:t>
+        <w:br/>
+        <w:t xml:space="preserve">        'version': 1, 'election_id': config['election_id'],</w:t>
+        <w:br/>
+        <w:t xml:space="preserve">        'voter_id': voter_id, 'ballot_type': 'single_choice',</w:t>
+        <w:br/>
+        <w:t xml:space="preserve">        'timestamp': now(), 'nonce': uuid.uuid4().hex,</w:t>
+        <w:br/>
+        <w:t xml:space="preserve">        'ciphertexts': encrypted,</w:t>
+        <w:br/>
+        <w:t xml:space="preserve">    }</w:t>
+      </w:r>
+    </w:p>
+    <w:p>
+      <w:pPr>
+        <w:pStyle w:val="ReportH2"/>
+      </w:pPr>
+      <w:r>
+        <w:rPr>
+          <w:rFonts w:ascii="Times New Roman" w:hAnsi="Times New Roman" w:eastAsia="宋体"/>
+          <w:b/>
+          <w:color w:val="000000"/>
+          <w:sz w:val="24"/>
+        </w:rPr>
+        <w:t>4.2 本模块可重复实验步骤</w:t>
+      </w:r>
+    </w:p>
+    <w:p>
+      <w:pPr>
+        <w:pStyle w:val="ReportBody"/>
+      </w:pPr>
+      <w:r>
+        <w:rPr>
+          <w:rFonts w:ascii="Times New Roman" w:hAnsi="Times New Roman" w:eastAsia="宋体"/>
           <w:b w:val="0"/>
           <w:color w:val="000000"/>
           <w:sz w:val="24"/>
         </w:rPr>
-        <w:t>选票的时间戳、ID与随机标识属于公开元数据，隐私目标是投票内容保密，不是投票者匿名。演示和自动实验均使用虚构ID及合成选票。</w:t>
-      </w:r>
-    </w:p>
-    <w:p>
-      <w:pPr>
-        <w:keepNext/>
-        <w:pageBreakBefore/>
-        <w:spacing w:line="300" w:lineRule="auto" w:after="160"/>
-      </w:pPr>
-      <w:r>
-        <w:rPr>
-          <w:rFonts w:ascii="宋体" w:hAnsi="宋体" w:eastAsia="宋体"/>
+        <w:t>1．在创建页设置3个选项、12名投票者及至少8字符的保管口令，创建投票目录。检查public/config.json包含n而不包含p、q。</w:t>
+      </w:r>
+    </w:p>
+    <w:p>
+      <w:pPr>
+        <w:pStyle w:val="ReportBody"/>
+      </w:pPr>
+      <w:r>
+        <w:rPr>
+          <w:rFonts w:ascii="Times New Roman" w:hAnsi="Times New Roman" w:eastAsia="宋体"/>
+          <w:b w:val="0"/>
+          <w:color w:val="000000"/>
+          <w:sz w:val="24"/>
+        </w:rPr>
+        <w:t>2．依次用V0001至V0006提交第1、2、1、3、1、2个选项。每次提交后界面应清空选择，密文记录中不出现明文选项。</w:t>
+      </w:r>
+    </w:p>
+    <w:p>
+      <w:pPr>
+        <w:pStyle w:val="ReportBody"/>
+      </w:pPr>
+      <w:r>
+        <w:rPr>
+          <w:rFonts w:ascii="Times New Roman" w:hAnsi="Times New Roman" w:eastAsia="宋体"/>
+          <w:b w:val="0"/>
+          <w:color w:val="000000"/>
+          <w:sz w:val="24"/>
+        </w:rPr>
+        <w:t>3．在自动实验中验证同一明文两次加密得到不同密文，并验证二者解密一致。随机加密不能用固定随机种子替代。</w:t>
+      </w:r>
+    </w:p>
+    <w:p>
+      <w:pPr>
+        <w:pStyle w:val="ReportBody"/>
+      </w:pPr>
+      <w:r>
+        <w:rPr>
+          <w:rFonts w:ascii="Times New Roman" w:hAnsi="Times New Roman" w:eastAsia="宋体"/>
+          <w:b w:val="0"/>
+          <w:color w:val="000000"/>
+          <w:sz w:val="24"/>
+        </w:rPr>
+        <w:t>4．输入名单外ID或越界索引，观察明确拒绝；错误私钥口令必须导致认证失败。</w:t>
+      </w:r>
+    </w:p>
+    <w:p>
+      <w:pPr>
+        <w:pStyle w:val="ReportBody"/>
+      </w:pPr>
+      <w:r>
+        <w:rPr>
+          <w:rFonts w:ascii="Times New Roman" w:hAnsi="Times New Roman" w:eastAsia="宋体"/>
+          <w:b w:val="0"/>
+          <w:color w:val="000000"/>
+          <w:sz w:val="24"/>
+        </w:rPr>
+        <w:t>5．新建4选项轮次，每个选项各投一票，交由成员B计票，结果应为[1,1,1,1]。</w:t>
+      </w:r>
+    </w:p>
+    <w:p>
+      <w:pPr>
+        <w:pStyle w:val="ReportBody"/>
+      </w:pPr>
+      <w:r>
+        <w:rPr>
+          <w:rFonts w:ascii="Times New Roman" w:hAnsi="Times New Roman" w:eastAsia="宋体"/>
+          <w:b w:val="0"/>
+          <w:color w:val="000000"/>
+          <w:sz w:val="24"/>
+        </w:rPr>
+        <w:t>6．运行自动实验，记录10、100、1000人三选项各3次加密耗时，分析每票需要3次公钥加密的成本。</w:t>
+      </w:r>
+    </w:p>
+    <w:p>
+      <w:pPr>
+        <w:pStyle w:val="ReportH1"/>
+      </w:pPr>
+      <w:r>
+        <w:rPr>
+          <w:rFonts w:ascii="Times New Roman" w:hAnsi="Times New Roman" w:eastAsia="宋体"/>
           <w:b/>
           <w:color w:val="000000"/>
           <w:sz w:val="28"/>
         </w:rPr>
-        <w:t>四 部分核心代码与实验步骤</w:t>
-      </w:r>
-    </w:p>
-    <w:p>
-      <w:pPr>
-        <w:keepNext/>
-        <w:spacing w:line="300" w:lineRule="auto" w:after="100"/>
-      </w:pPr>
-      <w:r>
-        <w:rPr>
-          <w:rFonts w:ascii="宋体" w:hAnsi="宋体" w:eastAsia="宋体"/>
+        <w:t>五、课题完成过程中遇到的问题及解决方法</w:t>
+      </w:r>
+    </w:p>
+    <w:p>
+      <w:pPr>
+        <w:pStyle w:val="ReportH2"/>
+      </w:pPr>
+      <w:r>
+        <w:rPr>
+          <w:rFonts w:ascii="Times New Roman" w:hAnsi="Times New Roman" w:eastAsia="宋体"/>
           <w:b/>
           <w:color w:val="000000"/>
           <w:sz w:val="24"/>
         </w:rPr>
-        <w:t>4.1 核心实现片段</w:t>
-      </w:r>
-    </w:p>
-    <w:p>
-      <w:pPr>
-        <w:spacing w:line="300" w:lineRule="auto" w:after="100"/>
-      </w:pPr>
-      <w:r>
-        <w:rPr>
-          <w:rFonts w:ascii="宋体" w:hAnsi="宋体" w:eastAsia="宋体"/>
-          <w:b w:val="0"/>
-          <w:color w:val="000000"/>
-          <w:sz w:val="21"/>
-        </w:rPr>
-        <w:t>以下片段摘自 crypto_service.py，完整上下文与异常处理见随附源代码。</w:t>
-      </w:r>
-    </w:p>
-    <w:p>
-      <w:pPr>
-        <w:spacing w:after="0" w:line="240" w:lineRule="auto"/>
-      </w:pPr>
-      <w:r>
-        <w:rPr>
-          <w:rFonts w:ascii="Consolas" w:hAnsi="Consolas" w:eastAsia="Consolas"/>
-          <w:b w:val="0"/>
-          <w:color w:val="000000"/>
-          <w:sz w:val="17"/>
-        </w:rPr>
-        <w:t xml:space="preserve">    if type(choice) is not int or not 0 &lt;= choice &lt; len(config['options']):</w:t>
-      </w:r>
-    </w:p>
-    <w:p>
-      <w:pPr>
-        <w:spacing w:after="0" w:line="240" w:lineRule="auto"/>
-      </w:pPr>
-      <w:r>
-        <w:rPr>
-          <w:rFonts w:ascii="Consolas" w:hAnsi="Consolas" w:eastAsia="Consolas"/>
-          <w:b w:val="0"/>
-          <w:color w:val="000000"/>
-          <w:sz w:val="17"/>
-        </w:rPr>
-        <w:t xml:space="preserve">        raise VoteError('必须且只能选择一个有效选项')</w:t>
-      </w:r>
-    </w:p>
-    <w:p>
-      <w:pPr>
-        <w:spacing w:after="0" w:line="240" w:lineRule="auto"/>
-      </w:pPr>
-      <w:r>
-        <w:rPr>
-          <w:rFonts w:ascii="Consolas" w:hAnsi="Consolas" w:eastAsia="Consolas"/>
-          <w:b w:val="0"/>
-          <w:color w:val="000000"/>
-          <w:sz w:val="17"/>
-        </w:rPr>
-        <w:t xml:space="preserve">    if voter_id not in config['roster']:</w:t>
-      </w:r>
-    </w:p>
-    <w:p>
-      <w:pPr>
-        <w:spacing w:after="0" w:line="240" w:lineRule="auto"/>
-      </w:pPr>
-      <w:r>
-        <w:rPr>
-          <w:rFonts w:ascii="Consolas" w:hAnsi="Consolas" w:eastAsia="Consolas"/>
-          <w:b w:val="0"/>
-          <w:color w:val="000000"/>
-          <w:sz w:val="17"/>
-        </w:rPr>
-        <w:t xml:space="preserve">        raise VoteError('投票者ID不在授权名单内')</w:t>
-      </w:r>
-    </w:p>
-    <w:p>
-      <w:pPr>
-        <w:spacing w:after="0" w:line="240" w:lineRule="auto"/>
-      </w:pPr>
-      <w:r>
-        <w:rPr>
-          <w:rFonts w:ascii="Consolas" w:hAnsi="Consolas" w:eastAsia="Consolas"/>
-          <w:b w:val="0"/>
-          <w:color w:val="000000"/>
-          <w:sz w:val="17"/>
-        </w:rPr>
-        <w:t xml:space="preserve">    pub = public_key(config)</w:t>
-      </w:r>
-    </w:p>
-    <w:p>
-      <w:pPr>
-        <w:spacing w:after="0" w:line="240" w:lineRule="auto"/>
-      </w:pPr>
-      <w:r>
-        <w:rPr>
-          <w:rFonts w:ascii="Consolas" w:hAnsi="Consolas" w:eastAsia="Consolas"/>
-          <w:b w:val="0"/>
-          <w:color w:val="000000"/>
-          <w:sz w:val="17"/>
-        </w:rPr>
-        <w:t xml:space="preserve">    # raw_encrypt chooses independent, cryptographically random r in Z*_n.</w:t>
-      </w:r>
-    </w:p>
-    <w:p>
-      <w:pPr>
-        <w:spacing w:after="0" w:line="240" w:lineRule="auto"/>
-      </w:pPr>
-      <w:r>
-        <w:rPr>
-          <w:rFonts w:ascii="Consolas" w:hAnsi="Consolas" w:eastAsia="Consolas"/>
-          <w:b w:val="0"/>
-          <w:color w:val="000000"/>
-          <w:sz w:val="17"/>
-        </w:rPr>
-        <w:t xml:space="preserve">    encrypted = [str(pub.raw_encrypt(int(i == choice))) for i in range(len(config['options']))]</w:t>
-      </w:r>
-    </w:p>
-    <w:p>
-      <w:pPr>
-        <w:spacing w:after="0" w:line="240" w:lineRule="auto"/>
-      </w:pPr>
-      <w:r>
-        <w:rPr>
-          <w:rFonts w:ascii="Consolas" w:hAnsi="Consolas" w:eastAsia="Consolas"/>
-          <w:b w:val="0"/>
-          <w:color w:val="000000"/>
-          <w:sz w:val="17"/>
-        </w:rPr>
-        <w:t xml:space="preserve">    return {'version': 1, 'election_id': config['election_id'], 'voter_id': voter_id,</w:t>
-      </w:r>
-    </w:p>
-    <w:p>
-      <w:pPr>
-        <w:spacing w:after="0" w:line="240" w:lineRule="auto"/>
-      </w:pPr>
-      <w:r>
-        <w:rPr>
-          <w:rFonts w:ascii="Consolas" w:hAnsi="Consolas" w:eastAsia="Consolas"/>
-          <w:b w:val="0"/>
-          <w:color w:val="000000"/>
-          <w:sz w:val="17"/>
-        </w:rPr>
-        <w:t xml:space="preserve">            'ballot_type': 'single_choice', 'timestamp': now(), 'nonce': uuid.uuid4().hex,</w:t>
-      </w:r>
-    </w:p>
-    <w:p>
-      <w:pPr>
-        <w:spacing w:after="0" w:line="240" w:lineRule="auto"/>
-      </w:pPr>
-      <w:r>
-        <w:rPr>
-          <w:rFonts w:ascii="Consolas" w:hAnsi="Consolas" w:eastAsia="Consolas"/>
-          <w:b w:val="0"/>
-          <w:color w:val="000000"/>
-          <w:sz w:val="17"/>
-        </w:rPr>
-        <w:t xml:space="preserve">            'ciphertexts': encrypted}</w:t>
-      </w:r>
-    </w:p>
-    <w:p>
-      <w:pPr>
+        <w:t>5.1 实验环境与记录来源</w:t>
+      </w:r>
+    </w:p>
+    <w:p>
+      <w:pPr>
+        <w:pStyle w:val="ReportBody"/>
+      </w:pPr>
+      <w:r>
+        <w:t>本轮实测日期为2026年10月27日（北京时间）。环境为Windows-11-10.0.26200-SP0，Python 3.12.14；phe 1.5.0、gmpy2 2.3.2、cryptography 50.0.2、PySide6-Essentials 6.12.0。核心实验使用2048位Paillier模数；9项工程回归使用1024位密钥加速边界检查，不作为安全强度示范。</w:t>
+      </w:r>
+    </w:p>
+    <w:p>
+      <w:pPr>
+        <w:pStyle w:val="ReportBody"/>
+      </w:pPr>
+      <w:r>
+        <w:t>自动核心实验29项全部符合预期，另有9项工程回归和原生Qt界面测试通过。原始记录位于evidence/2026-10-27/full/，包含JSON与CSV；源码SHA-256逐文件记入JSON。表2列出本模块相关结果。“局限”用例通过表示成功复现边界，不表示已防御。</w:t>
+      </w:r>
+    </w:p>
+    <w:p>
+      <w:pPr>
+        <w:pStyle w:val="ReportCaption"/>
         <w:keepNext/>
-        <w:spacing w:line="300" w:lineRule="auto" w:after="100"/>
-      </w:pPr>
-      <w:r>
-        <w:rPr>
-          <w:rFonts w:ascii="宋体" w:hAnsi="宋体" w:eastAsia="宋体"/>
-          <w:b/>
-          <w:color w:val="000000"/>
-          <w:sz w:val="24"/>
-        </w:rPr>
-        <w:t>4.2 本模块可重复实验步骤</w:t>
-      </w:r>
-    </w:p>
-    <w:p>
-      <w:pPr>
-        <w:spacing w:line="300" w:lineRule="auto" w:after="100"/>
-      </w:pPr>
-      <w:r>
-        <w:rPr>
-          <w:rFonts w:ascii="宋体" w:hAnsi="宋体" w:eastAsia="宋体"/>
-          <w:b w:val="0"/>
-          <w:color w:val="000000"/>
-          <w:sz w:val="22"/>
-        </w:rPr>
-        <w:t>1．在创建页设置3个选项、12名投票者及至少8字符的保管口令，创建投票目录。检查public/config.json包含n而不包含p、q。</w:t>
-      </w:r>
-    </w:p>
-    <w:p>
-      <w:pPr>
-        <w:spacing w:line="300" w:lineRule="auto" w:after="100"/>
-      </w:pPr>
-      <w:r>
-        <w:rPr>
-          <w:rFonts w:ascii="宋体" w:hAnsi="宋体" w:eastAsia="宋体"/>
-          <w:b w:val="0"/>
-          <w:color w:val="000000"/>
-          <w:sz w:val="22"/>
-        </w:rPr>
-        <w:t>2．依次用V0001至V0006提交第1、2、1、3、1、2个选项。每次提交后界面应清空选择，密文记录中不出现明文选项。</w:t>
-      </w:r>
-    </w:p>
-    <w:p>
-      <w:pPr>
-        <w:spacing w:line="300" w:lineRule="auto" w:after="100"/>
-      </w:pPr>
-      <w:r>
-        <w:rPr>
-          <w:rFonts w:ascii="宋体" w:hAnsi="宋体" w:eastAsia="宋体"/>
-          <w:b w:val="0"/>
-          <w:color w:val="000000"/>
-          <w:sz w:val="22"/>
-        </w:rPr>
-        <w:t>3．在自动实验中验证同一明文两次加密得到不同密文，并验证二者解密一致。随机加密不能用固定随机种子替代。</w:t>
-      </w:r>
-    </w:p>
-    <w:p>
-      <w:pPr>
-        <w:spacing w:line="300" w:lineRule="auto" w:after="100"/>
-      </w:pPr>
-      <w:r>
-        <w:rPr>
-          <w:rFonts w:ascii="宋体" w:hAnsi="宋体" w:eastAsia="宋体"/>
-          <w:b w:val="0"/>
-          <w:color w:val="000000"/>
-          <w:sz w:val="22"/>
-        </w:rPr>
-        <w:t>4．输入名单外ID或越界索引，观察明确拒绝；错误私钥口令必须导致认证失败。</w:t>
-      </w:r>
-    </w:p>
-    <w:p>
-      <w:pPr>
-        <w:spacing w:line="300" w:lineRule="auto" w:after="100"/>
-      </w:pPr>
-      <w:r>
-        <w:rPr>
-          <w:rFonts w:ascii="宋体" w:hAnsi="宋体" w:eastAsia="宋体"/>
-          <w:b w:val="0"/>
-          <w:color w:val="000000"/>
-          <w:sz w:val="22"/>
-        </w:rPr>
-        <w:t>5．新建4选项轮次，每个选项各投一票，交由成员B计票，结果应为[1,1,1,1]。</w:t>
-      </w:r>
-    </w:p>
-    <w:p>
-      <w:pPr>
-        <w:spacing w:line="300" w:lineRule="auto" w:after="100"/>
-      </w:pPr>
-      <w:r>
-        <w:rPr>
-          <w:rFonts w:ascii="宋体" w:hAnsi="宋体" w:eastAsia="宋体"/>
-          <w:b w:val="0"/>
-          <w:color w:val="000000"/>
-          <w:sz w:val="22"/>
-        </w:rPr>
-        <w:t>6．运行自动实验，记录10、100、1000人三选项各3次加密耗时，分析每票需要3次公钥加密的成本。</w:t>
-      </w:r>
-    </w:p>
-    <w:p>
-      <w:pPr>
-        <w:keepNext/>
-        <w:pageBreakBefore/>
-        <w:spacing w:line="300" w:lineRule="auto" w:after="160"/>
-      </w:pPr>
-      <w:r>
-        <w:rPr>
-          <w:rFonts w:ascii="宋体" w:hAnsi="宋体" w:eastAsia="宋体"/>
-          <w:b/>
-          <w:color w:val="000000"/>
-          <w:sz w:val="28"/>
-        </w:rPr>
-        <w:t>五 课题完成过程中遇到的问题及解决方法</w:t>
-      </w:r>
-    </w:p>
-    <w:p>
-      <w:pPr>
-        <w:keepNext/>
-        <w:spacing w:line="300" w:lineRule="auto" w:after="100"/>
-      </w:pPr>
-      <w:r>
-        <w:rPr>
-          <w:rFonts w:ascii="宋体" w:hAnsi="宋体" w:eastAsia="宋体"/>
-          <w:b/>
-          <w:color w:val="000000"/>
-          <w:sz w:val="24"/>
-        </w:rPr>
-        <w:t>5.1 实验环境与记录来源</w:t>
-      </w:r>
-    </w:p>
-    <w:p>
-      <w:pPr>
-        <w:spacing w:line="300" w:lineRule="auto" w:after="100"/>
-        <w:ind w:firstLine="480"/>
-      </w:pPr>
-      <w:r>
-        <w:rPr>
-          <w:rFonts w:ascii="宋体" w:hAnsi="宋体" w:eastAsia="宋体"/>
-          <w:b w:val="0"/>
-          <w:color w:val="000000"/>
-          <w:sz w:val="22"/>
-        </w:rPr>
-        <w:t>实测日期为2026年10月26日。环境为Windows-11-10.0.22631-SP0，Python 3.12.14，phe 1.5.0，gmpy2 2.3.2，cryptography 50.0.2，PySide6 6.12.0。Paillier模数2048位；数据来自experiment_results.json，不使用预测值替代实测。</w:t>
-      </w:r>
-    </w:p>
-    <w:p>
-      <w:pPr>
-        <w:spacing w:line="300" w:lineRule="auto" w:after="100"/>
-        <w:ind w:firstLine="480"/>
-      </w:pPr>
-      <w:r>
-        <w:rPr>
-          <w:rFonts w:ascii="宋体" w:hAnsi="宋体" w:eastAsia="宋体"/>
-          <w:b w:val="0"/>
-          <w:color w:val="000000"/>
-          <w:sz w:val="22"/>
-        </w:rPr>
-        <w:t>自动核心实验共25项，25项通过。下表选取与本分工相关的用例；完整记录在test_cases.csv。‘通过’表示符合预期，完整回滚用例的通过表示局限被成功复现，并不表示系统能够抵御回滚。</w:t>
+      </w:pPr>
+      <w:r>
+        <w:t>表2 本模块测试结果</w:t>
       </w:r>
     </w:p>
     <w:tbl>
@@ -3358,12 +3401,17 @@
       <w:tr>
         <w:trPr>
           <w:tblHeader/>
+          <w:tblHeader/>
         </w:trPr>
         <w:tc>
           <w:tcPr>
             <w:tcW w:type="dxa" w:w="2551"/>
             <w:vAlign w:val="center"/>
             <w:tcBorders>
+              <w:top w:val="single" w:sz="4" w:color="D9D9D9"/>
+              <w:left w:val="single" w:sz="4" w:color="D9D9D9"/>
+              <w:bottom w:val="single" w:sz="4" w:color="D9D9D9"/>
+              <w:right w:val="single" w:sz="4" w:color="D9D9D9"/>
               <w:top w:val="single" w:sz="4" w:color="D9D9D9"/>
               <w:left w:val="single" w:sz="4" w:color="D9D9D9"/>
               <w:bottom w:val="single" w:sz="4" w:color="D9D9D9"/>
@@ -3379,11 +3427,11 @@
           </w:tcPr>
           <w:p>
             <w:pPr>
-              <w:spacing w:after="40" w:line="264" w:lineRule="auto"/>
-            </w:pPr>
-            <w:r>
-              <w:rPr>
-                <w:rFonts w:ascii="宋体" w:hAnsi="宋体" w:eastAsia="宋体"/>
+              <w:spacing w:after="40" w:line="288" w:lineRule="auto" w:before="40"/>
+            </w:pPr>
+            <w:r>
+              <w:rPr>
+                <w:rFonts w:ascii="Times New Roman" w:hAnsi="Times New Roman" w:eastAsia="宋体"/>
                 <w:b/>
                 <w:color w:val="000000"/>
                 <w:sz w:val="21"/>
@@ -3397,6 +3445,10 @@
             <w:tcW w:type="dxa" w:w="6633"/>
             <w:vAlign w:val="center"/>
             <w:tcBorders>
+              <w:top w:val="single" w:sz="4" w:color="D9D9D9"/>
+              <w:left w:val="single" w:sz="4" w:color="D9D9D9"/>
+              <w:bottom w:val="single" w:sz="4" w:color="D9D9D9"/>
+              <w:right w:val="single" w:sz="4" w:color="D9D9D9"/>
               <w:top w:val="single" w:sz="4" w:color="D9D9D9"/>
               <w:left w:val="single" w:sz="4" w:color="D9D9D9"/>
               <w:bottom w:val="single" w:sz="4" w:color="D9D9D9"/>
@@ -3412,11 +3464,11 @@
           </w:tcPr>
           <w:p>
             <w:pPr>
-              <w:spacing w:after="40" w:line="264" w:lineRule="auto"/>
-            </w:pPr>
-            <w:r>
-              <w:rPr>
-                <w:rFonts w:ascii="宋体" w:hAnsi="宋体" w:eastAsia="宋体"/>
+              <w:spacing w:after="40" w:line="288" w:lineRule="auto" w:before="40"/>
+            </w:pPr>
+            <w:r>
+              <w:rPr>
+                <w:rFonts w:ascii="Times New Roman" w:hAnsi="Times New Roman" w:eastAsia="宋体"/>
                 <w:b/>
                 <w:color w:val="000000"/>
                 <w:sz w:val="21"/>
@@ -3427,11 +3479,16 @@
         </w:tc>
       </w:tr>
       <w:tr>
+        <w:trPr/>
         <w:tc>
           <w:tcPr>
             <w:tcW w:type="dxa" w:w="2551"/>
             <w:vAlign w:val="center"/>
             <w:tcBorders>
+              <w:top w:val="single" w:sz="4" w:color="D9D9D9"/>
+              <w:left w:val="single" w:sz="4" w:color="D9D9D9"/>
+              <w:bottom w:val="single" w:sz="4" w:color="D9D9D9"/>
+              <w:right w:val="single" w:sz="4" w:color="D9D9D9"/>
               <w:top w:val="single" w:sz="4" w:color="D9D9D9"/>
               <w:left w:val="single" w:sz="4" w:color="D9D9D9"/>
               <w:bottom w:val="single" w:sz="4" w:color="D9D9D9"/>
@@ -3446,11 +3503,11 @@
           </w:tcPr>
           <w:p>
             <w:pPr>
-              <w:spacing w:after="40" w:line="264" w:lineRule="auto"/>
-            </w:pPr>
-            <w:r>
-              <w:rPr>
-                <w:rFonts w:ascii="宋体" w:hAnsi="宋体" w:eastAsia="宋体"/>
+              <w:spacing w:after="40" w:line="288" w:lineRule="auto" w:before="40"/>
+            </w:pPr>
+            <w:r>
+              <w:rPr>
+                <w:rFonts w:ascii="Times New Roman" w:hAnsi="Times New Roman" w:eastAsia="宋体"/>
                 <w:b w:val="0"/>
                 <w:color w:val="000000"/>
                 <w:sz w:val="21"/>
@@ -3464,6 +3521,10 @@
             <w:tcW w:type="dxa" w:w="6633"/>
             <w:vAlign w:val="center"/>
             <w:tcBorders>
+              <w:top w:val="single" w:sz="4" w:color="D9D9D9"/>
+              <w:left w:val="single" w:sz="4" w:color="D9D9D9"/>
+              <w:bottom w:val="single" w:sz="4" w:color="D9D9D9"/>
+              <w:right w:val="single" w:sz="4" w:color="D9D9D9"/>
               <w:top w:val="single" w:sz="4" w:color="D9D9D9"/>
               <w:left w:val="single" w:sz="4" w:color="D9D9D9"/>
               <w:bottom w:val="single" w:sz="4" w:color="D9D9D9"/>
@@ -3478,11 +3539,11 @@
           </w:tcPr>
           <w:p>
             <w:pPr>
-              <w:spacing w:after="40" w:line="264" w:lineRule="auto"/>
-            </w:pPr>
-            <w:r>
-              <w:rPr>
-                <w:rFonts w:ascii="宋体" w:hAnsi="宋体" w:eastAsia="宋体"/>
+              <w:spacing w:after="40" w:line="288" w:lineRule="auto" w:before="40"/>
+            </w:pPr>
+            <w:r>
+              <w:rPr>
+                <w:rFonts w:ascii="Times New Roman" w:hAnsi="Times New Roman" w:eastAsia="宋体"/>
                 <w:b w:val="0"/>
                 <w:color w:val="000000"/>
                 <w:sz w:val="21"/>
@@ -3493,11 +3554,16 @@
         </w:tc>
       </w:tr>
       <w:tr>
+        <w:trPr/>
         <w:tc>
           <w:tcPr>
             <w:tcW w:type="dxa" w:w="2551"/>
             <w:vAlign w:val="center"/>
             <w:tcBorders>
+              <w:top w:val="single" w:sz="4" w:color="D9D9D9"/>
+              <w:left w:val="single" w:sz="4" w:color="D9D9D9"/>
+              <w:bottom w:val="single" w:sz="4" w:color="D9D9D9"/>
+              <w:right w:val="single" w:sz="4" w:color="D9D9D9"/>
               <w:top w:val="single" w:sz="4" w:color="D9D9D9"/>
               <w:left w:val="single" w:sz="4" w:color="D9D9D9"/>
               <w:bottom w:val="single" w:sz="4" w:color="D9D9D9"/>
@@ -3512,11 +3578,11 @@
           </w:tcPr>
           <w:p>
             <w:pPr>
-              <w:spacing w:after="40" w:line="264" w:lineRule="auto"/>
-            </w:pPr>
-            <w:r>
-              <w:rPr>
-                <w:rFonts w:ascii="宋体" w:hAnsi="宋体" w:eastAsia="宋体"/>
+              <w:spacing w:after="40" w:line="288" w:lineRule="auto" w:before="40"/>
+            </w:pPr>
+            <w:r>
+              <w:rPr>
+                <w:rFonts w:ascii="Times New Roman" w:hAnsi="Times New Roman" w:eastAsia="宋体"/>
                 <w:b w:val="0"/>
                 <w:color w:val="000000"/>
                 <w:sz w:val="21"/>
@@ -3530,6 +3596,10 @@
             <w:tcW w:type="dxa" w:w="6633"/>
             <w:vAlign w:val="center"/>
             <w:tcBorders>
+              <w:top w:val="single" w:sz="4" w:color="D9D9D9"/>
+              <w:left w:val="single" w:sz="4" w:color="D9D9D9"/>
+              <w:bottom w:val="single" w:sz="4" w:color="D9D9D9"/>
+              <w:right w:val="single" w:sz="4" w:color="D9D9D9"/>
               <w:top w:val="single" w:sz="4" w:color="D9D9D9"/>
               <w:left w:val="single" w:sz="4" w:color="D9D9D9"/>
               <w:bottom w:val="single" w:sz="4" w:color="D9D9D9"/>
@@ -3544,11 +3614,11 @@
           </w:tcPr>
           <w:p>
             <w:pPr>
-              <w:spacing w:after="40" w:line="264" w:lineRule="auto"/>
-            </w:pPr>
-            <w:r>
-              <w:rPr>
-                <w:rFonts w:ascii="宋体" w:hAnsi="宋体" w:eastAsia="宋体"/>
+              <w:spacing w:after="40" w:line="288" w:lineRule="auto" w:before="40"/>
+            </w:pPr>
+            <w:r>
+              <w:rPr>
+                <w:rFonts w:ascii="Times New Roman" w:hAnsi="Times New Roman" w:eastAsia="宋体"/>
                 <w:b w:val="0"/>
                 <w:color w:val="000000"/>
                 <w:sz w:val="21"/>
@@ -3559,11 +3629,16 @@
         </w:tc>
       </w:tr>
       <w:tr>
+        <w:trPr/>
         <w:tc>
           <w:tcPr>
             <w:tcW w:type="dxa" w:w="2551"/>
             <w:vAlign w:val="center"/>
             <w:tcBorders>
+              <w:top w:val="single" w:sz="4" w:color="D9D9D9"/>
+              <w:left w:val="single" w:sz="4" w:color="D9D9D9"/>
+              <w:bottom w:val="single" w:sz="4" w:color="D9D9D9"/>
+              <w:right w:val="single" w:sz="4" w:color="D9D9D9"/>
               <w:top w:val="single" w:sz="4" w:color="D9D9D9"/>
               <w:left w:val="single" w:sz="4" w:color="D9D9D9"/>
               <w:bottom w:val="single" w:sz="4" w:color="D9D9D9"/>
@@ -3578,11 +3653,11 @@
           </w:tcPr>
           <w:p>
             <w:pPr>
-              <w:spacing w:after="40" w:line="264" w:lineRule="auto"/>
-            </w:pPr>
-            <w:r>
-              <w:rPr>
-                <w:rFonts w:ascii="宋体" w:hAnsi="宋体" w:eastAsia="宋体"/>
+              <w:spacing w:after="40" w:line="288" w:lineRule="auto" w:before="40"/>
+            </w:pPr>
+            <w:r>
+              <w:rPr>
+                <w:rFonts w:ascii="Times New Roman" w:hAnsi="Times New Roman" w:eastAsia="宋体"/>
                 <w:b w:val="0"/>
                 <w:color w:val="000000"/>
                 <w:sz w:val="21"/>
@@ -3596,6 +3671,10 @@
             <w:tcW w:type="dxa" w:w="6633"/>
             <w:vAlign w:val="center"/>
             <w:tcBorders>
+              <w:top w:val="single" w:sz="4" w:color="D9D9D9"/>
+              <w:left w:val="single" w:sz="4" w:color="D9D9D9"/>
+              <w:bottom w:val="single" w:sz="4" w:color="D9D9D9"/>
+              <w:right w:val="single" w:sz="4" w:color="D9D9D9"/>
               <w:top w:val="single" w:sz="4" w:color="D9D9D9"/>
               <w:left w:val="single" w:sz="4" w:color="D9D9D9"/>
               <w:bottom w:val="single" w:sz="4" w:color="D9D9D9"/>
@@ -3610,11 +3689,11 @@
           </w:tcPr>
           <w:p>
             <w:pPr>
-              <w:spacing w:after="40" w:line="264" w:lineRule="auto"/>
-            </w:pPr>
-            <w:r>
-              <w:rPr>
-                <w:rFonts w:ascii="宋体" w:hAnsi="宋体" w:eastAsia="宋体"/>
+              <w:spacing w:after="40" w:line="288" w:lineRule="auto" w:before="40"/>
+            </w:pPr>
+            <w:r>
+              <w:rPr>
+                <w:rFonts w:ascii="Times New Roman" w:hAnsi="Times New Roman" w:eastAsia="宋体"/>
                 <w:b w:val="0"/>
                 <w:color w:val="000000"/>
                 <w:sz w:val="21"/>
@@ -3625,11 +3704,16 @@
         </w:tc>
       </w:tr>
       <w:tr>
+        <w:trPr/>
         <w:tc>
           <w:tcPr>
             <w:tcW w:type="dxa" w:w="2551"/>
             <w:vAlign w:val="center"/>
             <w:tcBorders>
+              <w:top w:val="single" w:sz="4" w:color="D9D9D9"/>
+              <w:left w:val="single" w:sz="4" w:color="D9D9D9"/>
+              <w:bottom w:val="single" w:sz="4" w:color="D9D9D9"/>
+              <w:right w:val="single" w:sz="4" w:color="D9D9D9"/>
               <w:top w:val="single" w:sz="4" w:color="D9D9D9"/>
               <w:left w:val="single" w:sz="4" w:color="D9D9D9"/>
               <w:bottom w:val="single" w:sz="4" w:color="D9D9D9"/>
@@ -3644,11 +3728,11 @@
           </w:tcPr>
           <w:p>
             <w:pPr>
-              <w:spacing w:after="40" w:line="264" w:lineRule="auto"/>
-            </w:pPr>
-            <w:r>
-              <w:rPr>
-                <w:rFonts w:ascii="宋体" w:hAnsi="宋体" w:eastAsia="宋体"/>
+              <w:spacing w:after="40" w:line="288" w:lineRule="auto" w:before="40"/>
+            </w:pPr>
+            <w:r>
+              <w:rPr>
+                <w:rFonts w:ascii="Times New Roman" w:hAnsi="Times New Roman" w:eastAsia="宋体"/>
                 <w:b w:val="0"/>
                 <w:color w:val="000000"/>
                 <w:sz w:val="21"/>
@@ -3662,6 +3746,10 @@
             <w:tcW w:type="dxa" w:w="6633"/>
             <w:vAlign w:val="center"/>
             <w:tcBorders>
+              <w:top w:val="single" w:sz="4" w:color="D9D9D9"/>
+              <w:left w:val="single" w:sz="4" w:color="D9D9D9"/>
+              <w:bottom w:val="single" w:sz="4" w:color="D9D9D9"/>
+              <w:right w:val="single" w:sz="4" w:color="D9D9D9"/>
               <w:top w:val="single" w:sz="4" w:color="D9D9D9"/>
               <w:left w:val="single" w:sz="4" w:color="D9D9D9"/>
               <w:bottom w:val="single" w:sz="4" w:color="D9D9D9"/>
@@ -3676,11 +3764,11 @@
           </w:tcPr>
           <w:p>
             <w:pPr>
-              <w:spacing w:after="40" w:line="264" w:lineRule="auto"/>
-            </w:pPr>
-            <w:r>
-              <w:rPr>
-                <w:rFonts w:ascii="宋体" w:hAnsi="宋体" w:eastAsia="宋体"/>
+              <w:spacing w:after="40" w:line="288" w:lineRule="auto" w:before="40"/>
+            </w:pPr>
+            <w:r>
+              <w:rPr>
+                <w:rFonts w:ascii="Times New Roman" w:hAnsi="Times New Roman" w:eastAsia="宋体"/>
                 <w:b w:val="0"/>
                 <w:color w:val="000000"/>
                 <w:sz w:val="21"/>
@@ -3691,11 +3779,16 @@
         </w:tc>
       </w:tr>
       <w:tr>
+        <w:trPr/>
         <w:tc>
           <w:tcPr>
             <w:tcW w:type="dxa" w:w="2551"/>
             <w:vAlign w:val="center"/>
             <w:tcBorders>
+              <w:top w:val="single" w:sz="4" w:color="D9D9D9"/>
+              <w:left w:val="single" w:sz="4" w:color="D9D9D9"/>
+              <w:bottom w:val="single" w:sz="4" w:color="D9D9D9"/>
+              <w:right w:val="single" w:sz="4" w:color="D9D9D9"/>
               <w:top w:val="single" w:sz="4" w:color="D9D9D9"/>
               <w:left w:val="single" w:sz="4" w:color="D9D9D9"/>
               <w:bottom w:val="single" w:sz="4" w:color="D9D9D9"/>
@@ -3710,11 +3803,11 @@
           </w:tcPr>
           <w:p>
             <w:pPr>
-              <w:spacing w:after="40" w:line="264" w:lineRule="auto"/>
-            </w:pPr>
-            <w:r>
-              <w:rPr>
-                <w:rFonts w:ascii="宋体" w:hAnsi="宋体" w:eastAsia="宋体"/>
+              <w:spacing w:after="40" w:line="288" w:lineRule="auto" w:before="40"/>
+            </w:pPr>
+            <w:r>
+              <w:rPr>
+                <w:rFonts w:ascii="Times New Roman" w:hAnsi="Times New Roman" w:eastAsia="宋体"/>
                 <w:b w:val="0"/>
                 <w:color w:val="000000"/>
                 <w:sz w:val="21"/>
@@ -3728,6 +3821,10 @@
             <w:tcW w:type="dxa" w:w="6633"/>
             <w:vAlign w:val="center"/>
             <w:tcBorders>
+              <w:top w:val="single" w:sz="4" w:color="D9D9D9"/>
+              <w:left w:val="single" w:sz="4" w:color="D9D9D9"/>
+              <w:bottom w:val="single" w:sz="4" w:color="D9D9D9"/>
+              <w:right w:val="single" w:sz="4" w:color="D9D9D9"/>
               <w:top w:val="single" w:sz="4" w:color="D9D9D9"/>
               <w:left w:val="single" w:sz="4" w:color="D9D9D9"/>
               <w:bottom w:val="single" w:sz="4" w:color="D9D9D9"/>
@@ -3742,11 +3839,11 @@
           </w:tcPr>
           <w:p>
             <w:pPr>
-              <w:spacing w:after="40" w:line="264" w:lineRule="auto"/>
-            </w:pPr>
-            <w:r>
-              <w:rPr>
-                <w:rFonts w:ascii="宋体" w:hAnsi="宋体" w:eastAsia="宋体"/>
+              <w:spacing w:after="40" w:line="288" w:lineRule="auto" w:before="40"/>
+            </w:pPr>
+            <w:r>
+              <w:rPr>
+                <w:rFonts w:ascii="Times New Roman" w:hAnsi="Times New Roman" w:eastAsia="宋体"/>
                 <w:b w:val="0"/>
                 <w:color w:val="000000"/>
                 <w:sz w:val="21"/>
@@ -3757,11 +3854,16 @@
         </w:tc>
       </w:tr>
       <w:tr>
+        <w:trPr/>
         <w:tc>
           <w:tcPr>
             <w:tcW w:type="dxa" w:w="2551"/>
             <w:vAlign w:val="center"/>
             <w:tcBorders>
+              <w:top w:val="single" w:sz="4" w:color="D9D9D9"/>
+              <w:left w:val="single" w:sz="4" w:color="D9D9D9"/>
+              <w:bottom w:val="single" w:sz="4" w:color="D9D9D9"/>
+              <w:right w:val="single" w:sz="4" w:color="D9D9D9"/>
               <w:top w:val="single" w:sz="4" w:color="D9D9D9"/>
               <w:left w:val="single" w:sz="4" w:color="D9D9D9"/>
               <w:bottom w:val="single" w:sz="4" w:color="D9D9D9"/>
@@ -3776,11 +3878,11 @@
           </w:tcPr>
           <w:p>
             <w:pPr>
-              <w:spacing w:after="40" w:line="264" w:lineRule="auto"/>
-            </w:pPr>
-            <w:r>
-              <w:rPr>
-                <w:rFonts w:ascii="宋体" w:hAnsi="宋体" w:eastAsia="宋体"/>
+              <w:spacing w:after="40" w:line="288" w:lineRule="auto" w:before="40"/>
+            </w:pPr>
+            <w:r>
+              <w:rPr>
+                <w:rFonts w:ascii="Times New Roman" w:hAnsi="Times New Roman" w:eastAsia="宋体"/>
                 <w:b w:val="0"/>
                 <w:color w:val="000000"/>
                 <w:sz w:val="21"/>
@@ -3794,6 +3896,10 @@
             <w:tcW w:type="dxa" w:w="6633"/>
             <w:vAlign w:val="center"/>
             <w:tcBorders>
+              <w:top w:val="single" w:sz="4" w:color="D9D9D9"/>
+              <w:left w:val="single" w:sz="4" w:color="D9D9D9"/>
+              <w:bottom w:val="single" w:sz="4" w:color="D9D9D9"/>
+              <w:right w:val="single" w:sz="4" w:color="D9D9D9"/>
               <w:top w:val="single" w:sz="4" w:color="D9D9D9"/>
               <w:left w:val="single" w:sz="4" w:color="D9D9D9"/>
               <w:bottom w:val="single" w:sz="4" w:color="D9D9D9"/>
@@ -3808,11 +3914,11 @@
           </w:tcPr>
           <w:p>
             <w:pPr>
-              <w:spacing w:after="40" w:line="264" w:lineRule="auto"/>
-            </w:pPr>
-            <w:r>
-              <w:rPr>
-                <w:rFonts w:ascii="宋体" w:hAnsi="宋体" w:eastAsia="宋体"/>
+              <w:spacing w:after="40" w:line="288" w:lineRule="auto" w:before="40"/>
+            </w:pPr>
+            <w:r>
+              <w:rPr>
+                <w:rFonts w:ascii="Times New Roman" w:hAnsi="Times New Roman" w:eastAsia="宋体"/>
                 <w:b w:val="0"/>
                 <w:color w:val="000000"/>
                 <w:sz w:val="21"/>
@@ -3823,11 +3929,16 @@
         </w:tc>
       </w:tr>
       <w:tr>
+        <w:trPr/>
         <w:tc>
           <w:tcPr>
             <w:tcW w:type="dxa" w:w="2551"/>
             <w:vAlign w:val="center"/>
             <w:tcBorders>
+              <w:top w:val="single" w:sz="4" w:color="D9D9D9"/>
+              <w:left w:val="single" w:sz="4" w:color="D9D9D9"/>
+              <w:bottom w:val="single" w:sz="4" w:color="D9D9D9"/>
+              <w:right w:val="single" w:sz="4" w:color="D9D9D9"/>
               <w:top w:val="single" w:sz="4" w:color="D9D9D9"/>
               <w:left w:val="single" w:sz="4" w:color="D9D9D9"/>
               <w:bottom w:val="single" w:sz="4" w:color="D9D9D9"/>
@@ -3842,11 +3953,11 @@
           </w:tcPr>
           <w:p>
             <w:pPr>
-              <w:spacing w:after="40" w:line="264" w:lineRule="auto"/>
-            </w:pPr>
-            <w:r>
-              <w:rPr>
-                <w:rFonts w:ascii="宋体" w:hAnsi="宋体" w:eastAsia="宋体"/>
+              <w:spacing w:after="40" w:line="288" w:lineRule="auto" w:before="40"/>
+            </w:pPr>
+            <w:r>
+              <w:rPr>
+                <w:rFonts w:ascii="Times New Roman" w:hAnsi="Times New Roman" w:eastAsia="宋体"/>
                 <w:b w:val="0"/>
                 <w:color w:val="000000"/>
                 <w:sz w:val="21"/>
@@ -3860,6 +3971,10 @@
             <w:tcW w:type="dxa" w:w="6633"/>
             <w:vAlign w:val="center"/>
             <w:tcBorders>
+              <w:top w:val="single" w:sz="4" w:color="D9D9D9"/>
+              <w:left w:val="single" w:sz="4" w:color="D9D9D9"/>
+              <w:bottom w:val="single" w:sz="4" w:color="D9D9D9"/>
+              <w:right w:val="single" w:sz="4" w:color="D9D9D9"/>
               <w:top w:val="single" w:sz="4" w:color="D9D9D9"/>
               <w:left w:val="single" w:sz="4" w:color="D9D9D9"/>
               <w:bottom w:val="single" w:sz="4" w:color="D9D9D9"/>
@@ -3874,11 +3989,11 @@
           </w:tcPr>
           <w:p>
             <w:pPr>
-              <w:spacing w:after="40" w:line="264" w:lineRule="auto"/>
-            </w:pPr>
-            <w:r>
-              <w:rPr>
-                <w:rFonts w:ascii="宋体" w:hAnsi="宋体" w:eastAsia="宋体"/>
+              <w:spacing w:after="40" w:line="288" w:lineRule="auto" w:before="40"/>
+            </w:pPr>
+            <w:r>
+              <w:rPr>
+                <w:rFonts w:ascii="Times New Roman" w:hAnsi="Times New Roman" w:eastAsia="宋体"/>
                 <w:b w:val="0"/>
                 <w:color w:val="000000"/>
                 <w:sz w:val="21"/>
@@ -3889,11 +4004,16 @@
         </w:tc>
       </w:tr>
       <w:tr>
+        <w:trPr/>
         <w:tc>
           <w:tcPr>
             <w:tcW w:type="dxa" w:w="2551"/>
             <w:vAlign w:val="center"/>
             <w:tcBorders>
+              <w:top w:val="single" w:sz="4" w:color="D9D9D9"/>
+              <w:left w:val="single" w:sz="4" w:color="D9D9D9"/>
+              <w:bottom w:val="single" w:sz="4" w:color="D9D9D9"/>
+              <w:right w:val="single" w:sz="4" w:color="D9D9D9"/>
               <w:top w:val="single" w:sz="4" w:color="D9D9D9"/>
               <w:left w:val="single" w:sz="4" w:color="D9D9D9"/>
               <w:bottom w:val="single" w:sz="4" w:color="D9D9D9"/>
@@ -3908,11 +4028,11 @@
           </w:tcPr>
           <w:p>
             <w:pPr>
-              <w:spacing w:after="40" w:line="264" w:lineRule="auto"/>
-            </w:pPr>
-            <w:r>
-              <w:rPr>
-                <w:rFonts w:ascii="宋体" w:hAnsi="宋体" w:eastAsia="宋体"/>
+              <w:spacing w:after="40" w:line="288" w:lineRule="auto" w:before="40"/>
+            </w:pPr>
+            <w:r>
+              <w:rPr>
+                <w:rFonts w:ascii="Times New Roman" w:hAnsi="Times New Roman" w:eastAsia="宋体"/>
                 <w:b w:val="0"/>
                 <w:color w:val="000000"/>
                 <w:sz w:val="21"/>
@@ -3926,6 +4046,10 @@
             <w:tcW w:type="dxa" w:w="6633"/>
             <w:vAlign w:val="center"/>
             <w:tcBorders>
+              <w:top w:val="single" w:sz="4" w:color="D9D9D9"/>
+              <w:left w:val="single" w:sz="4" w:color="D9D9D9"/>
+              <w:bottom w:val="single" w:sz="4" w:color="D9D9D9"/>
+              <w:right w:val="single" w:sz="4" w:color="D9D9D9"/>
               <w:top w:val="single" w:sz="4" w:color="D9D9D9"/>
               <w:left w:val="single" w:sz="4" w:color="D9D9D9"/>
               <w:bottom w:val="single" w:sz="4" w:color="D9D9D9"/>
@@ -3940,11 +4064,11 @@
           </w:tcPr>
           <w:p>
             <w:pPr>
-              <w:spacing w:after="40" w:line="264" w:lineRule="auto"/>
-            </w:pPr>
-            <w:r>
-              <w:rPr>
-                <w:rFonts w:ascii="宋体" w:hAnsi="宋体" w:eastAsia="宋体"/>
+              <w:spacing w:after="40" w:line="288" w:lineRule="auto" w:before="40"/>
+            </w:pPr>
+            <w:r>
+              <w:rPr>
+                <w:rFonts w:ascii="Times New Roman" w:hAnsi="Times New Roman" w:eastAsia="宋体"/>
                 <w:b w:val="0"/>
                 <w:color w:val="000000"/>
                 <w:sz w:val="21"/>
@@ -3954,15 +4078,67 @@
           </w:p>
         </w:tc>
       </w:tr>
+      <w:tr>
+        <w:trPr/>
+        <w:tc>
+          <w:tcPr>
+            <w:tcW w:type="dxa" w:w="2551"/>
+            <w:tcBorders>
+              <w:top w:val="single" w:sz="4" w:color="D9D9D9"/>
+              <w:left w:val="single" w:sz="4" w:color="D9D9D9"/>
+              <w:bottom w:val="single" w:sz="4" w:color="D9D9D9"/>
+              <w:right w:val="single" w:sz="4" w:color="D9D9D9"/>
+            </w:tcBorders>
+          </w:tcPr>
+          <w:p>
+            <w:pPr>
+              <w:spacing w:line="288" w:lineRule="auto" w:after="40" w:before="40"/>
+            </w:pPr>
+            <w:r>
+              <w:rPr>
+                <w:rFonts w:ascii="Times New Roman" w:hAnsi="Times New Roman" w:eastAsia="宋体"/>
+                <w:b w:val="0"/>
+                <w:color w:val="000000"/>
+                <w:sz w:val="21"/>
+              </w:rPr>
+              <w:t>非法选票组合局限</w:t>
+            </w:r>
+          </w:p>
+        </w:tc>
+        <w:tc>
+          <w:tcPr>
+            <w:tcW w:type="dxa" w:w="6633"/>
+            <w:tcBorders>
+              <w:top w:val="single" w:sz="4" w:color="D9D9D9"/>
+              <w:left w:val="single" w:sz="4" w:color="D9D9D9"/>
+              <w:bottom w:val="single" w:sz="4" w:color="D9D9D9"/>
+              <w:right w:val="single" w:sz="4" w:color="D9D9D9"/>
+            </w:tcBorders>
+          </w:tcPr>
+          <w:p>
+            <w:pPr>
+              <w:spacing w:line="288" w:lineRule="auto" w:after="40" w:before="40"/>
+            </w:pPr>
+            <w:r>
+              <w:rPr>
+                <w:rFonts w:ascii="Times New Roman" w:hAnsi="Times New Roman" w:eastAsia="宋体"/>
+                <w:b w:val="0"/>
+                <w:color w:val="000000"/>
+                <w:sz w:val="21"/>
+              </w:rPr>
+              <w:t>两个非独热向量仍可形成满足约束的汇总；需零知识证明</w:t>
+            </w:r>
+          </w:p>
+        </w:tc>
+      </w:tr>
     </w:tbl>
     <w:p>
       <w:pPr>
-        <w:keepNext/>
-        <w:spacing w:line="300" w:lineRule="auto" w:after="100"/>
-      </w:pPr>
-      <w:r>
-        <w:rPr>
-          <w:rFonts w:ascii="宋体" w:hAnsi="宋体" w:eastAsia="宋体"/>
+        <w:pStyle w:val="ReportH2"/>
+      </w:pPr>
+      <w:r>
+        <w:rPr>
+          <w:rFonts w:ascii="Times New Roman" w:hAnsi="Times New Roman" w:eastAsia="宋体"/>
           <w:b/>
           <w:color w:val="000000"/>
           <w:sz w:val="24"/>
@@ -3972,78 +4148,69 @@
     </w:p>
     <w:p>
       <w:pPr>
-        <w:spacing w:line="300" w:lineRule="auto" w:after="120"/>
-        <w:ind w:firstLine="480"/>
-      </w:pPr>
-      <w:r>
-        <w:rPr>
-          <w:rFonts w:ascii="宋体" w:hAnsi="宋体" w:eastAsia="宋体"/>
+        <w:pStyle w:val="ReportBody"/>
+      </w:pPr>
+      <w:r>
+        <w:rPr>
+          <w:rFonts w:ascii="Times New Roman" w:hAnsi="Times New Roman" w:eastAsia="宋体"/>
           <w:b w:val="0"/>
           <w:color w:val="000000"/>
-          <w:sz w:val="22"/>
+          <w:sz w:val="24"/>
         </w:rPr>
         <w:t>失败与边界：越界选项、错误向量维度和非法密文整数被拒绝。完整性校验失败时，界面使用“口令错误或密钥文件损坏”，不会将一次认证失败误判为确定的口令错误。</w:t>
       </w:r>
     </w:p>
     <w:p>
       <w:pPr>
-        <w:spacing w:line="300" w:lineRule="auto" w:after="120"/>
-        <w:ind w:firstLine="480"/>
-      </w:pPr>
-      <w:r>
-        <w:rPr>
-          <w:rFonts w:ascii="宋体" w:hAnsi="宋体" w:eastAsia="宋体"/>
+        <w:pStyle w:val="ReportBody"/>
+      </w:pPr>
+      <w:r>
+        <w:rPr>
+          <w:rFonts w:ascii="Times New Roman" w:hAnsi="Times New Roman" w:eastAsia="宋体"/>
           <w:b w:val="0"/>
           <w:color w:val="000000"/>
-          <w:sz w:val="22"/>
+          <w:sz w:val="24"/>
         </w:rPr>
         <w:t>误报分析：合法用户输入了错误格式的ID，会被名单校验拒绝。这属于输入校验失败，不是攻击检测率。应展示正确的ID格式并允许重新输入，而不是自动放宽身份规则。</w:t>
       </w:r>
     </w:p>
     <w:p>
       <w:pPr>
-        <w:spacing w:line="300" w:lineRule="auto" w:after="120"/>
-        <w:ind w:firstLine="480"/>
-      </w:pPr>
-      <w:r>
-        <w:rPr>
-          <w:rFonts w:ascii="宋体" w:hAnsi="宋体" w:eastAsia="宋体"/>
+        <w:pStyle w:val="ReportBody"/>
+      </w:pPr>
+      <w:r>
+        <w:rPr>
+          <w:rFonts w:ascii="Times New Roman" w:hAnsi="Times New Roman" w:eastAsia="宋体"/>
           <w:b w:val="0"/>
           <w:color w:val="000000"/>
-          <w:sz w:val="22"/>
+          <w:sz w:val="24"/>
         </w:rPr>
         <w:t>安全局限：客户端生成合法独热向量，但接收端没有零知识证明，无法从密文证明每项是0或1且总和为1。总票数约束只能发现部分非法选票，不能代替合法性证明。</w:t>
       </w:r>
     </w:p>
     <w:p>
       <w:pPr>
+        <w:pStyle w:val="ReportH2"/>
+      </w:pPr>
+      <w:r>
+        <w:t>5.3 性能数据与结果分析</w:t>
+      </w:r>
+    </w:p>
+    <w:p>
+      <w:pPr>
+        <w:pStyle w:val="ReportBody"/>
+      </w:pPr>
+      <w:r>
+        <w:t>对10、100、1000名投票者各做3次三选项实验。合成明文使用种子20261026加重复序号，密码学随机数不固定；每次均核对解密计数与预期。表3取本轮JSON中的算术平均值，单位毫秒。</w:t>
+      </w:r>
+    </w:p>
+    <w:p>
+      <w:pPr>
+        <w:pStyle w:val="ReportCaption"/>
         <w:keepNext/>
-        <w:pageBreakBefore/>
-        <w:spacing w:line="300" w:lineRule="auto" w:after="160"/>
-      </w:pPr>
-      <w:r>
-        <w:rPr>
-          <w:rFonts w:ascii="宋体" w:hAnsi="宋体" w:eastAsia="宋体"/>
-          <w:b/>
-          <w:color w:val="000000"/>
-          <w:sz w:val="28"/>
-        </w:rPr>
-        <w:t>性能数据与结果分析</w:t>
-      </w:r>
-    </w:p>
-    <w:p>
-      <w:pPr>
-        <w:spacing w:line="300" w:lineRule="auto" w:after="100"/>
-        <w:ind w:firstLine="480"/>
-      </w:pPr>
-      <w:r>
-        <w:rPr>
-          <w:rFonts w:ascii="宋体" w:hAnsi="宋体" w:eastAsia="宋体"/>
-          <w:b w:val="0"/>
-          <w:color w:val="000000"/>
-          <w:sz w:val="22"/>
-        </w:rPr>
-        <w:t>对10、100、1000名投票者分别进行3次三选项实验。明文选项用固定种子20261026加重复序号生成，使预期总票可复算；密码学随机数保持系统随机。计时使用perf_counter，以下为三次算术平均，单位毫秒。</w:t>
+      </w:pPr>
+      <w:r>
+        <w:t>表3 加密 汇总与解密实测均值</w:t>
       </w:r>
     </w:p>
     <w:tbl>
@@ -4062,12 +4229,17 @@
       <w:tr>
         <w:trPr>
           <w:tblHeader/>
+          <w:tblHeader/>
         </w:trPr>
         <w:tc>
           <w:tcPr>
             <w:tcW w:type="dxa" w:w="1191"/>
             <w:vAlign w:val="center"/>
             <w:tcBorders>
+              <w:top w:val="single" w:sz="4" w:color="D9D9D9"/>
+              <w:left w:val="single" w:sz="4" w:color="D9D9D9"/>
+              <w:bottom w:val="single" w:sz="4" w:color="D9D9D9"/>
+              <w:right w:val="single" w:sz="4" w:color="D9D9D9"/>
               <w:top w:val="single" w:sz="4" w:color="D9D9D9"/>
               <w:left w:val="single" w:sz="4" w:color="D9D9D9"/>
               <w:bottom w:val="single" w:sz="4" w:color="D9D9D9"/>
@@ -4083,11 +4255,12 @@
           </w:tcPr>
           <w:p>
             <w:pPr>
-              <w:spacing w:after="40" w:line="264" w:lineRule="auto"/>
-            </w:pPr>
-            <w:r>
-              <w:rPr>
-                <w:rFonts w:ascii="宋体" w:hAnsi="宋体" w:eastAsia="宋体"/>
+              <w:keepNext/>
+              <w:spacing w:after="40" w:line="288" w:lineRule="auto" w:before="40"/>
+            </w:pPr>
+            <w:r>
+              <w:rPr>
+                <w:rFonts w:ascii="Times New Roman" w:hAnsi="Times New Roman" w:eastAsia="宋体"/>
                 <w:b/>
                 <w:color w:val="000000"/>
                 <w:sz w:val="21"/>
@@ -4101,6 +4274,10 @@
             <w:tcW w:type="dxa" w:w="2665"/>
             <w:vAlign w:val="center"/>
             <w:tcBorders>
+              <w:top w:val="single" w:sz="4" w:color="D9D9D9"/>
+              <w:left w:val="single" w:sz="4" w:color="D9D9D9"/>
+              <w:bottom w:val="single" w:sz="4" w:color="D9D9D9"/>
+              <w:right w:val="single" w:sz="4" w:color="D9D9D9"/>
               <w:top w:val="single" w:sz="4" w:color="D9D9D9"/>
               <w:left w:val="single" w:sz="4" w:color="D9D9D9"/>
               <w:bottom w:val="single" w:sz="4" w:color="D9D9D9"/>
@@ -4116,11 +4293,12 @@
           </w:tcPr>
           <w:p>
             <w:pPr>
-              <w:spacing w:after="40" w:line="264" w:lineRule="auto"/>
-            </w:pPr>
-            <w:r>
-              <w:rPr>
-                <w:rFonts w:ascii="宋体" w:hAnsi="宋体" w:eastAsia="宋体"/>
+              <w:keepNext/>
+              <w:spacing w:after="40" w:line="288" w:lineRule="auto" w:before="40"/>
+            </w:pPr>
+            <w:r>
+              <w:rPr>
+                <w:rFonts w:ascii="Times New Roman" w:hAnsi="Times New Roman" w:eastAsia="宋体"/>
                 <w:b/>
                 <w:color w:val="000000"/>
                 <w:sz w:val="21"/>
@@ -4134,6 +4312,10 @@
             <w:tcW w:type="dxa" w:w="2665"/>
             <w:vAlign w:val="center"/>
             <w:tcBorders>
+              <w:top w:val="single" w:sz="4" w:color="D9D9D9"/>
+              <w:left w:val="single" w:sz="4" w:color="D9D9D9"/>
+              <w:bottom w:val="single" w:sz="4" w:color="D9D9D9"/>
+              <w:right w:val="single" w:sz="4" w:color="D9D9D9"/>
               <w:top w:val="single" w:sz="4" w:color="D9D9D9"/>
               <w:left w:val="single" w:sz="4" w:color="D9D9D9"/>
               <w:bottom w:val="single" w:sz="4" w:color="D9D9D9"/>
@@ -4149,11 +4331,12 @@
           </w:tcPr>
           <w:p>
             <w:pPr>
-              <w:spacing w:after="40" w:line="264" w:lineRule="auto"/>
-            </w:pPr>
-            <w:r>
-              <w:rPr>
-                <w:rFonts w:ascii="宋体" w:hAnsi="宋体" w:eastAsia="宋体"/>
+              <w:keepNext/>
+              <w:spacing w:after="40" w:line="288" w:lineRule="auto" w:before="40"/>
+            </w:pPr>
+            <w:r>
+              <w:rPr>
+                <w:rFonts w:ascii="Times New Roman" w:hAnsi="Times New Roman" w:eastAsia="宋体"/>
                 <w:b/>
                 <w:color w:val="000000"/>
                 <w:sz w:val="21"/>
@@ -4167,6 +4350,10 @@
             <w:tcW w:type="dxa" w:w="2665"/>
             <w:vAlign w:val="center"/>
             <w:tcBorders>
+              <w:top w:val="single" w:sz="4" w:color="D9D9D9"/>
+              <w:left w:val="single" w:sz="4" w:color="D9D9D9"/>
+              <w:bottom w:val="single" w:sz="4" w:color="D9D9D9"/>
+              <w:right w:val="single" w:sz="4" w:color="D9D9D9"/>
               <w:top w:val="single" w:sz="4" w:color="D9D9D9"/>
               <w:left w:val="single" w:sz="4" w:color="D9D9D9"/>
               <w:bottom w:val="single" w:sz="4" w:color="D9D9D9"/>
@@ -4182,11 +4369,12 @@
           </w:tcPr>
           <w:p>
             <w:pPr>
-              <w:spacing w:after="40" w:line="264" w:lineRule="auto"/>
-            </w:pPr>
-            <w:r>
-              <w:rPr>
-                <w:rFonts w:ascii="宋体" w:hAnsi="宋体" w:eastAsia="宋体"/>
+              <w:keepNext/>
+              <w:spacing w:after="40" w:line="288" w:lineRule="auto" w:before="40"/>
+            </w:pPr>
+            <w:r>
+              <w:rPr>
+                <w:rFonts w:ascii="Times New Roman" w:hAnsi="Times New Roman" w:eastAsia="宋体"/>
                 <w:b/>
                 <w:color w:val="000000"/>
                 <w:sz w:val="21"/>
@@ -4197,11 +4385,16 @@
         </w:tc>
       </w:tr>
       <w:tr>
+        <w:trPr/>
         <w:tc>
           <w:tcPr>
             <w:tcW w:type="dxa" w:w="1191"/>
             <w:vAlign w:val="center"/>
             <w:tcBorders>
+              <w:top w:val="single" w:sz="4" w:color="D9D9D9"/>
+              <w:left w:val="single" w:sz="4" w:color="D9D9D9"/>
+              <w:bottom w:val="single" w:sz="4" w:color="D9D9D9"/>
+              <w:right w:val="single" w:sz="4" w:color="D9D9D9"/>
               <w:top w:val="single" w:sz="4" w:color="D9D9D9"/>
               <w:left w:val="single" w:sz="4" w:color="D9D9D9"/>
               <w:bottom w:val="single" w:sz="4" w:color="D9D9D9"/>
@@ -4216,11 +4409,12 @@
           </w:tcPr>
           <w:p>
             <w:pPr>
-              <w:spacing w:after="40" w:line="264" w:lineRule="auto"/>
-            </w:pPr>
-            <w:r>
-              <w:rPr>
-                <w:rFonts w:ascii="宋体" w:hAnsi="宋体" w:eastAsia="宋体"/>
+              <w:keepNext/>
+              <w:spacing w:line="288" w:lineRule="auto" w:after="40" w:before="40"/>
+            </w:pPr>
+            <w:r>
+              <w:rPr>
+                <w:rFonts w:ascii="Times New Roman" w:hAnsi="Times New Roman" w:eastAsia="宋体"/>
                 <w:b w:val="0"/>
                 <w:color w:val="000000"/>
                 <w:sz w:val="21"/>
@@ -4234,6 +4428,10 @@
             <w:tcW w:type="dxa" w:w="2665"/>
             <w:vAlign w:val="center"/>
             <w:tcBorders>
+              <w:top w:val="single" w:sz="4" w:color="D9D9D9"/>
+              <w:left w:val="single" w:sz="4" w:color="D9D9D9"/>
+              <w:bottom w:val="single" w:sz="4" w:color="D9D9D9"/>
+              <w:right w:val="single" w:sz="4" w:color="D9D9D9"/>
               <w:top w:val="single" w:sz="4" w:color="D9D9D9"/>
               <w:left w:val="single" w:sz="4" w:color="D9D9D9"/>
               <w:bottom w:val="single" w:sz="4" w:color="D9D9D9"/>
@@ -4248,16 +4446,17 @@
           </w:tcPr>
           <w:p>
             <w:pPr>
-              <w:spacing w:after="40" w:line="264" w:lineRule="auto"/>
-            </w:pPr>
-            <w:r>
-              <w:rPr>
-                <w:rFonts w:ascii="宋体" w:hAnsi="宋体" w:eastAsia="宋体"/>
+              <w:keepNext/>
+              <w:spacing w:line="288" w:lineRule="auto" w:after="40" w:before="40"/>
+            </w:pPr>
+            <w:r>
+              <w:rPr>
+                <w:rFonts w:ascii="Times New Roman" w:hAnsi="Times New Roman" w:eastAsia="宋体"/>
                 <w:b w:val="0"/>
                 <w:color w:val="000000"/>
                 <w:sz w:val="21"/>
               </w:rPr>
-              <w:t>230.19</w:t>
+              <w:t>538.06</w:t>
             </w:r>
           </w:p>
         </w:tc>
@@ -4266,6 +4465,10 @@
             <w:tcW w:type="dxa" w:w="2665"/>
             <w:vAlign w:val="center"/>
             <w:tcBorders>
+              <w:top w:val="single" w:sz="4" w:color="D9D9D9"/>
+              <w:left w:val="single" w:sz="4" w:color="D9D9D9"/>
+              <w:bottom w:val="single" w:sz="4" w:color="D9D9D9"/>
+              <w:right w:val="single" w:sz="4" w:color="D9D9D9"/>
               <w:top w:val="single" w:sz="4" w:color="D9D9D9"/>
               <w:left w:val="single" w:sz="4" w:color="D9D9D9"/>
               <w:bottom w:val="single" w:sz="4" w:color="D9D9D9"/>
@@ -4280,16 +4483,17 @@
           </w:tcPr>
           <w:p>
             <w:pPr>
-              <w:spacing w:after="40" w:line="264" w:lineRule="auto"/>
-            </w:pPr>
-            <w:r>
-              <w:rPr>
-                <w:rFonts w:ascii="宋体" w:hAnsi="宋体" w:eastAsia="宋体"/>
+              <w:keepNext/>
+              <w:spacing w:line="288" w:lineRule="auto" w:after="40" w:before="40"/>
+            </w:pPr>
+            <w:r>
+              <w:rPr>
+                <w:rFonts w:ascii="Times New Roman" w:hAnsi="Times New Roman" w:eastAsia="宋体"/>
                 <w:b w:val="0"/>
                 <w:color w:val="000000"/>
                 <w:sz w:val="21"/>
               </w:rPr>
-              <w:t>0.84</w:t>
+              <w:t>1.21</w:t>
             </w:r>
           </w:p>
         </w:tc>
@@ -4298,6 +4502,10 @@
             <w:tcW w:type="dxa" w:w="2665"/>
             <w:vAlign w:val="center"/>
             <w:tcBorders>
+              <w:top w:val="single" w:sz="4" w:color="D9D9D9"/>
+              <w:left w:val="single" w:sz="4" w:color="D9D9D9"/>
+              <w:bottom w:val="single" w:sz="4" w:color="D9D9D9"/>
+              <w:right w:val="single" w:sz="4" w:color="D9D9D9"/>
               <w:top w:val="single" w:sz="4" w:color="D9D9D9"/>
               <w:left w:val="single" w:sz="4" w:color="D9D9D9"/>
               <w:bottom w:val="single" w:sz="4" w:color="D9D9D9"/>
@@ -4312,26 +4520,32 @@
           </w:tcPr>
           <w:p>
             <w:pPr>
-              <w:spacing w:after="40" w:line="264" w:lineRule="auto"/>
-            </w:pPr>
-            <w:r>
-              <w:rPr>
-                <w:rFonts w:ascii="宋体" w:hAnsi="宋体" w:eastAsia="宋体"/>
+              <w:keepNext/>
+              <w:spacing w:line="288" w:lineRule="auto" w:after="40" w:before="40"/>
+            </w:pPr>
+            <w:r>
+              <w:rPr>
+                <w:rFonts w:ascii="Times New Roman" w:hAnsi="Times New Roman" w:eastAsia="宋体"/>
                 <w:b w:val="0"/>
                 <w:color w:val="000000"/>
                 <w:sz w:val="21"/>
               </w:rPr>
-              <w:t>6.21</w:t>
+              <w:t>16.72</w:t>
             </w:r>
           </w:p>
         </w:tc>
       </w:tr>
       <w:tr>
+        <w:trPr/>
         <w:tc>
           <w:tcPr>
             <w:tcW w:type="dxa" w:w="1191"/>
             <w:vAlign w:val="center"/>
             <w:tcBorders>
+              <w:top w:val="single" w:sz="4" w:color="D9D9D9"/>
+              <w:left w:val="single" w:sz="4" w:color="D9D9D9"/>
+              <w:bottom w:val="single" w:sz="4" w:color="D9D9D9"/>
+              <w:right w:val="single" w:sz="4" w:color="D9D9D9"/>
               <w:top w:val="single" w:sz="4" w:color="D9D9D9"/>
               <w:left w:val="single" w:sz="4" w:color="D9D9D9"/>
               <w:bottom w:val="single" w:sz="4" w:color="D9D9D9"/>
@@ -4346,11 +4560,12 @@
           </w:tcPr>
           <w:p>
             <w:pPr>
-              <w:spacing w:after="40" w:line="264" w:lineRule="auto"/>
-            </w:pPr>
-            <w:r>
-              <w:rPr>
-                <w:rFonts w:ascii="宋体" w:hAnsi="宋体" w:eastAsia="宋体"/>
+              <w:keepNext/>
+              <w:spacing w:line="288" w:lineRule="auto" w:after="40" w:before="40"/>
+            </w:pPr>
+            <w:r>
+              <w:rPr>
+                <w:rFonts w:ascii="Times New Roman" w:hAnsi="Times New Roman" w:eastAsia="宋体"/>
                 <w:b w:val="0"/>
                 <w:color w:val="000000"/>
                 <w:sz w:val="21"/>
@@ -4364,6 +4579,10 @@
             <w:tcW w:type="dxa" w:w="2665"/>
             <w:vAlign w:val="center"/>
             <w:tcBorders>
+              <w:top w:val="single" w:sz="4" w:color="D9D9D9"/>
+              <w:left w:val="single" w:sz="4" w:color="D9D9D9"/>
+              <w:bottom w:val="single" w:sz="4" w:color="D9D9D9"/>
+              <w:right w:val="single" w:sz="4" w:color="D9D9D9"/>
               <w:top w:val="single" w:sz="4" w:color="D9D9D9"/>
               <w:left w:val="single" w:sz="4" w:color="D9D9D9"/>
               <w:bottom w:val="single" w:sz="4" w:color="D9D9D9"/>
@@ -4378,16 +4597,17 @@
           </w:tcPr>
           <w:p>
             <w:pPr>
-              <w:spacing w:after="40" w:line="264" w:lineRule="auto"/>
-            </w:pPr>
-            <w:r>
-              <w:rPr>
-                <w:rFonts w:ascii="宋体" w:hAnsi="宋体" w:eastAsia="宋体"/>
+              <w:keepNext/>
+              <w:spacing w:line="288" w:lineRule="auto" w:after="40" w:before="40"/>
+            </w:pPr>
+            <w:r>
+              <w:rPr>
+                <w:rFonts w:ascii="Times New Roman" w:hAnsi="Times New Roman" w:eastAsia="宋体"/>
                 <w:b w:val="0"/>
                 <w:color w:val="000000"/>
                 <w:sz w:val="21"/>
               </w:rPr>
-              <w:t>2438.30</w:t>
+              <w:t>5345.25</w:t>
             </w:r>
           </w:p>
         </w:tc>
@@ -4396,6 +4616,10 @@
             <w:tcW w:type="dxa" w:w="2665"/>
             <w:vAlign w:val="center"/>
             <w:tcBorders>
+              <w:top w:val="single" w:sz="4" w:color="D9D9D9"/>
+              <w:left w:val="single" w:sz="4" w:color="D9D9D9"/>
+              <w:bottom w:val="single" w:sz="4" w:color="D9D9D9"/>
+              <w:right w:val="single" w:sz="4" w:color="D9D9D9"/>
               <w:top w:val="single" w:sz="4" w:color="D9D9D9"/>
               <w:left w:val="single" w:sz="4" w:color="D9D9D9"/>
               <w:bottom w:val="single" w:sz="4" w:color="D9D9D9"/>
@@ -4410,16 +4634,17 @@
           </w:tcPr>
           <w:p>
             <w:pPr>
-              <w:spacing w:after="40" w:line="264" w:lineRule="auto"/>
-            </w:pPr>
-            <w:r>
-              <w:rPr>
-                <w:rFonts w:ascii="宋体" w:hAnsi="宋体" w:eastAsia="宋体"/>
+              <w:keepNext/>
+              <w:spacing w:line="288" w:lineRule="auto" w:after="40" w:before="40"/>
+            </w:pPr>
+            <w:r>
+              <w:rPr>
+                <w:rFonts w:ascii="Times New Roman" w:hAnsi="Times New Roman" w:eastAsia="宋体"/>
                 <w:b w:val="0"/>
                 <w:color w:val="000000"/>
                 <w:sz w:val="21"/>
               </w:rPr>
-              <w:t>11.11</w:t>
+              <w:t>16.13</w:t>
             </w:r>
           </w:p>
         </w:tc>
@@ -4428,6 +4653,10 @@
             <w:tcW w:type="dxa" w:w="2665"/>
             <w:vAlign w:val="center"/>
             <w:tcBorders>
+              <w:top w:val="single" w:sz="4" w:color="D9D9D9"/>
+              <w:left w:val="single" w:sz="4" w:color="D9D9D9"/>
+              <w:bottom w:val="single" w:sz="4" w:color="D9D9D9"/>
+              <w:right w:val="single" w:sz="4" w:color="D9D9D9"/>
               <w:top w:val="single" w:sz="4" w:color="D9D9D9"/>
               <w:left w:val="single" w:sz="4" w:color="D9D9D9"/>
               <w:bottom w:val="single" w:sz="4" w:color="D9D9D9"/>
@@ -4442,26 +4671,32 @@
           </w:tcPr>
           <w:p>
             <w:pPr>
-              <w:spacing w:after="40" w:line="264" w:lineRule="auto"/>
-            </w:pPr>
-            <w:r>
-              <w:rPr>
-                <w:rFonts w:ascii="宋体" w:hAnsi="宋体" w:eastAsia="宋体"/>
+              <w:keepNext/>
+              <w:spacing w:line="288" w:lineRule="auto" w:after="40" w:before="40"/>
+            </w:pPr>
+            <w:r>
+              <w:rPr>
+                <w:rFonts w:ascii="Times New Roman" w:hAnsi="Times New Roman" w:eastAsia="宋体"/>
                 <w:b w:val="0"/>
                 <w:color w:val="000000"/>
                 <w:sz w:val="21"/>
               </w:rPr>
-              <w:t>7.86</w:t>
+              <w:t>19.20</w:t>
             </w:r>
           </w:p>
         </w:tc>
       </w:tr>
       <w:tr>
+        <w:trPr/>
         <w:tc>
           <w:tcPr>
             <w:tcW w:type="dxa" w:w="1191"/>
             <w:vAlign w:val="center"/>
             <w:tcBorders>
+              <w:top w:val="single" w:sz="4" w:color="D9D9D9"/>
+              <w:left w:val="single" w:sz="4" w:color="D9D9D9"/>
+              <w:bottom w:val="single" w:sz="4" w:color="D9D9D9"/>
+              <w:right w:val="single" w:sz="4" w:color="D9D9D9"/>
               <w:top w:val="single" w:sz="4" w:color="D9D9D9"/>
               <w:left w:val="single" w:sz="4" w:color="D9D9D9"/>
               <w:bottom w:val="single" w:sz="4" w:color="D9D9D9"/>
@@ -4476,11 +4711,12 @@
           </w:tcPr>
           <w:p>
             <w:pPr>
-              <w:spacing w:after="40" w:line="264" w:lineRule="auto"/>
-            </w:pPr>
-            <w:r>
-              <w:rPr>
-                <w:rFonts w:ascii="宋体" w:hAnsi="宋体" w:eastAsia="宋体"/>
+              <w:keepNext w:val="0"/>
+              <w:spacing w:line="288" w:lineRule="auto" w:after="40" w:before="40"/>
+            </w:pPr>
+            <w:r>
+              <w:rPr>
+                <w:rFonts w:ascii="Times New Roman" w:hAnsi="Times New Roman" w:eastAsia="宋体"/>
                 <w:b w:val="0"/>
                 <w:color w:val="000000"/>
                 <w:sz w:val="21"/>
@@ -4494,6 +4730,10 @@
             <w:tcW w:type="dxa" w:w="2665"/>
             <w:vAlign w:val="center"/>
             <w:tcBorders>
+              <w:top w:val="single" w:sz="4" w:color="D9D9D9"/>
+              <w:left w:val="single" w:sz="4" w:color="D9D9D9"/>
+              <w:bottom w:val="single" w:sz="4" w:color="D9D9D9"/>
+              <w:right w:val="single" w:sz="4" w:color="D9D9D9"/>
               <w:top w:val="single" w:sz="4" w:color="D9D9D9"/>
               <w:left w:val="single" w:sz="4" w:color="D9D9D9"/>
               <w:bottom w:val="single" w:sz="4" w:color="D9D9D9"/>
@@ -4508,16 +4748,17 @@
           </w:tcPr>
           <w:p>
             <w:pPr>
-              <w:spacing w:after="40" w:line="264" w:lineRule="auto"/>
-            </w:pPr>
-            <w:r>
-              <w:rPr>
-                <w:rFonts w:ascii="宋体" w:hAnsi="宋体" w:eastAsia="宋体"/>
+              <w:keepNext w:val="0"/>
+              <w:spacing w:line="288" w:lineRule="auto" w:after="40" w:before="40"/>
+            </w:pPr>
+            <w:r>
+              <w:rPr>
+                <w:rFonts w:ascii="Times New Roman" w:hAnsi="Times New Roman" w:eastAsia="宋体"/>
                 <w:b w:val="0"/>
                 <w:color w:val="000000"/>
                 <w:sz w:val="21"/>
               </w:rPr>
-              <w:t>28512.22</w:t>
+              <w:t>46302.62</w:t>
             </w:r>
           </w:p>
         </w:tc>
@@ -4526,6 +4767,10 @@
             <w:tcW w:type="dxa" w:w="2665"/>
             <w:vAlign w:val="center"/>
             <w:tcBorders>
+              <w:top w:val="single" w:sz="4" w:color="D9D9D9"/>
+              <w:left w:val="single" w:sz="4" w:color="D9D9D9"/>
+              <w:bottom w:val="single" w:sz="4" w:color="D9D9D9"/>
+              <w:right w:val="single" w:sz="4" w:color="D9D9D9"/>
               <w:top w:val="single" w:sz="4" w:color="D9D9D9"/>
               <w:left w:val="single" w:sz="4" w:color="D9D9D9"/>
               <w:bottom w:val="single" w:sz="4" w:color="D9D9D9"/>
@@ -4540,16 +4785,17 @@
           </w:tcPr>
           <w:p>
             <w:pPr>
-              <w:spacing w:after="40" w:line="264" w:lineRule="auto"/>
-            </w:pPr>
-            <w:r>
-              <w:rPr>
-                <w:rFonts w:ascii="宋体" w:hAnsi="宋体" w:eastAsia="宋体"/>
+              <w:keepNext w:val="0"/>
+              <w:spacing w:line="288" w:lineRule="auto" w:after="40" w:before="40"/>
+            </w:pPr>
+            <w:r>
+              <w:rPr>
+                <w:rFonts w:ascii="Times New Roman" w:hAnsi="Times New Roman" w:eastAsia="宋体"/>
                 <w:b w:val="0"/>
                 <w:color w:val="000000"/>
                 <w:sz w:val="21"/>
               </w:rPr>
-              <w:t>98.68</w:t>
+              <w:t>110.80</w:t>
             </w:r>
           </w:p>
         </w:tc>
@@ -4558,6 +4804,10 @@
             <w:tcW w:type="dxa" w:w="2665"/>
             <w:vAlign w:val="center"/>
             <w:tcBorders>
+              <w:top w:val="single" w:sz="4" w:color="D9D9D9"/>
+              <w:left w:val="single" w:sz="4" w:color="D9D9D9"/>
+              <w:bottom w:val="single" w:sz="4" w:color="D9D9D9"/>
+              <w:right w:val="single" w:sz="4" w:color="D9D9D9"/>
               <w:top w:val="single" w:sz="4" w:color="D9D9D9"/>
               <w:left w:val="single" w:sz="4" w:color="D9D9D9"/>
               <w:bottom w:val="single" w:sz="4" w:color="D9D9D9"/>
@@ -4572,16 +4822,17 @@
           </w:tcPr>
           <w:p>
             <w:pPr>
-              <w:spacing w:after="40" w:line="264" w:lineRule="auto"/>
-            </w:pPr>
-            <w:r>
-              <w:rPr>
-                <w:rFonts w:ascii="宋体" w:hAnsi="宋体" w:eastAsia="宋体"/>
+              <w:keepNext w:val="0"/>
+              <w:spacing w:line="288" w:lineRule="auto" w:after="40" w:before="40"/>
+            </w:pPr>
+            <w:r>
+              <w:rPr>
+                <w:rFonts w:ascii="Times New Roman" w:hAnsi="Times New Roman" w:eastAsia="宋体"/>
                 <w:b w:val="0"/>
                 <w:color w:val="000000"/>
                 <w:sz w:val="21"/>
               </w:rPr>
-              <w:t>6.47</w:t>
+              <w:t>11.96</w:t>
             </w:r>
           </w:p>
         </w:tc>
@@ -4589,27 +4840,19 @@
     </w:tbl>
     <w:p>
       <w:pPr>
-        <w:spacing w:line="300" w:lineRule="auto" w:after="100"/>
-        <w:ind w:firstLine="480"/>
-      </w:pPr>
-      <w:r>
-        <w:rPr>
-          <w:rFonts w:ascii="宋体" w:hAnsi="宋体" w:eastAsia="宋体"/>
-          <w:b w:val="0"/>
-          <w:color w:val="000000"/>
-          <w:sz w:val="22"/>
-        </w:rPr>
-        <w:t>计时范围仅包含Paillier原语，不包括文件读写、清单签名、口令派生、进程启动和GUI刷新。结果反映本机当时负载，测试期间并非独占计算机；原始三次记录完整保留，不能将均值直接当作部署性能保证。</w:t>
-      </w:r>
-    </w:p>
-    <w:p>
-      <w:pPr>
-        <w:spacing w:line="300" w:lineRule="auto" w:after="100"/>
-        <w:ind w:firstLine="480"/>
-      </w:pPr>
-      <w:r>
-        <w:rPr>
-          <w:rFonts w:ascii="宋体" w:hAnsi="宋体" w:eastAsia="宋体"/>
+        <w:pStyle w:val="ReportBody"/>
+      </w:pPr>
+      <w:r>
+        <w:t>计时仅覆盖Paillier原语，不包括文件、签名、口令派生、进程及GUI；界面耗时则来自当前轮次的实际审计和解密端复算，二者口径不同。测试期间计算机有其他任务，三次原始记录保存在JSON中，均值不能当作部署保证。</w:t>
+      </w:r>
+    </w:p>
+    <w:p>
+      <w:pPr>
+        <w:pStyle w:val="ReportBody"/>
+      </w:pPr>
+      <w:r>
+        <w:rPr>
+          <w:rFonts w:ascii="Times New Roman" w:hAnsi="Times New Roman" w:eastAsia="宋体"/>
           <w:b w:val="0"/>
           <w:color w:val="000000"/>
           <w:sz w:val="24"/>
@@ -4619,297 +4862,268 @@
     </w:p>
     <w:p>
       <w:pPr>
-        <w:keepNext/>
-        <w:spacing w:line="300" w:lineRule="auto" w:after="100"/>
-      </w:pPr>
-      <w:r>
-        <w:rPr>
-          <w:rFonts w:ascii="宋体" w:hAnsi="宋体" w:eastAsia="宋体"/>
+        <w:pStyle w:val="ReportH2"/>
+      </w:pPr>
+      <w:r>
+        <w:t>5.4 准确性与可重复性</w:t>
+      </w:r>
+    </w:p>
+    <w:p>
+      <w:pPr>
+        <w:pStyle w:val="ReportBody"/>
+      </w:pPr>
+      <w:r>
+        <w:t>基准6票序列[0,1,0,2,0,1]得到[3,2,1]；2、4、8选项各投一票均得到全1向量，零票返回全0。原生Qt测试记录在evidence/2026-10-27/ui/，验证6次控件投票、子进程计票和两种审计演示。图2采用本轮实际截图。</w:t>
+      </w:r>
+    </w:p>
+    <w:p>
+      <w:pPr>
+        <w:pStyle w:val="ReportH2"/>
+      </w:pPr>
+      <w:r>
+        <w:t>5.5 本轮发现的问题与处理</w:t>
+      </w:r>
+    </w:p>
+    <w:p>
+      <w:pPr>
+        <w:pStyle w:val="ReportBody"/>
+      </w:pPr>
+      <w:r>
+        <w:t>新增边界实验表明，客户端正确生成独热向量不等于接收端能证明密文合法。两名恶意客户端分别提交[2,0]与[0,0]的加密向量，最终总票为[2,0]，仍满足总和等于两票。处理方法是保留总和检查作为有限检测，明确合法性证明尚未实现，不把它写成“所有非法票都能被发现”。</w:t>
+      </w:r>
+    </w:p>
+    <w:p>
+      <w:pPr>
+        <w:pStyle w:val="ReportH1"/>
+      </w:pPr>
+      <w:r>
+        <w:rPr>
+          <w:rFonts w:ascii="Times New Roman" w:hAnsi="Times New Roman" w:eastAsia="宋体"/>
+          <w:b/>
+          <w:color w:val="000000"/>
+          <w:sz w:val="28"/>
+        </w:rPr>
+        <w:t>六、总结</w:t>
+      </w:r>
+    </w:p>
+    <w:p>
+      <w:pPr>
+        <w:pStyle w:val="ReportBody"/>
+      </w:pPr>
+      <w:r>
+        <w:rPr>
+          <w:rFonts w:ascii="Times New Roman" w:hAnsi="Times New Roman" w:eastAsia="宋体"/>
+          <w:b w:val="0"/>
+          <w:color w:val="000000"/>
+          <w:sz w:val="24"/>
+        </w:rPr>
+        <w:t>本模块完成了从单选输入到随机密文向量的转换，并通过真实测试验证了同态性、随机化和参数边界。后续改进应优先引入独热合法性证明和独立密钥保管，再考虑增加多选票型。</w:t>
+      </w:r>
+    </w:p>
+    <w:p>
+      <w:pPr>
+        <w:pStyle w:val="ReportH2"/>
+      </w:pPr>
+      <w:r>
+        <w:rPr>
+          <w:rFonts w:ascii="Times New Roman" w:hAnsi="Times New Roman" w:eastAsia="宋体"/>
           <w:b/>
           <w:color w:val="000000"/>
           <w:sz w:val="24"/>
         </w:rPr>
-        <w:t>准确性与可重复性</w:t>
-      </w:r>
-    </w:p>
-    <w:p>
-      <w:pPr>
-        <w:spacing w:line="300" w:lineRule="auto" w:after="100"/>
-        <w:ind w:firstLine="480"/>
-      </w:pPr>
-      <w:r>
-        <w:rPr>
-          <w:rFonts w:ascii="宋体" w:hAnsi="宋体" w:eastAsia="宋体"/>
+        <w:t>6.1 安全局限与后续改进</w:t>
+      </w:r>
+    </w:p>
+    <w:p>
+      <w:pPr>
+        <w:pStyle w:val="ReportBody"/>
+      </w:pPr>
+      <w:r>
+        <w:rPr>
+          <w:rFonts w:ascii="Times New Roman" w:hAnsi="Times New Roman" w:eastAsia="宋体"/>
           <w:b w:val="0"/>
           <w:color w:val="000000"/>
-          <w:sz w:val="22"/>
-        </w:rPr>
-        <w:t>基准6票的选择序列为[0,1,0,2,0,1]，实测结果[3,2,1]；四选项实验每项一票，实测[1,1,1,1]。每次性能实验均比较解密结果与合成明文的计数。GUI测试使用实际Qt控件点击，并验证独立子进程返回的结果与审计演示；程序截图不是绘制的效果图。</w:t>
-      </w:r>
-    </w:p>
-    <w:p>
-      <w:pPr>
-        <w:keepNext/>
-        <w:spacing w:line="300" w:lineRule="auto" w:after="100"/>
-      </w:pPr>
-      <w:r>
-        <w:rPr>
-          <w:rFonts w:ascii="宋体" w:hAnsi="宋体" w:eastAsia="宋体"/>
+          <w:sz w:val="24"/>
+        </w:rPr>
+        <w:t>系统未实现零知识证明、门限解密、证书认证及完整状态回滚保护。名单ID不是身份认证；私钥持有者能在程序之外解密单票；小群体结果可能暴露个体偏好。签名验证依赖最初可信配置，攻击者若同时替换所有配置、密钥与历史数据，本地应用无法自行建立原始信任。单文件原子写入不等于跨文件事务，当前只支持单机单写入者。</w:t>
+      </w:r>
+    </w:p>
+    <w:p>
+      <w:pPr>
+        <w:pStyle w:val="ReportH2"/>
+      </w:pPr>
+      <w:r>
+        <w:rPr>
+          <w:rFonts w:ascii="Times New Roman" w:hAnsi="Times New Roman" w:eastAsia="宋体"/>
           <w:b/>
           <w:color w:val="000000"/>
           <w:sz w:val="24"/>
         </w:rPr>
-        <w:t>额外功能的实际意义</w:t>
-      </w:r>
-    </w:p>
-    <w:p>
-      <w:pPr>
-        <w:spacing w:line="300" w:lineRule="auto" w:after="100"/>
-        <w:ind w:firstLine="480"/>
-      </w:pPr>
-      <w:r>
-        <w:rPr>
-          <w:rFonts w:ascii="宋体" w:hAnsi="宋体" w:eastAsia="宋体"/>
-          <w:b w:val="0"/>
-          <w:color w:val="000000"/>
-          <w:sz w:val="22"/>
-        </w:rPr>
-        <w:t>关闭状态阻止继续接收选票和开放期计票；签名清单把已接收文件集合与摘要绑定起来。修改密文、删除选票、添加额外文件、修改配置或清单都会导致拒绝。临时副本演示便于现场复现，原始数据不会因此改变。</w:t>
-      </w:r>
-    </w:p>
-    <w:p>
-      <w:pPr>
-        <w:keepNext/>
-        <w:pageBreakBefore/>
-        <w:spacing w:line="300" w:lineRule="auto" w:after="160"/>
-      </w:pPr>
-      <w:r>
-        <w:rPr>
-          <w:rFonts w:ascii="宋体" w:hAnsi="宋体" w:eastAsia="宋体"/>
-          <w:b/>
-          <w:color w:val="000000"/>
-          <w:sz w:val="28"/>
-        </w:rPr>
-        <w:t>六 总结</w:t>
-      </w:r>
-    </w:p>
-    <w:p>
-      <w:pPr>
-        <w:spacing w:line="300" w:lineRule="auto" w:after="100"/>
-        <w:ind w:firstLine="480"/>
-      </w:pPr>
-      <w:r>
-        <w:rPr>
-          <w:rFonts w:ascii="宋体" w:hAnsi="宋体" w:eastAsia="宋体"/>
+        <w:t>6.2 分工验收与口试准备</w:t>
+      </w:r>
+    </w:p>
+    <w:p>
+      <w:pPr>
+        <w:pStyle w:val="ReportBody"/>
+      </w:pPr>
+      <w:r>
+        <w:t>为什么相同明文两次加密不同？r参与</w:t>
+      </w:r>
+      <w:r>
+        <w:t>r</w:t>
+      </w:r>
+      <w:r>
+        <w:rPr>
+          <w:vertAlign w:val="superscript"/>
+        </w:rPr>
+        <w:t>n</w:t>
+      </w:r>
+      <w:r>
+        <w:t>随机化。</w:t>
+      </w:r>
+    </w:p>
+    <w:p>
+      <w:pPr>
+        <w:pStyle w:val="ReportBody"/>
+      </w:pPr>
+      <w:r>
+        <w:rPr>
+          <w:rFonts w:ascii="Times New Roman" w:hAnsi="Times New Roman" w:eastAsia="宋体"/>
           <w:b w:val="0"/>
           <w:color w:val="000000"/>
           <w:sz w:val="24"/>
         </w:rPr>
-        <w:t>本模块完成了从单选输入到随机密文向量的转换，并通过真实测试验证了同态性、随机化和参数边界。后续改进应优先引入独热合法性证明和独立密钥保管，再考虑增加多选票型。</w:t>
-      </w:r>
-    </w:p>
-    <w:p>
-      <w:pPr>
-        <w:keepNext/>
-        <w:spacing w:line="300" w:lineRule="auto" w:after="100"/>
-      </w:pPr>
-      <w:r>
-        <w:rPr>
-          <w:rFonts w:ascii="宋体" w:hAnsi="宋体" w:eastAsia="宋体"/>
+        <w:t>nonce与Paillier的r是否相同？不是；前者是公开选票标识，后者是加密内部随机数。</w:t>
+      </w:r>
+    </w:p>
+    <w:p>
+      <w:pPr>
+        <w:pStyle w:val="ReportBody"/>
+      </w:pPr>
+      <w:r>
+        <w:rPr>
+          <w:rFonts w:ascii="Times New Roman" w:hAnsi="Times New Roman" w:eastAsia="宋体"/>
+          <w:b w:val="0"/>
+          <w:color w:val="000000"/>
+          <w:sz w:val="24"/>
+        </w:rPr>
+        <w:t>增加一个选项如何处理？创建新轮次并增大向量维度，旧票不能混入。</w:t>
+      </w:r>
+    </w:p>
+    <w:p>
+      <w:pPr>
+        <w:pStyle w:val="ReportBody"/>
+      </w:pPr>
+      <w:r>
+        <w:rPr>
+          <w:rFonts w:ascii="Times New Roman" w:hAnsi="Times New Roman" w:eastAsia="宋体"/>
+          <w:b w:val="0"/>
+          <w:color w:val="000000"/>
+          <w:sz w:val="24"/>
+        </w:rPr>
+        <w:t>个人验收建议：在自己电脑上重新运行本模块实验，保存截图和测试记录；现场修改一个参数或校验条件，说明修改影响；根据真实参与情况补全姓名、学号与个人总结。</w:t>
+      </w:r>
+    </w:p>
+    <w:p>
+      <w:pPr>
+        <w:pStyle w:val="ReportH2"/>
+      </w:pPr>
+      <w:r>
+        <w:rPr>
+          <w:rFonts w:ascii="Times New Roman" w:hAnsi="Times New Roman" w:eastAsia="宋体"/>
           <w:b/>
           <w:color w:val="000000"/>
           <w:sz w:val="24"/>
         </w:rPr>
-        <w:t>6.1 安全局限与后续改进</w:t>
-      </w:r>
-    </w:p>
-    <w:p>
-      <w:pPr>
-        <w:spacing w:line="300" w:lineRule="auto" w:after="100"/>
-        <w:ind w:firstLine="480"/>
-      </w:pPr>
-      <w:r>
-        <w:rPr>
-          <w:rFonts w:ascii="宋体" w:hAnsi="宋体" w:eastAsia="宋体"/>
-          <w:b w:val="0"/>
-          <w:color w:val="000000"/>
-          <w:sz w:val="24"/>
-        </w:rPr>
-        <w:t>系统未实现零知识证明、门限解密、证书认证及完整状态回滚保护。名单ID不是身份认证；私钥持有者能在程序之外解密单票；小群体结果可能暴露个体偏好。签名验证依赖最初可信配置，攻击者若同时替换所有配置、密钥与历史数据，本地应用无法自行建立原始信任。单文件原子写入不等于跨文件事务，当前只支持单机单写入者。</w:t>
-      </w:r>
-    </w:p>
-    <w:p>
-      <w:pPr>
-        <w:keepNext/>
-        <w:spacing w:line="300" w:lineRule="auto" w:after="100"/>
-      </w:pPr>
-      <w:r>
-        <w:rPr>
-          <w:rFonts w:ascii="宋体" w:hAnsi="宋体" w:eastAsia="宋体"/>
+        <w:t>6.3 AI使用声明</w:t>
+      </w:r>
+    </w:p>
+    <w:p>
+      <w:pPr>
+        <w:pStyle w:val="ReportBody"/>
+      </w:pPr>
+      <w:r>
+        <w:t>本次使用OpenAI Codex辅助审查代码、修订报告、执行实验和拆分Git提交。初稿与本轮修改均有仓库记录，AI参与范围详见根目录AI使用声明.txt。A/B/C为模块责任标识，学生需据真实贡献补全个人信息和复核记录，并独立解释代码。</w:t>
+      </w:r>
+    </w:p>
+    <w:p>
+      <w:pPr>
+        <w:pStyle w:val="ReportH2"/>
+      </w:pPr>
+      <w:r>
+        <w:rPr>
+          <w:rFonts w:ascii="Times New Roman" w:hAnsi="Times New Roman" w:eastAsia="宋体"/>
           <w:b/>
           <w:color w:val="000000"/>
           <w:sz w:val="24"/>
         </w:rPr>
-        <w:t>6.2 分工验收与口试准备</w:t>
-      </w:r>
-    </w:p>
-    <w:p>
-      <w:pPr>
-        <w:spacing w:line="300" w:lineRule="auto" w:after="100"/>
-        <w:ind w:firstLine="480"/>
-      </w:pPr>
-      <w:r>
-        <w:rPr>
-          <w:rFonts w:ascii="宋体" w:hAnsi="宋体" w:eastAsia="宋体"/>
+        <w:t>参考资料</w:t>
+      </w:r>
+    </w:p>
+    <w:p>
+      <w:pPr>
+        <w:pStyle w:val="ReportBody"/>
+        <w:spacing w:line="288" w:lineRule="auto"/>
+        <w:ind w:firstLine="0"/>
+        <w:jc w:val="left"/>
+      </w:pPr>
+      <w:r>
+        <w:rPr>
+          <w:rFonts w:ascii="Times New Roman" w:hAnsi="Times New Roman" w:eastAsia="宋体"/>
           <w:b w:val="0"/>
           <w:color w:val="000000"/>
-          <w:sz w:val="22"/>
-        </w:rPr>
-        <w:t>为什么相同明文两次加密不同？r参与r^n随机化。</w:t>
-      </w:r>
-    </w:p>
-    <w:p>
-      <w:pPr>
-        <w:spacing w:line="300" w:lineRule="auto" w:after="100"/>
-        <w:ind w:firstLine="480"/>
-      </w:pPr>
-      <w:r>
-        <w:rPr>
-          <w:rFonts w:ascii="宋体" w:hAnsi="宋体" w:eastAsia="宋体"/>
+          <w:sz w:val="21"/>
+        </w:rPr>
+        <w:t>[1] 专业课程设计任务书 B230414 2026—2027第一学期。</w:t>
+      </w:r>
+    </w:p>
+    <w:p>
+      <w:pPr>
+        <w:pStyle w:val="ReportBody"/>
+        <w:spacing w:line="288" w:lineRule="auto"/>
+        <w:ind w:firstLine="0"/>
+        <w:jc w:val="left"/>
+      </w:pPr>
+      <w:r>
+        <w:rPr>
+          <w:rFonts w:ascii="Times New Roman" w:hAnsi="Times New Roman" w:eastAsia="宋体"/>
           <w:b w:val="0"/>
           <w:color w:val="000000"/>
-          <w:sz w:val="22"/>
-        </w:rPr>
-        <w:t>nonce与Paillier的r是否相同？不是；前者是公开选票标识，后者是加密内部随机数。</w:t>
-      </w:r>
-    </w:p>
-    <w:p>
-      <w:pPr>
-        <w:spacing w:line="300" w:lineRule="auto" w:after="100"/>
-        <w:ind w:firstLine="480"/>
-      </w:pPr>
-      <w:r>
-        <w:rPr>
-          <w:rFonts w:ascii="宋体" w:hAnsi="宋体" w:eastAsia="宋体"/>
+          <w:sz w:val="21"/>
+        </w:rPr>
+        <w:t>[2] python-paillier API Documentation. https://python-paillier.readthedocs.io/en/stable/phe.html</w:t>
+      </w:r>
+    </w:p>
+    <w:p>
+      <w:pPr>
+        <w:pStyle w:val="ReportBody"/>
+        <w:spacing w:line="288" w:lineRule="auto"/>
+        <w:ind w:firstLine="0"/>
+        <w:jc w:val="left"/>
+      </w:pPr>
+      <w:r>
+        <w:rPr>
+          <w:rFonts w:ascii="Times New Roman" w:hAnsi="Times New Roman" w:eastAsia="宋体"/>
           <w:b w:val="0"/>
           <w:color w:val="000000"/>
-          <w:sz w:val="22"/>
-        </w:rPr>
-        <w:t>增加一个选项如何处理？创建新轮次并增大向量维度，旧票不能混入。</w:t>
-      </w:r>
-    </w:p>
-    <w:p>
-      <w:pPr>
-        <w:spacing w:line="300" w:lineRule="auto" w:after="100"/>
-        <w:ind w:firstLine="480"/>
-      </w:pPr>
-      <w:r>
-        <w:rPr>
-          <w:rFonts w:ascii="宋体" w:hAnsi="宋体" w:eastAsia="宋体"/>
+          <w:sz w:val="21"/>
+        </w:rPr>
+        <w:t>[3] Cryptography Ed25519 signing. https://cryptography.io/en/latest/hazmat/primitives/asymmetric/ed25519/</w:t>
+      </w:r>
+    </w:p>
+    <w:p>
+      <w:pPr>
+        <w:pStyle w:val="ReportBody"/>
+        <w:spacing w:line="288" w:lineRule="auto"/>
+        <w:ind w:firstLine="0"/>
+        <w:jc w:val="left"/>
+      </w:pPr>
+      <w:r>
+        <w:rPr>
+          <w:rFonts w:ascii="Times New Roman" w:hAnsi="Times New Roman" w:eastAsia="宋体"/>
           <w:b w:val="0"/>
           <w:color w:val="000000"/>
-          <w:sz w:val="22"/>
-        </w:rPr>
-        <w:t>个人验收建议：在自己电脑上重新运行本模块实验，保存截图和测试记录；现场修改一个参数或校验条件，说明修改影响；根据真实参与情况补全姓名、学号与个人总结。</w:t>
-      </w:r>
-    </w:p>
-    <w:p>
-      <w:pPr>
-        <w:keepNext/>
-        <w:spacing w:line="300" w:lineRule="auto" w:after="100"/>
-      </w:pPr>
-      <w:r>
-        <w:rPr>
-          <w:rFonts w:ascii="宋体" w:hAnsi="宋体" w:eastAsia="宋体"/>
-          <w:b/>
-          <w:color w:val="000000"/>
-          <w:sz w:val="24"/>
-        </w:rPr>
-        <w:t>6.3 AI使用声明</w:t>
-      </w:r>
-    </w:p>
-    <w:p>
-      <w:pPr>
-        <w:spacing w:line="300" w:lineRule="auto" w:after="100"/>
-        <w:ind w:firstLine="480"/>
-      </w:pPr>
-      <w:r>
-        <w:rPr>
-          <w:rFonts w:ascii="宋体" w:hAnsi="宋体" w:eastAsia="宋体"/>
-          <w:b w:val="0"/>
-          <w:color w:val="000000"/>
-          <w:sz w:val="22"/>
-        </w:rPr>
-        <w:t>本项目的初始代码、自动实验执行及报告初稿由OpenAI Codex辅助生成。报告中的数据来自实际运行，成员A/B/C表示建议的责任分配，不表示三位学生已经独立完成相应工作。学生须逐项验证、修改并能现场解释，个人完成情况、人工复核与新增Git提交应由本人补充。AI生成记录不冒充学生历史提交。</w:t>
-      </w:r>
-    </w:p>
-    <w:p>
-      <w:pPr>
-        <w:keepNext/>
-        <w:spacing w:line="300" w:lineRule="auto" w:after="100"/>
-      </w:pPr>
-      <w:r>
-        <w:rPr>
-          <w:rFonts w:ascii="宋体" w:hAnsi="宋体" w:eastAsia="宋体"/>
-          <w:b/>
-          <w:color w:val="000000"/>
-          <w:sz w:val="24"/>
-        </w:rPr>
-        <w:t>参考资料</w:t>
-      </w:r>
-    </w:p>
-    <w:p>
-      <w:pPr>
-        <w:spacing w:line="300" w:lineRule="auto" w:after="80"/>
-      </w:pPr>
-      <w:r>
-        <w:rPr>
-          <w:rFonts w:ascii="宋体" w:hAnsi="宋体" w:eastAsia="宋体"/>
-          <w:b w:val="0"/>
-          <w:color w:val="000000"/>
-          <w:sz w:val="18"/>
-        </w:rPr>
-        <w:t>[1] 专业课程设计任务书 B230414 2026—2027第一学期。</w:t>
-      </w:r>
-    </w:p>
-    <w:p>
-      <w:pPr>
-        <w:spacing w:line="300" w:lineRule="auto" w:after="80"/>
-      </w:pPr>
-      <w:r>
-        <w:rPr>
-          <w:rFonts w:ascii="宋体" w:hAnsi="宋体" w:eastAsia="宋体"/>
-          <w:b w:val="0"/>
-          <w:color w:val="000000"/>
-          <w:sz w:val="18"/>
-        </w:rPr>
-        <w:t>[2] python-paillier API Documentation. https://python-paillier.readthedocs.io/en/stable/phe.html</w:t>
-      </w:r>
-    </w:p>
-    <w:p>
-      <w:pPr>
-        <w:spacing w:line="300" w:lineRule="auto" w:after="80"/>
-      </w:pPr>
-      <w:r>
-        <w:rPr>
-          <w:rFonts w:ascii="宋体" w:hAnsi="宋体" w:eastAsia="宋体"/>
-          <w:b w:val="0"/>
-          <w:color w:val="000000"/>
-          <w:sz w:val="18"/>
-        </w:rPr>
-        <w:t>[3] Cryptography Ed25519 signing. https://cryptography.io/en/latest/hazmat/primitives/asymmetric/ed25519/</w:t>
-      </w:r>
-    </w:p>
-    <w:p>
-      <w:pPr>
-        <w:spacing w:line="300" w:lineRule="auto" w:after="80"/>
-      </w:pPr>
-      <w:r>
-        <w:rPr>
-          <w:rFonts w:ascii="宋体" w:hAnsi="宋体" w:eastAsia="宋体"/>
-          <w:b w:val="0"/>
-          <w:color w:val="000000"/>
-          <w:sz w:val="18"/>
+          <w:sz w:val="21"/>
         </w:rPr>
         <w:t>[4] PyInstaller Using PyInstaller. https://pyinstaller.org/en/stable/usage.html</w:t>
       </w:r>
@@ -4934,10 +5148,22 @@
     </w:pPr>
     <w:r>
       <w:rPr>
-        <w:kern w:val="0"/>
-        <w:szCs w:val="21"/>
+        <w:rFonts w:ascii="Times New Roman" w:hAnsi="Times New Roman" w:eastAsia="宋体"/>
+        <w:b w:val="0"/>
+        <w:color w:val="000000"/>
+        <w:sz w:val="18"/>
       </w:rPr>
-      <w:t>-</w:t>
+      <w:t xml:space="preserve">第 </w:t>
+    </w:r>
+    <w:fldSimple w:instr="PAGE"/>
+    <w:r>
+      <w:rPr>
+        <w:rFonts w:ascii="Times New Roman" w:hAnsi="Times New Roman" w:eastAsia="宋体"/>
+        <w:b w:val="0"/>
+        <w:color w:val="000000"/>
+        <w:sz w:val="18"/>
+      </w:rPr>
+      <w:t xml:space="preserve"> 页</w:t>
     </w:r>
   </w:p>
 </w:ftr>
@@ -5439,6 +5665,99 @@
       <w:ind w:firstLine="420" w:firstLineChars="200"/>
     </w:pPr>
   </w:style>
+  <w:style w:type="paragraph" w:customStyle="1" w:styleId="ReportTitle">
+    <w:name w:val="Report Title"/>
+    <w:basedOn w:val="1"/>
+    <w:pPr>
+      <w:keepNext/>
+      <w:widowControl/>
+      <w:spacing w:after="60" w:before="120" w:line="360" w:lineRule="auto"/>
+      <w:ind w:firstLine="0"/>
+    </w:pPr>
+    <w:rPr>
+      <w:rFonts w:ascii="Times New Roman" w:hAnsi="Times New Roman" w:eastAsia="宋体"/>
+      <w:b/>
+      <w:sz w:val="32"/>
+    </w:rPr>
+  </w:style>
+  <w:style w:type="paragraph" w:customStyle="1" w:styleId="ReportH1">
+    <w:name w:val="Report H1"/>
+    <w:basedOn w:val="1"/>
+    <w:pPr>
+      <w:keepNext/>
+      <w:widowControl/>
+      <w:spacing w:after="60" w:before="120" w:line="360" w:lineRule="auto"/>
+      <w:ind w:firstLine="0"/>
+      <w:outlineLvl w:val="0"/>
+    </w:pPr>
+    <w:rPr>
+      <w:rFonts w:ascii="Times New Roman" w:hAnsi="Times New Roman" w:eastAsia="宋体"/>
+      <w:b/>
+      <w:sz w:val="28"/>
+    </w:rPr>
+  </w:style>
+  <w:style w:type="paragraph" w:customStyle="1" w:styleId="ReportH2">
+    <w:name w:val="Report H2"/>
+    <w:basedOn w:val="1"/>
+    <w:pPr>
+      <w:keepNext/>
+      <w:widowControl/>
+      <w:spacing w:after="60" w:before="120" w:line="360" w:lineRule="auto"/>
+      <w:ind w:firstLine="0"/>
+      <w:outlineLvl w:val="1"/>
+    </w:pPr>
+    <w:rPr>
+      <w:rFonts w:ascii="Times New Roman" w:hAnsi="Times New Roman" w:eastAsia="宋体"/>
+      <w:b/>
+      <w:sz w:val="24"/>
+    </w:rPr>
+  </w:style>
+  <w:style w:type="paragraph" w:customStyle="1" w:styleId="ReportBody">
+    <w:name w:val="Report Body"/>
+    <w:basedOn w:val="1"/>
+    <w:pPr>
+      <w:keepLines/>
+      <w:widowControl/>
+      <w:spacing w:after="0" w:before="0" w:line="360" w:lineRule="auto"/>
+      <w:ind w:firstLine="480"/>
+    </w:pPr>
+    <w:rPr>
+      <w:rFonts w:ascii="Times New Roman" w:hAnsi="Times New Roman" w:eastAsia="宋体"/>
+      <w:b w:val="0"/>
+      <w:sz w:val="24"/>
+    </w:rPr>
+  </w:style>
+  <w:style w:type="paragraph" w:customStyle="1" w:styleId="ReportCaption">
+    <w:name w:val="Report Caption"/>
+    <w:basedOn w:val="1"/>
+    <w:pPr>
+      <w:widowControl/>
+      <w:spacing w:after="120" w:before="0" w:line="360" w:lineRule="auto"/>
+      <w:ind w:firstLine="0"/>
+      <w:jc w:val="center"/>
+    </w:pPr>
+    <w:rPr>
+      <w:rFonts w:ascii="Times New Roman" w:hAnsi="Times New Roman" w:eastAsia="宋体"/>
+      <w:b w:val="0"/>
+      <w:sz w:val="21"/>
+    </w:rPr>
+  </w:style>
+  <w:style w:type="paragraph" w:customStyle="1" w:styleId="ReportCode">
+    <w:name w:val="Report Code"/>
+    <w:basedOn w:val="1"/>
+    <w:pPr>
+      <w:keepLines/>
+      <w:widowControl/>
+      <w:spacing w:after="0" w:before="0" w:line="240" w:lineRule="auto"/>
+      <w:ind w:firstLine="0" w:left="240"/>
+      <w:jc w:val="left"/>
+    </w:pPr>
+    <w:rPr>
+      <w:rFonts w:ascii="Consolas" w:hAnsi="Consolas" w:eastAsia="新宋体"/>
+      <w:b w:val="0"/>
+      <w:sz w:val="20"/>
+    </w:rPr>
+  </w:style>
 </w:styles>
 </file>
 

</xml_diff>

<commit_message>
docs: revise report A for endpoint encryption and separated key custody
</commit_message>
<xml_diff>
--- a/reports/成员A_选票编码与Paillier加密模块_报告.docx
+++ b/reports/成员A_选票编码与Paillier加密模块_报告.docx
@@ -2155,28 +2155,15 @@
         <w:pageBreakBefore/>
       </w:pPr>
       <w:r>
-        <w:rPr>
-          <w:rFonts w:ascii="Times New Roman" w:hAnsi="Times New Roman" w:eastAsia="宋体"/>
-          <w:b/>
-          <w:color w:val="000000"/>
-          <w:sz w:val="32"/>
-        </w:rPr>
         <w:t>基于同态加密的隐私保护投票系统</w:t>
       </w:r>
     </w:p>
     <w:p>
       <w:pPr>
         <w:pStyle w:val="ReportH2"/>
-        <w:spacing w:after="120"/>
-      </w:pPr>
-      <w:r>
-        <w:rPr>
-          <w:rFonts w:ascii="Times New Roman" w:hAnsi="Times New Roman" w:eastAsia="宋体"/>
-          <w:b/>
-          <w:color w:val="000000"/>
-          <w:sz w:val="24"/>
-        </w:rPr>
-        <w:t>成员A分工报告  选票编码与Paillier加密模块</w:t>
+      </w:pPr>
+      <w:r>
+        <w:t>成员A分工报告  选票编码、客户端加密与密钥分离</w:t>
       </w:r>
     </w:p>
     <w:p>
@@ -2184,12 +2171,6 @@
         <w:pStyle w:val="ReportH1"/>
       </w:pPr>
       <w:r>
-        <w:rPr>
-          <w:rFonts w:ascii="Times New Roman" w:hAnsi="Times New Roman" w:eastAsia="宋体"/>
-          <w:b/>
-          <w:color w:val="000000"/>
-          <w:sz w:val="28"/>
-        </w:rPr>
         <w:t>一、课题内容和要求</w:t>
       </w:r>
     </w:p>
@@ -2198,12 +2179,6 @@
         <w:pStyle w:val="ReportH2"/>
       </w:pPr>
       <w:r>
-        <w:rPr>
-          <w:rFonts w:ascii="Times New Roman" w:hAnsi="Times New Roman" w:eastAsia="宋体"/>
-          <w:b/>
-          <w:color w:val="000000"/>
-          <w:sz w:val="24"/>
-        </w:rPr>
         <w:t>1.1 课题内容</w:t>
       </w:r>
     </w:p>
@@ -2212,13 +2187,7 @@
         <w:pStyle w:val="ReportBody"/>
       </w:pPr>
       <w:r>
-        <w:rPr>
-          <w:rFonts w:ascii="Times New Roman" w:hAnsi="Times New Roman" w:eastAsia="宋体"/>
-          <w:b w:val="0"/>
-          <w:color w:val="000000"/>
-          <w:sz w:val="24"/>
-        </w:rPr>
-        <w:t>系统使用Paillier加法同态加密实现本地可视化投票。投票端生成加密选票，计票端只访问公开数据并汇总密文，独立解密进程在投票关闭后返回各选项总票数。额外实现投票关闭与Ed25519签名清单审计，检测已接收选票的删除和修改。</w:t>
+        <w:t>设计一个电子投票系统，利用同态加密技术，使服务器在不查看个人投票内容的情况下统计总票。本实现采用Paillier加法同态：投票端本地加密，服务器只接收密文并进行列乘积，独立保管端只解密完整汇总，服务器公布经过签名的总票。</w:t>
       </w:r>
     </w:p>
     <w:p>
@@ -2226,13 +2195,7 @@
         <w:pStyle w:val="ReportBody"/>
       </w:pPr>
       <w:r>
-        <w:rPr>
-          <w:rFonts w:ascii="Times New Roman" w:hAnsi="Times New Roman" w:eastAsia="宋体"/>
-          <w:b w:val="0"/>
-          <w:color w:val="000000"/>
-          <w:sz w:val="24"/>
-        </w:rPr>
-        <w:t>把用户的单选意图转换为固定维度的加密向量，生成并保护密钥，使计票端不接触明文选择。重点解决随机化加密、动态选项、序列化和错误输入问题。</w:t>
+        <w:t>操作场景为局域网服务器开放端口，各客户端填写IP和端口连接，也允许本机启动多个客户端模拟多端。选票包含ID、票型、时间戳、随机标识与密文向量；通过凭证绑定和签名记录检测重复、越权及数据修改。</w:t>
       </w:r>
     </w:p>
     <w:p>
@@ -2240,13 +2203,7 @@
         <w:pStyle w:val="ReportH2"/>
       </w:pPr>
       <w:r>
-        <w:rPr>
-          <w:rFonts w:ascii="Times New Roman" w:hAnsi="Times New Roman" w:eastAsia="宋体"/>
-          <w:b/>
-          <w:color w:val="000000"/>
-          <w:sz w:val="24"/>
-        </w:rPr>
-        <w:t>1.2 课题要求与本分工责任</w:t>
+        <w:t>1.2 本分工要求</w:t>
       </w:r>
     </w:p>
     <w:p>
@@ -2254,13 +2211,7 @@
         <w:pStyle w:val="ReportBody"/>
       </w:pPr>
       <w:r>
-        <w:rPr>
-          <w:rFonts w:ascii="Times New Roman" w:hAnsi="Times New Roman" w:eastAsia="宋体"/>
-          <w:b w:val="0"/>
-          <w:color w:val="000000"/>
-          <w:sz w:val="24"/>
-        </w:rPr>
-        <w:t>输入为本轮配置、投票者ID和一个选项索引。输出只包含轮次、ID、票型、时间戳、随机标识及密文向量。选项索引必须是整数且在范围内，ID必须位于授权名单。支持2至8个选项，现场变化通过新建投票轮次处理。</w:t>
+        <w:t>本分工负责选票编码、客户端加密与密钥分离，需要说明数据输入、输出、失败条件及与其他模块的接口；通过可复跑的实验验证功能、耗时和安全边界。</w:t>
       </w:r>
     </w:p>
     <w:p>
@@ -2268,13 +2219,7 @@
         <w:pStyle w:val="ReportBody"/>
       </w:pPr>
       <w:r>
-        <w:rPr>
-          <w:rFonts w:ascii="Times New Roman" w:hAnsi="Times New Roman" w:eastAsia="宋体"/>
-          <w:b w:val="0"/>
-          <w:color w:val="000000"/>
-          <w:sz w:val="24"/>
-        </w:rPr>
-        <w:t>本报告对应的代码范围：crypto_service.py；experiments.py中的同态、随机化、口令和编码实验。</w:t>
+        <w:t>本分工主要代码：crypto_service.py、network_setup.py、network_client.py。A/B/C表示模块责任，姓名学号与实际个人贡献由成员据实确认。</w:t>
       </w:r>
     </w:p>
     <w:p>
@@ -2282,12 +2227,6 @@
         <w:pStyle w:val="ReportH1"/>
       </w:pPr>
       <w:r>
-        <w:rPr>
-          <w:rFonts w:ascii="Times New Roman" w:hAnsi="Times New Roman" w:eastAsia="宋体"/>
-          <w:b/>
-          <w:color w:val="000000"/>
-          <w:sz w:val="28"/>
-        </w:rPr>
         <w:t>二、需求分析和总体设计</w:t>
       </w:r>
     </w:p>
@@ -2304,7 +2243,7 @@
         <w:pStyle w:val="ReportBody"/>
       </w:pPr>
       <w:r>
-        <w:t>本模块接收本轮配置、名单ID和一个选项索引，输出固定维度的随机密文向量。创建流程生成2048位Paillier密钥，登记流程生成Ed25519签名密钥，口令保护的保管库保存私钥材料。选择为单选，选项数量可以变化，选票中不保存明文索引。</w:t>
+        <w:t>投票人在客户端输入IP和端口，导入组织者分配的独立凭证。客户端核验服务器证书指纹、配置摘要和绑定ID后，读取选项并在本端完成随机加密。初始化程序把服务器运行材料、保管端私钥和人员凭证分目录交付。</w:t>
       </w:r>
     </w:p>
     <w:p>
@@ -2320,7 +2259,7 @@
         <w:pStyle w:val="ReportBody"/>
       </w:pPr>
       <w:r>
-        <w:t>先用独热向量约束客户端表达方式，再逐分量调用raw_encrypt；把公开随机标识nonce与加密内部随机数r区分，避免公开r。选项维度来自配置，不把三选项写死。密钥保管采用scrypt与AES-GCM，错误口令通过认证标签校验失败返回。</w:t>
+        <w:t>首先把原来集中在同一电脑上的密钥职责拆开。Paillier私钥仅写入trustee目录的口令保管库；server目录只接收公钥、登记签名密钥及TLS密钥。客户端独立计算选票，HTTPS请求体不包含choice字段，也不包含私钥或保管口令。随后增加证书指纹固定和配置摘要检查，避免把凭证交给错误服务器。</w:t>
       </w:r>
     </w:p>
     <w:p>
@@ -2328,7 +2267,15 @@
         <w:pStyle w:val="ReportH2"/>
       </w:pPr>
       <w:r>
-        <w:t>2.3 模块接口与分工</w:t>
+        <w:t>2.3 系统部署与接口</w:t>
+      </w:r>
+    </w:p>
+    <w:p>
+      <w:pPr>
+        <w:pStyle w:val="ReportBody"/>
+      </w:pPr>
+      <w:r>
+        <w:t>组织者在保管端初始化三个目录：server部署到收票电脑，trustee留在独立保管电脑，organizer内的凭证按身份分发。初始化过程中产生私钥，但运行中的网络服务器从未获得Paillier私钥；服务器TLS私钥和登记签名私钥仅用于通信、审计，不具有选票解密能力。</w:t>
       </w:r>
     </w:p>
     <w:p>
@@ -2337,168 +2284,117 @@
         <w:keepNext/>
       </w:pPr>
       <w:r>
-        <w:t>表1 小组模块划分</w:t>
+        <w:t>表1 三端职责和数据边界</w:t>
       </w:r>
     </w:p>
     <w:tbl>
       <w:tblPr>
         <w:tblW w:type="auto" w:w="0"/>
-        <w:jc w:val="center"/>
         <w:tblLayout w:type="fixed"/>
         <w:tblLook w:firstColumn="1" w:firstRow="1" w:lastColumn="0" w:lastRow="0" w:noHBand="0" w:noVBand="1" w:val="04A0"/>
       </w:tblPr>
       <w:tblGrid>
-        <w:gridCol w:w="794"/>
-        <w:gridCol w:w="2665"/>
-        <w:gridCol w:w="5726"/>
+        <w:gridCol w:w="3118"/>
+        <w:gridCol w:w="3118"/>
+        <w:gridCol w:w="3118"/>
       </w:tblGrid>
       <w:tr>
         <w:trPr>
           <w:tblHeader/>
-          <w:tblHeader/>
         </w:trPr>
         <w:tc>
           <w:tcPr>
-            <w:tcW w:type="dxa" w:w="794"/>
-            <w:vAlign w:val="center"/>
-            <w:tcBorders>
-              <w:top w:val="single" w:sz="4" w:color="D9D9D9"/>
-              <w:left w:val="single" w:sz="4" w:color="D9D9D9"/>
-              <w:bottom w:val="single" w:sz="4" w:color="D9D9D9"/>
-              <w:right w:val="single" w:sz="4" w:color="D9D9D9"/>
-              <w:top w:val="single" w:sz="4" w:color="D9D9D9"/>
-              <w:left w:val="single" w:sz="4" w:color="D9D9D9"/>
-              <w:bottom w:val="single" w:sz="4" w:color="D9D9D9"/>
-              <w:right w:val="single" w:sz="4" w:color="D9D9D9"/>
-            </w:tcBorders>
-            <w:tcMar>
-              <w:top w:w="75" w:type="dxa"/>
-              <w:left w:w="75" w:type="dxa"/>
-              <w:bottom w:w="75" w:type="dxa"/>
-              <w:right w:w="75" w:type="dxa"/>
-            </w:tcMar>
-            <w:shd w:fill="E8EDF1"/>
-          </w:tcPr>
-          <w:p>
-            <w:pPr>
-              <w:keepNext/>
-              <w:spacing w:after="40" w:line="288" w:lineRule="auto" w:before="40"/>
-            </w:pPr>
-            <w:r>
-              <w:rPr>
-                <w:rFonts w:ascii="Times New Roman" w:hAnsi="Times New Roman" w:eastAsia="宋体"/>
-                <w:b/>
-                <w:color w:val="000000"/>
-                <w:sz w:val="21"/>
-              </w:rPr>
-              <w:t>成员</w:t>
-            </w:r>
-          </w:p>
-        </w:tc>
-        <w:tc>
-          <w:tcPr>
-            <w:tcW w:type="dxa" w:w="2665"/>
-            <w:vAlign w:val="center"/>
-            <w:tcBorders>
-              <w:top w:val="single" w:sz="4" w:color="D9D9D9"/>
-              <w:left w:val="single" w:sz="4" w:color="D9D9D9"/>
-              <w:bottom w:val="single" w:sz="4" w:color="D9D9D9"/>
-              <w:right w:val="single" w:sz="4" w:color="D9D9D9"/>
-              <w:top w:val="single" w:sz="4" w:color="D9D9D9"/>
-              <w:left w:val="single" w:sz="4" w:color="D9D9D9"/>
-              <w:bottom w:val="single" w:sz="4" w:color="D9D9D9"/>
-              <w:right w:val="single" w:sz="4" w:color="D9D9D9"/>
-            </w:tcBorders>
-            <w:tcMar>
-              <w:top w:w="75" w:type="dxa"/>
-              <w:left w:w="75" w:type="dxa"/>
-              <w:bottom w:w="75" w:type="dxa"/>
-              <w:right w:w="75" w:type="dxa"/>
-            </w:tcMar>
-            <w:shd w:fill="E8EDF1"/>
-          </w:tcPr>
-          <w:p>
-            <w:pPr>
-              <w:keepNext/>
-              <w:spacing w:after="40" w:line="288" w:lineRule="auto" w:before="40"/>
-            </w:pPr>
-            <w:r>
-              <w:rPr>
-                <w:rFonts w:ascii="Times New Roman" w:hAnsi="Times New Roman" w:eastAsia="宋体"/>
-                <w:b/>
-                <w:color w:val="000000"/>
-                <w:sz w:val="21"/>
-              </w:rPr>
-              <w:t>负责模块</w:t>
-            </w:r>
-          </w:p>
-        </w:tc>
-        <w:tc>
-          <w:tcPr>
-            <w:tcW w:type="dxa" w:w="5726"/>
-            <w:vAlign w:val="center"/>
-            <w:tcBorders>
-              <w:top w:val="single" w:sz="4" w:color="D9D9D9"/>
-              <w:left w:val="single" w:sz="4" w:color="D9D9D9"/>
-              <w:bottom w:val="single" w:sz="4" w:color="D9D9D9"/>
-              <w:right w:val="single" w:sz="4" w:color="D9D9D9"/>
-              <w:top w:val="single" w:sz="4" w:color="D9D9D9"/>
-              <w:left w:val="single" w:sz="4" w:color="D9D9D9"/>
-              <w:bottom w:val="single" w:sz="4" w:color="D9D9D9"/>
-              <w:right w:val="single" w:sz="4" w:color="D9D9D9"/>
-            </w:tcBorders>
-            <w:tcMar>
-              <w:top w:w="75" w:type="dxa"/>
-              <w:left w:w="75" w:type="dxa"/>
-              <w:bottom w:w="75" w:type="dxa"/>
-              <w:right w:w="75" w:type="dxa"/>
-            </w:tcMar>
-            <w:shd w:fill="E8EDF1"/>
-          </w:tcPr>
-          <w:p>
-            <w:pPr>
-              <w:keepNext/>
-              <w:spacing w:after="40" w:line="288" w:lineRule="auto" w:before="40"/>
-            </w:pPr>
-            <w:r>
-              <w:rPr>
-                <w:rFonts w:ascii="Times New Roman" w:hAnsi="Times New Roman" w:eastAsia="宋体"/>
-                <w:b/>
-                <w:color w:val="000000"/>
-                <w:sz w:val="21"/>
-              </w:rPr>
-              <w:t>交付与验证</w:t>
+            <w:tcW w:type="dxa" w:w="1361"/>
+            <w:tcBorders>
+              <w:top w:val="single" w:sz="4" w:color="C9D4DF"/>
+              <w:left w:val="single" w:sz="4" w:color="C9D4DF"/>
+              <w:bottom w:val="single" w:sz="4" w:color="C9D4DF"/>
+              <w:right w:val="single" w:sz="4" w:color="C9D4DF"/>
+            </w:tcBorders>
+            <w:shd w:fill="E8EEF3"/>
+          </w:tcPr>
+          <w:p>
+            <w:pPr>
+              <w:spacing w:line="288" w:lineRule="auto" w:before="60" w:after="60"/>
+            </w:pPr>
+            <w:r>
+              <w:rPr>
+                <w:rFonts w:ascii="Times New Roman" w:hAnsi="Times New Roman" w:eastAsia="宋体"/>
+                <w:b/>
+                <w:color w:val="000000"/>
+                <w:sz w:val="21"/>
+              </w:rPr>
+              <w:t>角色</w:t>
+            </w:r>
+          </w:p>
+        </w:tc>
+        <w:tc>
+          <w:tcPr>
+            <w:tcW w:type="dxa" w:w="4535"/>
+            <w:tcBorders>
+              <w:top w:val="single" w:sz="4" w:color="C9D4DF"/>
+              <w:left w:val="single" w:sz="4" w:color="C9D4DF"/>
+              <w:bottom w:val="single" w:sz="4" w:color="C9D4DF"/>
+              <w:right w:val="single" w:sz="4" w:color="C9D4DF"/>
+            </w:tcBorders>
+            <w:shd w:fill="E8EEF3"/>
+          </w:tcPr>
+          <w:p>
+            <w:pPr>
+              <w:spacing w:line="288" w:lineRule="auto" w:before="60" w:after="60"/>
+            </w:pPr>
+            <w:r>
+              <w:rPr>
+                <w:rFonts w:ascii="Times New Roman" w:hAnsi="Times New Roman" w:eastAsia="宋体"/>
+                <w:b/>
+                <w:color w:val="000000"/>
+                <w:sz w:val="21"/>
+              </w:rPr>
+              <w:t>输入与操作</w:t>
+            </w:r>
+          </w:p>
+        </w:tc>
+        <w:tc>
+          <w:tcPr>
+            <w:tcW w:type="dxa" w:w="2948"/>
+            <w:tcBorders>
+              <w:top w:val="single" w:sz="4" w:color="C9D4DF"/>
+              <w:left w:val="single" w:sz="4" w:color="C9D4DF"/>
+              <w:bottom w:val="single" w:sz="4" w:color="C9D4DF"/>
+              <w:right w:val="single" w:sz="4" w:color="C9D4DF"/>
+            </w:tcBorders>
+            <w:shd w:fill="E8EEF3"/>
+          </w:tcPr>
+          <w:p>
+            <w:pPr>
+              <w:spacing w:line="288" w:lineRule="auto" w:before="60" w:after="60"/>
+            </w:pPr>
+            <w:r>
+              <w:rPr>
+                <w:rFonts w:ascii="Times New Roman" w:hAnsi="Times New Roman" w:eastAsia="宋体"/>
+                <w:b/>
+                <w:color w:val="000000"/>
+                <w:sz w:val="21"/>
+              </w:rPr>
+              <w:t>可持有的秘密</w:t>
             </w:r>
           </w:p>
         </w:tc>
       </w:tr>
       <w:tr>
-        <w:trPr/>
-        <w:tc>
-          <w:tcPr>
-            <w:tcW w:type="dxa" w:w="794"/>
-            <w:vAlign w:val="center"/>
-            <w:tcBorders>
-              <w:top w:val="single" w:sz="4" w:color="D9D9D9"/>
-              <w:left w:val="single" w:sz="4" w:color="D9D9D9"/>
-              <w:bottom w:val="single" w:sz="4" w:color="D9D9D9"/>
-              <w:right w:val="single" w:sz="4" w:color="D9D9D9"/>
-              <w:top w:val="single" w:sz="4" w:color="D9D9D9"/>
-              <w:left w:val="single" w:sz="4" w:color="D9D9D9"/>
-              <w:bottom w:val="single" w:sz="4" w:color="D9D9D9"/>
-              <w:right w:val="single" w:sz="4" w:color="D9D9D9"/>
-            </w:tcBorders>
-            <w:tcMar>
-              <w:top w:w="75" w:type="dxa"/>
-              <w:left w:w="75" w:type="dxa"/>
-              <w:bottom w:w="75" w:type="dxa"/>
-              <w:right w:w="75" w:type="dxa"/>
-            </w:tcMar>
-          </w:tcPr>
-          <w:p>
-            <w:pPr>
-              <w:keepNext/>
-              <w:spacing w:after="40" w:line="288" w:lineRule="auto" w:before="40"/>
+        <w:tc>
+          <w:tcPr>
+            <w:tcW w:type="dxa" w:w="1361"/>
+            <w:tcBorders>
+              <w:top w:val="single" w:sz="4" w:color="C9D4DF"/>
+              <w:left w:val="single" w:sz="4" w:color="C9D4DF"/>
+              <w:bottom w:val="single" w:sz="4" w:color="C9D4DF"/>
+              <w:right w:val="single" w:sz="4" w:color="C9D4DF"/>
+            </w:tcBorders>
+          </w:tcPr>
+          <w:p>
+            <w:pPr>
+              <w:spacing w:line="288" w:lineRule="auto" w:before="60" w:after="60"/>
             </w:pPr>
             <w:r>
               <w:rPr>
@@ -2507,35 +2403,23 @@
                 <w:color w:val="000000"/>
                 <w:sz w:val="21"/>
               </w:rPr>
-              <w:t>A</w:t>
-            </w:r>
-          </w:p>
-        </w:tc>
-        <w:tc>
-          <w:tcPr>
-            <w:tcW w:type="dxa" w:w="2665"/>
-            <w:vAlign w:val="center"/>
-            <w:tcBorders>
-              <w:top w:val="single" w:sz="4" w:color="D9D9D9"/>
-              <w:left w:val="single" w:sz="4" w:color="D9D9D9"/>
-              <w:bottom w:val="single" w:sz="4" w:color="D9D9D9"/>
-              <w:right w:val="single" w:sz="4" w:color="D9D9D9"/>
-              <w:top w:val="single" w:sz="4" w:color="D9D9D9"/>
-              <w:left w:val="single" w:sz="4" w:color="D9D9D9"/>
-              <w:bottom w:val="single" w:sz="4" w:color="D9D9D9"/>
-              <w:right w:val="single" w:sz="4" w:color="D9D9D9"/>
-            </w:tcBorders>
-            <w:tcMar>
-              <w:top w:w="75" w:type="dxa"/>
-              <w:left w:w="75" w:type="dxa"/>
-              <w:bottom w:w="75" w:type="dxa"/>
-              <w:right w:w="75" w:type="dxa"/>
-            </w:tcMar>
-          </w:tcPr>
-          <w:p>
-            <w:pPr>
-              <w:keepNext/>
-              <w:spacing w:after="40" w:line="288" w:lineRule="auto" w:before="40"/>
+              <w:t>客户端</w:t>
+            </w:r>
+          </w:p>
+        </w:tc>
+        <w:tc>
+          <w:tcPr>
+            <w:tcW w:type="dxa" w:w="4535"/>
+            <w:tcBorders>
+              <w:top w:val="single" w:sz="4" w:color="C9D4DF"/>
+              <w:left w:val="single" w:sz="4" w:color="C9D4DF"/>
+              <w:bottom w:val="single" w:sz="4" w:color="C9D4DF"/>
+              <w:right w:val="single" w:sz="4" w:color="C9D4DF"/>
+            </w:tcBorders>
+          </w:tcPr>
+          <w:p>
+            <w:pPr>
+              <w:spacing w:line="288" w:lineRule="auto" w:before="60" w:after="60"/>
             </w:pPr>
             <w:r>
               <w:rPr>
@@ -2544,35 +2428,23 @@
                 <w:color w:val="000000"/>
                 <w:sz w:val="21"/>
               </w:rPr>
-              <w:t>密钥与加密选票</w:t>
-            </w:r>
-          </w:p>
-        </w:tc>
-        <w:tc>
-          <w:tcPr>
-            <w:tcW w:type="dxa" w:w="5726"/>
-            <w:vAlign w:val="center"/>
-            <w:tcBorders>
-              <w:top w:val="single" w:sz="4" w:color="D9D9D9"/>
-              <w:left w:val="single" w:sz="4" w:color="D9D9D9"/>
-              <w:bottom w:val="single" w:sz="4" w:color="D9D9D9"/>
-              <w:right w:val="single" w:sz="4" w:color="D9D9D9"/>
-              <w:top w:val="single" w:sz="4" w:color="D9D9D9"/>
-              <w:left w:val="single" w:sz="4" w:color="D9D9D9"/>
-              <w:bottom w:val="single" w:sz="4" w:color="D9D9D9"/>
-              <w:right w:val="single" w:sz="4" w:color="D9D9D9"/>
-            </w:tcBorders>
-            <w:tcMar>
-              <w:top w:w="75" w:type="dxa"/>
-              <w:left w:w="75" w:type="dxa"/>
-              <w:bottom w:w="75" w:type="dxa"/>
-              <w:right w:w="75" w:type="dxa"/>
-            </w:tcMar>
-          </w:tcPr>
-          <w:p>
-            <w:pPr>
-              <w:keepNext/>
-              <w:spacing w:after="40" w:line="288" w:lineRule="auto" w:before="40"/>
+              <w:t>IP、端口、凭证；本地加密后提交密文</w:t>
+            </w:r>
+          </w:p>
+        </w:tc>
+        <w:tc>
+          <w:tcPr>
+            <w:tcW w:type="dxa" w:w="2948"/>
+            <w:tcBorders>
+              <w:top w:val="single" w:sz="4" w:color="C9D4DF"/>
+              <w:left w:val="single" w:sz="4" w:color="C9D4DF"/>
+              <w:bottom w:val="single" w:sz="4" w:color="C9D4DF"/>
+              <w:right w:val="single" w:sz="4" w:color="C9D4DF"/>
+            </w:tcBorders>
+          </w:tcPr>
+          <w:p>
+            <w:pPr>
+              <w:spacing w:line="288" w:lineRule="auto" w:before="60" w:after="60"/>
             </w:pPr>
             <w:r>
               <w:rPr>
@@ -2581,38 +2453,25 @@
                 <w:color w:val="000000"/>
                 <w:sz w:val="21"/>
               </w:rPr>
-              <w:t>编码、随机加密、密钥封装；同态和输入边界测试</w:t>
+              <w:t>本人票码、当前选择</w:t>
             </w:r>
           </w:p>
         </w:tc>
       </w:tr>
       <w:tr>
-        <w:trPr/>
-        <w:tc>
-          <w:tcPr>
-            <w:tcW w:type="dxa" w:w="794"/>
-            <w:vAlign w:val="center"/>
-            <w:tcBorders>
-              <w:top w:val="single" w:sz="4" w:color="D9D9D9"/>
-              <w:left w:val="single" w:sz="4" w:color="D9D9D9"/>
-              <w:bottom w:val="single" w:sz="4" w:color="D9D9D9"/>
-              <w:right w:val="single" w:sz="4" w:color="D9D9D9"/>
-              <w:top w:val="single" w:sz="4" w:color="D9D9D9"/>
-              <w:left w:val="single" w:sz="4" w:color="D9D9D9"/>
-              <w:bottom w:val="single" w:sz="4" w:color="D9D9D9"/>
-              <w:right w:val="single" w:sz="4" w:color="D9D9D9"/>
-            </w:tcBorders>
-            <w:tcMar>
-              <w:top w:w="75" w:type="dxa"/>
-              <w:left w:w="75" w:type="dxa"/>
-              <w:bottom w:w="75" w:type="dxa"/>
-              <w:right w:w="75" w:type="dxa"/>
-            </w:tcMar>
-          </w:tcPr>
-          <w:p>
-            <w:pPr>
-              <w:keepNext/>
-              <w:spacing w:after="40" w:line="288" w:lineRule="auto" w:before="40"/>
+        <w:tc>
+          <w:tcPr>
+            <w:tcW w:type="dxa" w:w="1361"/>
+            <w:tcBorders>
+              <w:top w:val="single" w:sz="4" w:color="C9D4DF"/>
+              <w:left w:val="single" w:sz="4" w:color="C9D4DF"/>
+              <w:bottom w:val="single" w:sz="4" w:color="C9D4DF"/>
+              <w:right w:val="single" w:sz="4" w:color="C9D4DF"/>
+            </w:tcBorders>
+          </w:tcPr>
+          <w:p>
+            <w:pPr>
+              <w:spacing w:line="288" w:lineRule="auto" w:before="60" w:after="60"/>
             </w:pPr>
             <w:r>
               <w:rPr>
@@ -2621,35 +2480,23 @@
                 <w:color w:val="000000"/>
                 <w:sz w:val="21"/>
               </w:rPr>
-              <w:t>B</w:t>
-            </w:r>
-          </w:p>
-        </w:tc>
-        <w:tc>
-          <w:tcPr>
-            <w:tcW w:type="dxa" w:w="2665"/>
-            <w:vAlign w:val="center"/>
-            <w:tcBorders>
-              <w:top w:val="single" w:sz="4" w:color="D9D9D9"/>
-              <w:left w:val="single" w:sz="4" w:color="D9D9D9"/>
-              <w:bottom w:val="single" w:sz="4" w:color="D9D9D9"/>
-              <w:right w:val="single" w:sz="4" w:color="D9D9D9"/>
-              <w:top w:val="single" w:sz="4" w:color="D9D9D9"/>
-              <w:left w:val="single" w:sz="4" w:color="D9D9D9"/>
-              <w:bottom w:val="single" w:sz="4" w:color="D9D9D9"/>
-              <w:right w:val="single" w:sz="4" w:color="D9D9D9"/>
-            </w:tcBorders>
-            <w:tcMar>
-              <w:top w:w="75" w:type="dxa"/>
-              <w:left w:w="75" w:type="dxa"/>
-              <w:bottom w:w="75" w:type="dxa"/>
-              <w:right w:w="75" w:type="dxa"/>
-            </w:tcMar>
-          </w:tcPr>
-          <w:p>
-            <w:pPr>
-              <w:keepNext/>
-              <w:spacing w:after="40" w:line="288" w:lineRule="auto" w:before="40"/>
+              <w:t>服务器</w:t>
+            </w:r>
+          </w:p>
+        </w:tc>
+        <w:tc>
+          <w:tcPr>
+            <w:tcW w:type="dxa" w:w="4535"/>
+            <w:tcBorders>
+              <w:top w:val="single" w:sz="4" w:color="C9D4DF"/>
+              <w:left w:val="single" w:sz="4" w:color="C9D4DF"/>
+              <w:bottom w:val="single" w:sz="4" w:color="C9D4DF"/>
+              <w:right w:val="single" w:sz="4" w:color="C9D4DF"/>
+            </w:tcBorders>
+          </w:tcPr>
+          <w:p>
+            <w:pPr>
+              <w:spacing w:line="288" w:lineRule="auto" w:before="60" w:after="60"/>
             </w:pPr>
             <w:r>
               <w:rPr>
@@ -2658,35 +2505,23 @@
                 <w:color w:val="000000"/>
                 <w:sz w:val="21"/>
               </w:rPr>
-              <w:t>同态汇总与受控解密</w:t>
-            </w:r>
-          </w:p>
-        </w:tc>
-        <w:tc>
-          <w:tcPr>
-            <w:tcW w:type="dxa" w:w="5726"/>
-            <w:vAlign w:val="center"/>
-            <w:tcBorders>
-              <w:top w:val="single" w:sz="4" w:color="D9D9D9"/>
-              <w:left w:val="single" w:sz="4" w:color="D9D9D9"/>
-              <w:bottom w:val="single" w:sz="4" w:color="D9D9D9"/>
-              <w:right w:val="single" w:sz="4" w:color="D9D9D9"/>
-              <w:top w:val="single" w:sz="4" w:color="D9D9D9"/>
-              <w:left w:val="single" w:sz="4" w:color="D9D9D9"/>
-              <w:bottom w:val="single" w:sz="4" w:color="D9D9D9"/>
-              <w:right w:val="single" w:sz="4" w:color="D9D9D9"/>
-            </w:tcBorders>
-            <w:tcMar>
-              <w:top w:w="75" w:type="dxa"/>
-              <w:left w:w="75" w:type="dxa"/>
-              <w:bottom w:w="75" w:type="dxa"/>
-              <w:right w:w="75" w:type="dxa"/>
-            </w:tcMar>
-          </w:tcPr>
-          <w:p>
-            <w:pPr>
-              <w:keepNext/>
-              <w:spacing w:after="40" w:line="288" w:lineRule="auto" w:before="40"/>
+              <w:t>认证登记、关闭、密文汇总与结果发布</w:t>
+            </w:r>
+          </w:p>
+        </w:tc>
+        <w:tc>
+          <w:tcPr>
+            <w:tcW w:type="dxa" w:w="2948"/>
+            <w:tcBorders>
+              <w:top w:val="single" w:sz="4" w:color="C9D4DF"/>
+              <w:left w:val="single" w:sz="4" w:color="C9D4DF"/>
+              <w:bottom w:val="single" w:sz="4" w:color="C9D4DF"/>
+              <w:right w:val="single" w:sz="4" w:color="C9D4DF"/>
+            </w:tcBorders>
+          </w:tcPr>
+          <w:p>
+            <w:pPr>
+              <w:spacing w:line="288" w:lineRule="auto" w:before="60" w:after="60"/>
             </w:pPr>
             <w:r>
               <w:rPr>
@@ -2695,38 +2530,25 @@
                 <w:color w:val="000000"/>
                 <w:sz w:val="21"/>
               </w:rPr>
-              <w:t>独立解密进程、总票数校验；准确性与性能实验</w:t>
+              <w:t>TLS和登记签名密钥、票码摘要</w:t>
             </w:r>
           </w:p>
         </w:tc>
       </w:tr>
       <w:tr>
-        <w:trPr/>
-        <w:tc>
-          <w:tcPr>
-            <w:tcW w:type="dxa" w:w="794"/>
-            <w:vAlign w:val="center"/>
-            <w:tcBorders>
-              <w:top w:val="single" w:sz="4" w:color="D9D9D9"/>
-              <w:left w:val="single" w:sz="4" w:color="D9D9D9"/>
-              <w:bottom w:val="single" w:sz="4" w:color="D9D9D9"/>
-              <w:right w:val="single" w:sz="4" w:color="D9D9D9"/>
-              <w:top w:val="single" w:sz="4" w:color="D9D9D9"/>
-              <w:left w:val="single" w:sz="4" w:color="D9D9D9"/>
-              <w:bottom w:val="single" w:sz="4" w:color="D9D9D9"/>
-              <w:right w:val="single" w:sz="4" w:color="D9D9D9"/>
-            </w:tcBorders>
-            <w:tcMar>
-              <w:top w:w="75" w:type="dxa"/>
-              <w:left w:w="75" w:type="dxa"/>
-              <w:bottom w:w="75" w:type="dxa"/>
-              <w:right w:w="75" w:type="dxa"/>
-            </w:tcMar>
-          </w:tcPr>
-          <w:p>
-            <w:pPr>
-              <w:keepNext w:val="0"/>
-              <w:spacing w:after="40" w:line="288" w:lineRule="auto" w:before="40"/>
+        <w:tc>
+          <w:tcPr>
+            <w:tcW w:type="dxa" w:w="1361"/>
+            <w:tcBorders>
+              <w:top w:val="single" w:sz="4" w:color="C9D4DF"/>
+              <w:left w:val="single" w:sz="4" w:color="C9D4DF"/>
+              <w:bottom w:val="single" w:sz="4" w:color="C9D4DF"/>
+              <w:right w:val="single" w:sz="4" w:color="C9D4DF"/>
+            </w:tcBorders>
+          </w:tcPr>
+          <w:p>
+            <w:pPr>
+              <w:spacing w:line="288" w:lineRule="auto" w:before="60" w:after="60"/>
             </w:pPr>
             <w:r>
               <w:rPr>
@@ -2735,35 +2557,23 @@
                 <w:color w:val="000000"/>
                 <w:sz w:val="21"/>
               </w:rPr>
-              <w:t>C</w:t>
-            </w:r>
-          </w:p>
-        </w:tc>
-        <w:tc>
-          <w:tcPr>
-            <w:tcW w:type="dxa" w:w="2665"/>
-            <w:vAlign w:val="center"/>
-            <w:tcBorders>
-              <w:top w:val="single" w:sz="4" w:color="D9D9D9"/>
-              <w:left w:val="single" w:sz="4" w:color="D9D9D9"/>
-              <w:bottom w:val="single" w:sz="4" w:color="D9D9D9"/>
-              <w:right w:val="single" w:sz="4" w:color="D9D9D9"/>
-              <w:top w:val="single" w:sz="4" w:color="D9D9D9"/>
-              <w:left w:val="single" w:sz="4" w:color="D9D9D9"/>
-              <w:bottom w:val="single" w:sz="4" w:color="D9D9D9"/>
-              <w:right w:val="single" w:sz="4" w:color="D9D9D9"/>
-            </w:tcBorders>
-            <w:tcMar>
-              <w:top w:w="75" w:type="dxa"/>
-              <w:left w:w="75" w:type="dxa"/>
-              <w:bottom w:w="75" w:type="dxa"/>
-              <w:right w:w="75" w:type="dxa"/>
-            </w:tcMar>
-          </w:tcPr>
-          <w:p>
-            <w:pPr>
-              <w:keepNext w:val="0"/>
-              <w:spacing w:after="40" w:line="288" w:lineRule="auto" w:before="40"/>
+              <w:t>保管端</w:t>
+            </w:r>
+          </w:p>
+        </w:tc>
+        <w:tc>
+          <w:tcPr>
+            <w:tcW w:type="dxa" w:w="4535"/>
+            <w:tcBorders>
+              <w:top w:val="single" w:sz="4" w:color="C9D4DF"/>
+              <w:left w:val="single" w:sz="4" w:color="C9D4DF"/>
+              <w:bottom w:val="single" w:sz="4" w:color="C9D4DF"/>
+              <w:right w:val="single" w:sz="4" w:color="C9D4DF"/>
+            </w:tcBorders>
+          </w:tcPr>
+          <w:p>
+            <w:pPr>
+              <w:spacing w:line="288" w:lineRule="auto" w:before="60" w:after="60"/>
             </w:pPr>
             <w:r>
               <w:rPr>
@@ -2772,35 +2582,23 @@
                 <w:color w:val="000000"/>
                 <w:sz w:val="21"/>
               </w:rPr>
-              <w:t>界面与签名审计</w:t>
-            </w:r>
-          </w:p>
-        </w:tc>
-        <w:tc>
-          <w:tcPr>
-            <w:tcW w:type="dxa" w:w="5726"/>
-            <w:vAlign w:val="center"/>
-            <w:tcBorders>
-              <w:top w:val="single" w:sz="4" w:color="D9D9D9"/>
-              <w:left w:val="single" w:sz="4" w:color="D9D9D9"/>
-              <w:bottom w:val="single" w:sz="4" w:color="D9D9D9"/>
-              <w:right w:val="single" w:sz="4" w:color="D9D9D9"/>
-              <w:top w:val="single" w:sz="4" w:color="D9D9D9"/>
-              <w:left w:val="single" w:sz="4" w:color="D9D9D9"/>
-              <w:bottom w:val="single" w:sz="4" w:color="D9D9D9"/>
-              <w:right w:val="single" w:sz="4" w:color="D9D9D9"/>
-            </w:tcBorders>
-            <w:tcMar>
-              <w:top w:w="75" w:type="dxa"/>
-              <w:left w:w="75" w:type="dxa"/>
-              <w:bottom w:w="75" w:type="dxa"/>
-              <w:right w:w="75" w:type="dxa"/>
-            </w:tcMar>
-          </w:tcPr>
-          <w:p>
-            <w:pPr>
-              <w:keepNext w:val="0"/>
-              <w:spacing w:after="40" w:line="288" w:lineRule="auto" w:before="40"/>
+              <w:t>离线核验完整汇总、解密并签署总票</w:t>
+            </w:r>
+          </w:p>
+        </w:tc>
+        <w:tc>
+          <w:tcPr>
+            <w:tcW w:type="dxa" w:w="2948"/>
+            <w:tcBorders>
+              <w:top w:val="single" w:sz="4" w:color="C9D4DF"/>
+              <w:left w:val="single" w:sz="4" w:color="C9D4DF"/>
+              <w:bottom w:val="single" w:sz="4" w:color="C9D4DF"/>
+              <w:right w:val="single" w:sz="4" w:color="C9D4DF"/>
+            </w:tcBorders>
+          </w:tcPr>
+          <w:p>
+            <w:pPr>
+              <w:spacing w:line="288" w:lineRule="auto" w:before="60" w:after="60"/>
             </w:pPr>
             <w:r>
               <w:rPr>
@@ -2809,7 +2607,7 @@
                 <w:color w:val="000000"/>
                 <w:sz w:val="21"/>
               </w:rPr>
-              <w:t>ID校验、关闭状态、签名清单、GUI与打包测试</w:t>
+              <w:t>Paillier私钥、结果签名私钥</w:t>
             </w:r>
           </w:p>
         </w:tc>
@@ -2820,7 +2618,7 @@
         <w:pStyle w:val="ReportBody"/>
       </w:pPr>
       <w:r>
-        <w:t>公开选票由A交给C登记，C把签名清单与密文交给B汇总，B向保管端提交完整汇总请求。各角色报告分别讨论编码与密钥、汇总与解密、界面与审计；实际姓名、学号和完成记录由成员核对填写。</w:t>
+        <w:t>网络接口均以/api为前缀，以JSON交换数据：election和status返回公开状态；ballots只接受密文选票；me返回绑定身份和本人回执；管理员使用close、export和results。服务器不提供接收明文choice、私钥或保管口令的接口。</w:t>
       </w:r>
     </w:p>
     <w:p>
@@ -2828,38 +2626,50 @@
         <w:pStyle w:val="ReportH1"/>
       </w:pPr>
       <w:r>
+        <w:t>三、相关功能模块详细设计</w:t>
+      </w:r>
+    </w:p>
+    <w:p>
+      <w:pPr>
+        <w:pStyle w:val="ReportH2"/>
+      </w:pPr>
+      <w:r>
+        <w:t>3.1 同态加密原理与计票过程</w:t>
+      </w:r>
+    </w:p>
+    <w:p>
+      <w:pPr>
+        <w:pStyle w:val="ReportBody"/>
+      </w:pPr>
+      <w:r>
+        <w:t>Paillier密钥取不同素数p、q，令n=pq、g=n+1。明文m使用与n互素的独立随机数r加密：c=</w:t>
+      </w:r>
+      <w:r>
+        <w:t>g</w:t>
+      </w:r>
+      <w:r>
         <w:rPr>
-          <w:rFonts w:ascii="Times New Roman" w:hAnsi="Times New Roman" w:eastAsia="宋体"/>
-          <w:b/>
-          <w:color w:val="000000"/>
-          <w:sz w:val="28"/>
+          <w:vertAlign w:val="superscript"/>
         </w:rPr>
-        <w:t>三、相关功能模块详细设计</w:t>
-      </w:r>
-    </w:p>
-    <w:p>
-      <w:pPr>
-        <w:pStyle w:val="ReportH2"/>
-      </w:pPr>
+        <w:t>m</w:t>
+      </w:r>
+      <w:r>
+        <w:t xml:space="preserve"> </w:t>
+      </w:r>
+      <w:r>
+        <w:t>r</w:t>
+      </w:r>
       <w:r>
         <w:rPr>
-          <w:rFonts w:ascii="Times New Roman" w:hAnsi="Times New Roman" w:eastAsia="宋体"/>
-          <w:b/>
-          <w:color w:val="000000"/>
-          <w:sz w:val="24"/>
+          <w:vertAlign w:val="superscript"/>
         </w:rPr>
-        <w:t>3.1 密钥生成与数学原理</w:t>
-      </w:r>
-    </w:p>
-    <w:p>
-      <w:pPr>
-        <w:pStyle w:val="ReportBody"/>
-      </w:pPr>
-      <w:r>
-        <w:t>密钥生成取不同大素数p、q，令n=pq、g=n+1；私钥可用λ=lcm(p−1,q−1)与μ表示，其中μ是L(</w:t>
-      </w:r>
-      <w:r>
-        <w:t>g</w:t>
+        <w:t>n</w:t>
+      </w:r>
+      <w:r>
+        <w:t xml:space="preserve"> mod n²。私钥可用λ=lcm(p−1,q−1)与μ表示，解密为m=L(</w:t>
+      </w:r>
+      <w:r>
+        <w:t>c</w:t>
       </w:r>
       <w:r>
         <w:rPr>
@@ -2868,43 +2678,7 @@
         <w:t>λ</w:t>
       </w:r>
       <w:r>
-        <w:t xml:space="preserve"> mod n²)的模n逆元，L(u)=(u−1)/n。加密为c=</w:t>
-      </w:r>
-      <w:r>
-        <w:t>g</w:t>
-      </w:r>
-      <w:r>
-        <w:rPr>
-          <w:vertAlign w:val="superscript"/>
-        </w:rPr>
-        <w:t>m</w:t>
-      </w:r>
-      <w:r>
-        <w:t xml:space="preserve"> </w:t>
-      </w:r>
-      <w:r>
-        <w:t>r</w:t>
-      </w:r>
-      <w:r>
-        <w:rPr>
-          <w:vertAlign w:val="superscript"/>
-        </w:rPr>
-        <w:t>n</w:t>
-      </w:r>
-      <w:r>
-        <w:t xml:space="preserve"> mod n²，r与n互素；解密为m=L(</w:t>
-      </w:r>
-      <w:r>
-        <w:t>c</w:t>
-      </w:r>
-      <w:r>
-        <w:rPr>
-          <w:vertAlign w:val="superscript"/>
-        </w:rPr>
-        <w:t>λ</w:t>
-      </w:r>
-      <w:r>
-        <w:t xml:space="preserve"> mod n²)μ mod n。phe实现以p、q和CRT加速，教学公式不等同于源码逐行实现。</w:t>
+        <w:t xml:space="preserve"> mod n²)μ mod n，其中L(u)=(u−1)/n；phe实现利用p、q及CRT加速[2]。</w:t>
       </w:r>
     </w:p>
     <w:p>
@@ -2912,7 +2686,7 @@
         <w:pStyle w:val="ReportBody"/>
       </w:pPr>
       <w:r>
-        <w:t>同态关系为E(a;r₁)·E(b;r₂) mod n² = E((a+b) mod n;r₁r₂ mod n)。逐列相乘可累计各选项的0或1，最后只解密各列总票。参与人数上限10000远小于n，不会产生票数模n回绕。该关系由原语接口[2]及E(2)·E(3)解密为5的实测共同核对。</w:t>
+        <w:t>同态关系为E(a;r₁)E(b;r₂) mod n² = E((a+b) mod n;r₁r₂ mod n)。单选编码为独热向量，服务器对每个选项分别累乘密文，得到计数之和的加密形式。人数上限10000远小于2048位n，因此正常计数不会模n回绕。服务器计算列乘积无需解密。</w:t>
       </w:r>
     </w:p>
     <w:p>
@@ -2920,13 +2694,7 @@
         <w:pStyle w:val="ReportH2"/>
       </w:pPr>
       <w:r>
-        <w:rPr>
-          <w:rFonts w:ascii="Times New Roman" w:hAnsi="Times New Roman" w:eastAsia="宋体"/>
-          <w:b/>
-          <w:color w:val="000000"/>
-          <w:sz w:val="24"/>
-        </w:rPr>
-        <w:t>3.2 独热编码与动态票型</w:t>
+        <w:t>3.2 本模块设计</w:t>
       </w:r>
     </w:p>
     <w:p>
@@ -2934,13 +2702,7 @@
         <w:pStyle w:val="ReportBody"/>
       </w:pPr>
       <w:r>
-        <w:rPr>
-          <w:rFonts w:ascii="Times New Roman" w:hAnsi="Times New Roman" w:eastAsia="宋体"/>
-          <w:b w:val="0"/>
-          <w:color w:val="000000"/>
-          <w:sz w:val="24"/>
-        </w:rPr>
-        <w:t>三选项的编码分别为[1,0,0]、[0,1,0]、[0,0,1]。对每个分量独立随机加密，维度由本轮options确定。每张票的ballot_type为single_choice，含投票者ID、UTC时间戳和128位随机标识。公开文件不写入choice字段，也不记录Paillier加密随机数r；公开r会削弱对小明文集合的保护。</w:t>
+        <w:t>凭证包含随机票码、绑定ID、轮次、配置摘要和TLS证书指纹。连接过程先建立TLS并比较证书SHA-256，再发送票码；取得公开配置后还要与凭证摘要比较。加密调用只依赖公钥n与用户选择，返回密文向量。独立随机数使相同选择产生不同密文，公开nonce只用于记录唯一性，不能作为Paillier内部随机数r。</w:t>
       </w:r>
     </w:p>
     <w:p>
@@ -2948,13 +2710,7 @@
         <w:pStyle w:val="ReportH2"/>
       </w:pPr>
       <w:r>
-        <w:rPr>
-          <w:rFonts w:ascii="Times New Roman" w:hAnsi="Times New Roman" w:eastAsia="宋体"/>
-          <w:b/>
-          <w:color w:val="000000"/>
-          <w:sz w:val="24"/>
-        </w:rPr>
-        <w:t>3.3 密钥生命周期</w:t>
+        <w:t>3.3 验证与失败处理</w:t>
       </w:r>
     </w:p>
     <w:p>
@@ -2962,13 +2718,7 @@
         <w:pStyle w:val="ReportBody"/>
       </w:pPr>
       <w:r>
-        <w:rPr>
-          <w:rFonts w:ascii="Times New Roman" w:hAnsi="Times New Roman" w:eastAsia="宋体"/>
-          <w:b w:val="0"/>
-          <w:color w:val="000000"/>
-          <w:sz w:val="24"/>
-        </w:rPr>
-        <w:t>创建阶段生成Paillier私钥和登记签名密钥，使用scrypt派生32字节密钥，以AES-GCM加密保存到private/trustee.vault。scrypt参数为N=32768、r=8、p=1，盐16字节，nonce为12字节，投票轮次作为附加认证数据。创建后Election对象仅持有登记签名密钥；完整私钥仅在授权操作期间进入内存。Python不保证敏感对象即时擦除。</w:t>
+        <w:t>票码使用系统随机数生成并在服务器仅保存SHA-256摘要。TLS证书指纹固定在凭证中，客户端先验指纹后发送票码。接收端检查字段、轮次、ID、密文维度与合法密文空间；关闭与登记在SQLite事务内处理。保管端结果绑定完整汇总摘要，服务器和客户端分别核验Ed25519签名[3]。</w:t>
       </w:r>
     </w:p>
     <w:p>
@@ -2984,12 +2734,11 @@
         <w:pStyle w:val="ReportCaption"/>
         <w:keepNext/>
       </w:pPr>
-      <w:r/>
       <w:r>
         <w:drawing>
           <wp:inline xmlns:a="http://schemas.openxmlformats.org/drawingml/2006/main" xmlns:pic="http://schemas.openxmlformats.org/drawingml/2006/picture">
             <wp:extent cx="5760000" cy="3456000"/>
-            <wp:docPr id="2" name="Picture 2"/>
+            <wp:docPr id="1" name="Picture 1"/>
             <wp:cNvGraphicFramePr>
               <a:graphicFrameLocks noChangeAspect="1"/>
             </wp:cNvGraphicFramePr>
@@ -2997,11 +2746,11 @@
               <a:graphicData uri="http://schemas.openxmlformats.org/drawingml/2006/picture">
                 <pic:pic>
                   <pic:nvPicPr>
-                    <pic:cNvPr id="0" name="flow-A.png"/>
+                    <pic:cNvPr id="0" name="A-flow.png"/>
                     <pic:cNvPicPr/>
                   </pic:nvPicPr>
                   <pic:blipFill>
-                    <a:blip r:embed="rId12"/>
+                    <a:blip r:embed="rId13"/>
                     <a:stretch>
                       <a:fillRect/>
                     </a:stretch>
@@ -3025,7 +2774,7 @@
         <w:pStyle w:val="ReportCaption"/>
       </w:pPr>
       <w:r>
-        <w:t>图1 本模块处理流程与失败出口</w:t>
+        <w:t>图1 本模块处理流程及失败出口</w:t>
       </w:r>
     </w:p>
     <w:p>
@@ -3033,49 +2782,19 @@
         <w:pStyle w:val="ReportH2"/>
       </w:pPr>
       <w:r>
-        <w:rPr>
-          <w:rFonts w:ascii="Times New Roman" w:hAnsi="Times New Roman" w:eastAsia="宋体"/>
-          <w:b/>
-          <w:color w:val="000000"/>
-          <w:sz w:val="24"/>
-        </w:rPr>
-        <w:t>3.5 威胁模型与安全边界</w:t>
-      </w:r>
-    </w:p>
-    <w:p>
-      <w:pPr>
-        <w:pStyle w:val="ReportBody"/>
-      </w:pPr>
-      <w:r>
-        <w:rPr>
-          <w:rFonts w:ascii="Times New Roman" w:hAnsi="Times New Roman" w:eastAsia="宋体"/>
-          <w:b w:val="0"/>
-          <w:color w:val="000000"/>
-          <w:sz w:val="24"/>
-        </w:rPr>
-        <w:t>假设攻击者能够读取或修改公开选票目录，但不能获得保管口令和签名私钥，最初的公钥配置已可信确认。保护目标是隐藏单票选择并发现相对于签名清单的文件变化。应用运行在一台电脑上，角色隔离是教学流程；创建与解锁阶段可短暂接触完整密钥材料，不构成互不信任机构之间的物理隔离。</w:t>
-      </w:r>
-    </w:p>
-    <w:p>
-      <w:pPr>
-        <w:pStyle w:val="ReportH2"/>
-      </w:pPr>
-      <w:r>
-        <w:t>3.6 模块界面与数据说明</w:t>
-      </w:r>
-    </w:p>
-    <w:p>
-      <w:pPr>
-        <w:pStyle w:val="ReportBody"/>
+        <w:t>3.5 模块界面与角色隔离</w:t>
+      </w:r>
+    </w:p>
+    <w:p>
+      <w:pPr>
+        <w:pStyle w:val="ReportCaption"/>
         <w:keepNext/>
-        <w:ind w:firstLine="0"/>
-        <w:jc w:val="center"/>
       </w:pPr>
       <w:r>
         <w:drawing>
           <wp:inline xmlns:a="http://schemas.openxmlformats.org/drawingml/2006/main" xmlns:pic="http://schemas.openxmlformats.org/drawingml/2006/picture">
-            <wp:extent cx="5796000" cy="4027729"/>
-            <wp:docPr id="1" name="Picture 1"/>
+            <wp:extent cx="5760000" cy="4143157"/>
+            <wp:docPr id="2" name="Picture 2"/>
             <wp:cNvGraphicFramePr>
               <a:graphicFrameLocks noChangeAspect="1"/>
             </wp:cNvGraphicFramePr>
@@ -3083,11 +2802,11 @@
               <a:graphicData uri="http://schemas.openxmlformats.org/drawingml/2006/picture">
                 <pic:pic>
                   <pic:nvPicPr>
-                    <pic:cNvPr id="0" name="02_voting.png"/>
+                    <pic:cNvPr id="0" name="01_connected.png"/>
                     <pic:cNvPicPr/>
                   </pic:nvPicPr>
                   <pic:blipFill>
-                    <a:blip r:embed="rId11"/>
+                    <a:blip r:embed="rId14"/>
                     <a:stretch>
                       <a:fillRect/>
                     </a:stretch>
@@ -3095,7 +2814,7 @@
                   <pic:spPr>
                     <a:xfrm>
                       <a:off x="0" y="0"/>
-                      <a:ext cx="5796000" cy="4027729"/>
+                      <a:ext cx="5760000" cy="4143157"/>
                     </a:xfrm>
                     <a:prstGeom prst="rect"/>
                   </pic:spPr>
@@ -3111,7 +2830,23 @@
         <w:pStyle w:val="ReportCaption"/>
       </w:pPr>
       <w:r>
-        <w:t>图2 加密投票页的公开元数据</w:t>
+        <w:t>图2 投票端输入IP、端口并验证凭证后取得选项</w:t>
+      </w:r>
+    </w:p>
+    <w:p>
+      <w:pPr>
+        <w:pStyle w:val="ReportBody"/>
+      </w:pPr>
+      <w:r>
+        <w:t>图2来自本轮Windows原生Qt实际运行。投票人和管理员导入不同凭证，连接同一端口后得到各自权限。实际部署只向服务器复制server目录，保管端通过公开汇总文件与签名结果文件交接；同机测试使用独立目录和进程，不能声称已建立物理隔离。</w:t>
+      </w:r>
+    </w:p>
+    <w:p>
+      <w:pPr>
+        <w:pStyle w:val="ReportH1"/>
+      </w:pPr>
+      <w:r>
+        <w:t>四、部分核心代码</w:t>
       </w:r>
     </w:p>
     <w:p>
@@ -3119,62 +2854,6 @@
         <w:pStyle w:val="ReportH2"/>
       </w:pPr>
       <w:r>
-        <w:t>3.7 公开数据与私有数据</w:t>
-      </w:r>
-    </w:p>
-    <w:p>
-      <w:pPr>
-        <w:pStyle w:val="ReportBody"/>
-      </w:pPr>
-      <w:r>
-        <w:rPr>
-          <w:rFonts w:ascii="Times New Roman" w:hAnsi="Times New Roman" w:eastAsia="宋体"/>
-          <w:b w:val="0"/>
-          <w:color w:val="000000"/>
-          <w:sz w:val="24"/>
-        </w:rPr>
-        <w:t>public/config.json保存标题、选项、名单、Paillier公钥n和审计公钥；public/ballots保存每张加密选票；public/manifest.json保存签名清单。private/trustee.vault保存加密后的私钥材料。公开包不包含private目录。口令经标准输入管道交给解密子进程，不放入命令行或日志。</w:t>
-      </w:r>
-    </w:p>
-    <w:p>
-      <w:pPr>
-        <w:pStyle w:val="ReportBody"/>
-      </w:pPr>
-      <w:r>
-        <w:rPr>
-          <w:rFonts w:ascii="Times New Roman" w:hAnsi="Times New Roman" w:eastAsia="宋体"/>
-          <w:b w:val="0"/>
-          <w:color w:val="000000"/>
-          <w:sz w:val="24"/>
-        </w:rPr>
-        <w:t>选票的时间戳、ID与随机标识属于公开元数据，隐私目标是投票内容保密，不是投票者匿名。演示和自动实验均使用虚构ID及合成选票。</w:t>
-      </w:r>
-    </w:p>
-    <w:p>
-      <w:pPr>
-        <w:pStyle w:val="ReportH1"/>
-      </w:pPr>
-      <w:r>
-        <w:rPr>
-          <w:rFonts w:ascii="Times New Roman" w:hAnsi="Times New Roman" w:eastAsia="宋体"/>
-          <w:b/>
-          <w:color w:val="000000"/>
-          <w:sz w:val="28"/>
-        </w:rPr>
-        <w:t>四、部分核心代码</w:t>
-      </w:r>
-    </w:p>
-    <w:p>
-      <w:pPr>
-        <w:pStyle w:val="ReportH2"/>
-      </w:pPr>
-      <w:r>
-        <w:rPr>
-          <w:rFonts w:ascii="Times New Roman" w:hAnsi="Times New Roman" w:eastAsia="宋体"/>
-          <w:b/>
-          <w:color w:val="000000"/>
-          <w:sz w:val="24"/>
-        </w:rPr>
         <w:t>4.1 核心实现片段</w:t>
       </w:r>
     </w:p>
@@ -3184,19 +2863,13 @@
         <w:keepNext/>
       </w:pPr>
       <w:r>
-        <w:rPr>
-          <w:rFonts w:ascii="Times New Roman" w:hAnsi="Times New Roman" w:eastAsia="宋体"/>
-          <w:b w:val="0"/>
-          <w:color w:val="000000"/>
-          <w:sz w:val="24"/>
-        </w:rPr>
-        <w:t>以下片段摘自 crypto_service.py，完整上下文与异常处理见随附源代码。</w:t>
+        <w:t>以下片段摘自network_client.py中NetworkClient.vote，按版面折行；后续还核对ID、轮次和密文摘要。完整异常处理和调用上下文以源码为准。</w:t>
       </w:r>
     </w:p>
     <w:p>
       <w:pPr>
         <w:pStyle w:val="ReportCode"/>
-        <w:keepNext w:val="0"/>
+        <w:keepLines/>
       </w:pPr>
       <w:r>
         <w:rPr>
@@ -3205,35 +2878,25 @@
           <w:color w:val="000000"/>
           <w:sz w:val="20"/>
         </w:rPr>
-        <w:t xml:space="preserve">    if type(choice) is not int or not 0 &lt;= choice &lt; len(config['options']):</w:t>
+        <w:t>started = perf_counter()</w:t>
         <w:br/>
-        <w:t xml:space="preserve">        raise VoteError('必须且只能选择一个有效选项')</w:t>
+        <w:t>ballot = encrypt_ballot(</w:t>
         <w:br/>
-        <w:t xml:space="preserve">    if voter_id not in config['roster']:</w:t>
+        <w:t xml:space="preserve">    self.election['config'], self.ticket['voter_id'], choice)</w:t>
         <w:br/>
-        <w:t xml:space="preserve">        raise VoteError('投票者ID不在授权名单内')</w:t>
+        <w:t>encrypted = perf_counter()</w:t>
         <w:br/>
-        <w:t xml:space="preserve">    pub = public_key(config)</w:t>
+        <w:t>response = self.request(</w:t>
         <w:br/>
-        <w:t xml:space="preserve">    encrypted = [</w:t>
+        <w:t xml:space="preserve">    'POST', '/api/ballots', {'ballot': ballot})</w:t>
         <w:br/>
-        <w:t xml:space="preserve">        str(pub.raw_encrypt(int(i == choice)))</w:t>
+        <w:t>received = perf_counter()</w:t>
         <w:br/>
-        <w:t xml:space="preserve">        for i in range(len(config['options']))</w:t>
+        <w:t>receipt = response['receipt']</w:t>
         <w:br/>
-        <w:t xml:space="preserve">    ]</w:t>
+        <w:t>payload = verify_object(</w:t>
         <w:br/>
-        <w:t xml:space="preserve">    return {</w:t>
-        <w:br/>
-        <w:t xml:space="preserve">        'version': 1, 'election_id': config['election_id'],</w:t>
-        <w:br/>
-        <w:t xml:space="preserve">        'voter_id': voter_id, 'ballot_type': 'single_choice',</w:t>
-        <w:br/>
-        <w:t xml:space="preserve">        'timestamp': now(), 'nonce': uuid.uuid4().hex,</w:t>
-        <w:br/>
-        <w:t xml:space="preserve">        'ciphertexts': encrypted,</w:t>
-        <w:br/>
-        <w:t xml:space="preserve">    }</w:t>
+        <w:t xml:space="preserve">    receipt, self.election['config']['audit_public_key'])</w:t>
       </w:r>
     </w:p>
     <w:p>
@@ -3241,13 +2904,7 @@
         <w:pStyle w:val="ReportH2"/>
       </w:pPr>
       <w:r>
-        <w:rPr>
-          <w:rFonts w:ascii="Times New Roman" w:hAnsi="Times New Roman" w:eastAsia="宋体"/>
-          <w:b/>
-          <w:color w:val="000000"/>
-          <w:sz w:val="24"/>
-        </w:rPr>
-        <w:t>4.2 本模块可重复实验步骤</w:t>
+        <w:t>4.2 可重复实验步骤</w:t>
       </w:r>
     </w:p>
     <w:p>
@@ -3255,13 +2912,7 @@
         <w:pStyle w:val="ReportBody"/>
       </w:pPr>
       <w:r>
-        <w:rPr>
-          <w:rFonts w:ascii="Times New Roman" w:hAnsi="Times New Roman" w:eastAsia="宋体"/>
-          <w:b w:val="0"/>
-          <w:color w:val="000000"/>
-          <w:sz w:val="24"/>
-        </w:rPr>
-        <w:t>1．在创建页设置3个选项、12名投票者及至少8字符的保管口令，创建投票目录。检查public/config.json包含n而不包含p、q。</w:t>
+        <w:t>1．按照README安装依赖，在保管者电脑运行init生成新轮次。分发server目录、各人凭证；保留trustee目录和口令。</w:t>
       </w:r>
     </w:p>
     <w:p>
@@ -3269,13 +2920,7 @@
         <w:pStyle w:val="ReportBody"/>
       </w:pPr>
       <w:r>
-        <w:rPr>
-          <w:rFonts w:ascii="Times New Roman" w:hAnsi="Times New Roman" w:eastAsia="宋体"/>
-          <w:b w:val="0"/>
-          <w:color w:val="000000"/>
-          <w:sz w:val="24"/>
-        </w:rPr>
-        <w:t>2．依次用V0001至V0006提交第1、2、1、3、1、2个选项。每次提交后界面应清空选择，密文记录中不出现明文选项。</w:t>
+        <w:t>2．服务器运行serve指定目录、监听IP和端口。客户端启动默认界面，填写服务器IPv4地址和端口，导入本人凭证并连接。本机多端使用127.0.0.1。</w:t>
       </w:r>
     </w:p>
     <w:p>
@@ -3283,13 +2928,7 @@
         <w:pStyle w:val="ReportBody"/>
       </w:pPr>
       <w:r>
-        <w:rPr>
-          <w:rFonts w:ascii="Times New Roman" w:hAnsi="Times New Roman" w:eastAsia="宋体"/>
-          <w:b w:val="0"/>
-          <w:color w:val="000000"/>
-          <w:sz w:val="24"/>
-        </w:rPr>
-        <w:t>3．在自动实验中验证同一明文两次加密得到不同密文，并验证二者解密一致。随机加密不能用固定随机种子替代。</w:t>
+        <w:t>3．使用不同ID依次或同时投票，记录纸面预期计数。重复ID、名单冒用和错误指纹应被拒绝，关闭前不能导出汇总。</w:t>
       </w:r>
     </w:p>
     <w:p>
@@ -3297,13 +2936,7 @@
         <w:pStyle w:val="ReportBody"/>
       </w:pPr>
       <w:r>
-        <w:rPr>
-          <w:rFonts w:ascii="Times New Roman" w:hAnsi="Times New Roman" w:eastAsia="宋体"/>
-          <w:b w:val="0"/>
-          <w:color w:val="000000"/>
-          <w:sz w:val="24"/>
-        </w:rPr>
-        <w:t>4．输入名单外ID或越界索引，观察明确拒绝；错误私钥口令必须导致认证失败。</w:t>
+        <w:t>4．管理员关闭并导出密文汇总；保管端运行decrypt，输入本地口令，产生签名总票；管理员发布后，各端刷新核对结果。</w:t>
       </w:r>
     </w:p>
     <w:p>
@@ -3311,13 +2944,23 @@
         <w:pStyle w:val="ReportBody"/>
       </w:pPr>
       <w:r>
-        <w:rPr>
-          <w:rFonts w:ascii="Times New Roman" w:hAnsi="Times New Roman" w:eastAsia="宋体"/>
-          <w:b w:val="0"/>
-          <w:color w:val="000000"/>
-          <w:sz w:val="24"/>
-        </w:rPr>
-        <w:t>5．新建4选项轮次，每个选项各投一票，交由成员B计票，结果应为[1,1,1,1]。</w:t>
+        <w:t>5．重新连接检查回执，重启服务器检查状态；再初始化不同人数和选项的新轮次。跨电脑时核对防火墙与网络互通，现场结果单独记录。</w:t>
+      </w:r>
+    </w:p>
+    <w:p>
+      <w:pPr>
+        <w:pStyle w:val="ReportH1"/>
+      </w:pPr>
+      <w:r>
+        <w:t>五、课题完成过程中遇到的问题及解决方法</w:t>
+      </w:r>
+    </w:p>
+    <w:p>
+      <w:pPr>
+        <w:pStyle w:val="ReportH2"/>
+      </w:pPr>
+      <w:r>
+        <w:t>5.1 原实现问题与本轮修正</w:t>
       </w:r>
     </w:p>
     <w:p>
@@ -3325,27 +2968,15 @@
         <w:pStyle w:val="ReportBody"/>
       </w:pPr>
       <w:r>
-        <w:rPr>
-          <w:rFonts w:ascii="Times New Roman" w:hAnsi="Times New Roman" w:eastAsia="宋体"/>
-          <w:b w:val="0"/>
-          <w:color w:val="000000"/>
-          <w:sz w:val="24"/>
-        </w:rPr>
-        <w:t>6．运行自动实验，记录10、100、1000人三选项各3次加密耗时，分析每票需要3次公钥加密的成本。</w:t>
-      </w:r>
-    </w:p>
-    <w:p>
-      <w:pPr>
-        <w:pStyle w:val="ReportH1"/>
-      </w:pPr>
-      <w:r>
-        <w:rPr>
-          <w:rFonts w:ascii="Times New Roman" w:hAnsi="Times New Roman" w:eastAsia="宋体"/>
-          <w:b/>
-          <w:color w:val="000000"/>
-          <w:sz w:val="28"/>
-        </w:rPr>
-        <w:t>五、课题完成过程中遇到的问题及解决方法</w:t>
+        <w:t>从单机改为联网时，最容易出现“服务器接收choice后再加密”的形式改造。此次把encrypt_ballot调用放在NetworkClient.vote中，接口仅接受ballot对象。测试截取客户端实际发送的对象，并比较服务器SQLite内的内容，确认没有明文选择字段；另外检查服务器文件中不存在Paillier私钥p、q及保管端结果签名私钥。</w:t>
+      </w:r>
+    </w:p>
+    <w:p>
+      <w:pPr>
+        <w:pStyle w:val="ReportBody"/>
+      </w:pPr>
+      <w:r>
+        <w:t>单机阶段已有真实密码学运算，但没有网络收票服务器，因此原整体完成判断不充分。本次把联网架构作为主要实现，原单机入口仅保留为算法实验。实验记录和报告分别标注所属阶段，避免用旧单机测试证明多端可用。</w:t>
       </w:r>
     </w:p>
     <w:p>
@@ -3353,13 +2984,7 @@
         <w:pStyle w:val="ReportH2"/>
       </w:pPr>
       <w:r>
-        <w:rPr>
-          <w:rFonts w:ascii="Times New Roman" w:hAnsi="Times New Roman" w:eastAsia="宋体"/>
-          <w:b/>
-          <w:color w:val="000000"/>
-          <w:sz w:val="24"/>
-        </w:rPr>
-        <w:t>5.1 实验环境与记录来源</w:t>
+        <w:t>5.2 实验环境与结果</w:t>
       </w:r>
     </w:p>
     <w:p>
@@ -3367,15 +2992,7 @@
         <w:pStyle w:val="ReportBody"/>
       </w:pPr>
       <w:r>
-        <w:t>本轮实测日期为2026年10月27日（北京时间）。环境为Windows-11-10.0.26200-SP0，Python 3.12.14；phe 1.5.0、gmpy2 2.3.2、cryptography 50.0.2、PySide6-Essentials 6.12.0。核心实验使用2048位Paillier模数；9项工程回归使用1024位密钥加速边界检查，不作为安全强度示范。</w:t>
-      </w:r>
-    </w:p>
-    <w:p>
-      <w:pPr>
-        <w:pStyle w:val="ReportBody"/>
-      </w:pPr>
-      <w:r>
-        <w:t>自动核心实验29项全部符合预期，另有9项工程回归和原生Qt界面测试通过。原始记录位于evidence/2026-10-27/full/，包含JSON与CSV；源码SHA-256逐文件记入JSON。表2列出本模块相关结果。“局限”用例通过表示成功复现边界，不表示已防御。</w:t>
+        <w:t>本轮日期为2026年10月27日（北京时间），Windows 11 x64、Python 3.12.14，phe 1.5.0、gmpy2 2.3.2、cryptography 50.0.2、PySide6-Essentials 6.12.0。端到端验收采用2048位Paillier；18项联网边界测试使用1024位密钥加速，不作为安全强度示范。另有9项既有工程回归。</w:t>
       </w:r>
     </w:p>
     <w:p>
@@ -3384,126 +3001,90 @@
         <w:keepNext/>
       </w:pPr>
       <w:r>
-        <w:t>表2 本模块测试结果</w:t>
+        <w:t>表2 联网与交互验证结果</w:t>
       </w:r>
     </w:p>
     <w:tbl>
       <w:tblPr>
         <w:tblW w:type="auto" w:w="0"/>
-        <w:jc w:val="center"/>
         <w:tblLayout w:type="fixed"/>
         <w:tblLook w:firstColumn="1" w:firstRow="1" w:lastColumn="0" w:lastRow="0" w:noHBand="0" w:noVBand="1" w:val="04A0"/>
       </w:tblPr>
       <w:tblGrid>
-        <w:gridCol w:w="2551"/>
-        <w:gridCol w:w="6633"/>
+        <w:gridCol w:w="4677"/>
+        <w:gridCol w:w="4677"/>
       </w:tblGrid>
       <w:tr>
         <w:trPr>
           <w:tblHeader/>
-          <w:tblHeader/>
         </w:trPr>
         <w:tc>
           <w:tcPr>
-            <w:tcW w:type="dxa" w:w="2551"/>
-            <w:vAlign w:val="center"/>
-            <w:tcBorders>
-              <w:top w:val="single" w:sz="4" w:color="D9D9D9"/>
-              <w:left w:val="single" w:sz="4" w:color="D9D9D9"/>
-              <w:bottom w:val="single" w:sz="4" w:color="D9D9D9"/>
-              <w:right w:val="single" w:sz="4" w:color="D9D9D9"/>
-              <w:top w:val="single" w:sz="4" w:color="D9D9D9"/>
-              <w:left w:val="single" w:sz="4" w:color="D9D9D9"/>
-              <w:bottom w:val="single" w:sz="4" w:color="D9D9D9"/>
-              <w:right w:val="single" w:sz="4" w:color="D9D9D9"/>
-            </w:tcBorders>
-            <w:tcMar>
-              <w:top w:w="75" w:type="dxa"/>
-              <w:left w:w="75" w:type="dxa"/>
-              <w:bottom w:w="75" w:type="dxa"/>
-              <w:right w:w="75" w:type="dxa"/>
-            </w:tcMar>
-            <w:shd w:fill="E8EDF1"/>
-          </w:tcPr>
-          <w:p>
-            <w:pPr>
-              <w:spacing w:after="40" w:line="288" w:lineRule="auto" w:before="40"/>
-            </w:pPr>
-            <w:r>
-              <w:rPr>
-                <w:rFonts w:ascii="Times New Roman" w:hAnsi="Times New Roman" w:eastAsia="宋体"/>
-                <w:b/>
-                <w:color w:val="000000"/>
-                <w:sz w:val="21"/>
-              </w:rPr>
-              <w:t>实验项</w:t>
-            </w:r>
-          </w:p>
-        </w:tc>
-        <w:tc>
-          <w:tcPr>
-            <w:tcW w:type="dxa" w:w="6633"/>
-            <w:vAlign w:val="center"/>
-            <w:tcBorders>
-              <w:top w:val="single" w:sz="4" w:color="D9D9D9"/>
-              <w:left w:val="single" w:sz="4" w:color="D9D9D9"/>
-              <w:bottom w:val="single" w:sz="4" w:color="D9D9D9"/>
-              <w:right w:val="single" w:sz="4" w:color="D9D9D9"/>
-              <w:top w:val="single" w:sz="4" w:color="D9D9D9"/>
-              <w:left w:val="single" w:sz="4" w:color="D9D9D9"/>
-              <w:bottom w:val="single" w:sz="4" w:color="D9D9D9"/>
-              <w:right w:val="single" w:sz="4" w:color="D9D9D9"/>
-            </w:tcBorders>
-            <w:tcMar>
-              <w:top w:w="75" w:type="dxa"/>
-              <w:left w:w="75" w:type="dxa"/>
-              <w:bottom w:w="75" w:type="dxa"/>
-              <w:right w:w="75" w:type="dxa"/>
-            </w:tcMar>
-            <w:shd w:fill="E8EDF1"/>
-          </w:tcPr>
-          <w:p>
-            <w:pPr>
-              <w:spacing w:after="40" w:line="288" w:lineRule="auto" w:before="40"/>
-            </w:pPr>
-            <w:r>
-              <w:rPr>
-                <w:rFonts w:ascii="Times New Roman" w:hAnsi="Times New Roman" w:eastAsia="宋体"/>
-                <w:b/>
-                <w:color w:val="000000"/>
-                <w:sz w:val="21"/>
-              </w:rPr>
-              <w:t>实测结果</w:t>
+            <w:tcW w:type="dxa" w:w="2835"/>
+            <w:tcBorders>
+              <w:top w:val="single" w:sz="4" w:color="C9D4DF"/>
+              <w:left w:val="single" w:sz="4" w:color="C9D4DF"/>
+              <w:bottom w:val="single" w:sz="4" w:color="C9D4DF"/>
+              <w:right w:val="single" w:sz="4" w:color="C9D4DF"/>
+            </w:tcBorders>
+            <w:shd w:fill="E8EEF3"/>
+          </w:tcPr>
+          <w:p>
+            <w:pPr>
+              <w:spacing w:line="288" w:lineRule="auto" w:before="60" w:after="60"/>
+            </w:pPr>
+            <w:r>
+              <w:rPr>
+                <w:rFonts w:ascii="Times New Roman" w:hAnsi="Times New Roman" w:eastAsia="宋体"/>
+                <w:b/>
+                <w:color w:val="000000"/>
+                <w:sz w:val="21"/>
+              </w:rPr>
+              <w:t>项目</w:t>
+            </w:r>
+          </w:p>
+        </w:tc>
+        <w:tc>
+          <w:tcPr>
+            <w:tcW w:type="dxa" w:w="6009"/>
+            <w:tcBorders>
+              <w:top w:val="single" w:sz="4" w:color="C9D4DF"/>
+              <w:left w:val="single" w:sz="4" w:color="C9D4DF"/>
+              <w:bottom w:val="single" w:sz="4" w:color="C9D4DF"/>
+              <w:right w:val="single" w:sz="4" w:color="C9D4DF"/>
+            </w:tcBorders>
+            <w:shd w:fill="E8EEF3"/>
+          </w:tcPr>
+          <w:p>
+            <w:pPr>
+              <w:spacing w:line="288" w:lineRule="auto" w:before="60" w:after="60"/>
+            </w:pPr>
+            <w:r>
+              <w:rPr>
+                <w:rFonts w:ascii="Times New Roman" w:hAnsi="Times New Roman" w:eastAsia="宋体"/>
+                <w:b/>
+                <w:color w:val="000000"/>
+                <w:sz w:val="21"/>
+              </w:rPr>
+              <w:t>实际结果</w:t>
             </w:r>
           </w:p>
         </w:tc>
       </w:tr>
       <w:tr>
-        <w:trPr/>
-        <w:tc>
-          <w:tcPr>
-            <w:tcW w:type="dxa" w:w="2551"/>
-            <w:vAlign w:val="center"/>
-            <w:tcBorders>
-              <w:top w:val="single" w:sz="4" w:color="D9D9D9"/>
-              <w:left w:val="single" w:sz="4" w:color="D9D9D9"/>
-              <w:bottom w:val="single" w:sz="4" w:color="D9D9D9"/>
-              <w:right w:val="single" w:sz="4" w:color="D9D9D9"/>
-              <w:top w:val="single" w:sz="4" w:color="D9D9D9"/>
-              <w:left w:val="single" w:sz="4" w:color="D9D9D9"/>
-              <w:bottom w:val="single" w:sz="4" w:color="D9D9D9"/>
-              <w:right w:val="single" w:sz="4" w:color="D9D9D9"/>
-            </w:tcBorders>
-            <w:tcMar>
-              <w:top w:w="75" w:type="dxa"/>
-              <w:left w:w="75" w:type="dxa"/>
-              <w:bottom w:w="75" w:type="dxa"/>
-              <w:right w:w="75" w:type="dxa"/>
-            </w:tcMar>
-          </w:tcPr>
-          <w:p>
-            <w:pPr>
-              <w:spacing w:after="40" w:line="288" w:lineRule="auto" w:before="40"/>
+        <w:tc>
+          <w:tcPr>
+            <w:tcW w:type="dxa" w:w="2835"/>
+            <w:tcBorders>
+              <w:top w:val="single" w:sz="4" w:color="C9D4DF"/>
+              <w:left w:val="single" w:sz="4" w:color="C9D4DF"/>
+              <w:bottom w:val="single" w:sz="4" w:color="C9D4DF"/>
+              <w:right w:val="single" w:sz="4" w:color="C9D4DF"/>
+            </w:tcBorders>
+          </w:tcPr>
+          <w:p>
+            <w:pPr>
+              <w:spacing w:line="288" w:lineRule="auto" w:before="60" w:after="60"/>
             </w:pPr>
             <w:r>
               <w:rPr>
@@ -3512,34 +3093,23 @@
                 <w:color w:val="000000"/>
                 <w:sz w:val="21"/>
               </w:rPr>
-              <w:t>加法同态性质</w:t>
-            </w:r>
-          </w:p>
-        </w:tc>
-        <w:tc>
-          <w:tcPr>
-            <w:tcW w:type="dxa" w:w="6633"/>
-            <w:vAlign w:val="center"/>
-            <w:tcBorders>
-              <w:top w:val="single" w:sz="4" w:color="D9D9D9"/>
-              <w:left w:val="single" w:sz="4" w:color="D9D9D9"/>
-              <w:bottom w:val="single" w:sz="4" w:color="D9D9D9"/>
-              <w:right w:val="single" w:sz="4" w:color="D9D9D9"/>
-              <w:top w:val="single" w:sz="4" w:color="D9D9D9"/>
-              <w:left w:val="single" w:sz="4" w:color="D9D9D9"/>
-              <w:bottom w:val="single" w:sz="4" w:color="D9D9D9"/>
-              <w:right w:val="single" w:sz="4" w:color="D9D9D9"/>
-            </w:tcBorders>
-            <w:tcMar>
-              <w:top w:w="75" w:type="dxa"/>
-              <w:left w:w="75" w:type="dxa"/>
-              <w:bottom w:w="75" w:type="dxa"/>
-              <w:right w:w="75" w:type="dxa"/>
-            </w:tcMar>
-          </w:tcPr>
-          <w:p>
-            <w:pPr>
-              <w:spacing w:after="40" w:line="288" w:lineRule="auto" w:before="40"/>
+              <w:t>TLS与权限、事务、完整性</w:t>
+            </w:r>
+          </w:p>
+        </w:tc>
+        <w:tc>
+          <w:tcPr>
+            <w:tcW w:type="dxa" w:w="6009"/>
+            <w:tcBorders>
+              <w:top w:val="single" w:sz="4" w:color="C9D4DF"/>
+              <w:left w:val="single" w:sz="4" w:color="C9D4DF"/>
+              <w:bottom w:val="single" w:sz="4" w:color="C9D4DF"/>
+              <w:right w:val="single" w:sz="4" w:color="C9D4DF"/>
+            </w:tcBorders>
+          </w:tcPr>
+          <w:p>
+            <w:pPr>
+              <w:spacing w:line="288" w:lineRule="auto" w:before="60" w:after="60"/>
             </w:pPr>
             <w:r>
               <w:rPr>
@@ -3548,37 +3118,25 @@
                 <w:color w:val="000000"/>
                 <w:sz w:val="21"/>
               </w:rPr>
-              <w:t>E(2) × E(3) mod n² 解密为5</w:t>
+              <w:t>18项联网测试＋9项回归全部通过</w:t>
             </w:r>
           </w:p>
         </w:tc>
       </w:tr>
       <w:tr>
-        <w:trPr/>
-        <w:tc>
-          <w:tcPr>
-            <w:tcW w:type="dxa" w:w="2551"/>
-            <w:vAlign w:val="center"/>
-            <w:tcBorders>
-              <w:top w:val="single" w:sz="4" w:color="D9D9D9"/>
-              <w:left w:val="single" w:sz="4" w:color="D9D9D9"/>
-              <w:bottom w:val="single" w:sz="4" w:color="D9D9D9"/>
-              <w:right w:val="single" w:sz="4" w:color="D9D9D9"/>
-              <w:top w:val="single" w:sz="4" w:color="D9D9D9"/>
-              <w:left w:val="single" w:sz="4" w:color="D9D9D9"/>
-              <w:bottom w:val="single" w:sz="4" w:color="D9D9D9"/>
-              <w:right w:val="single" w:sz="4" w:color="D9D9D9"/>
-            </w:tcBorders>
-            <w:tcMar>
-              <w:top w:w="75" w:type="dxa"/>
-              <w:left w:w="75" w:type="dxa"/>
-              <w:bottom w:w="75" w:type="dxa"/>
-              <w:right w:w="75" w:type="dxa"/>
-            </w:tcMar>
-          </w:tcPr>
-          <w:p>
-            <w:pPr>
-              <w:spacing w:after="40" w:line="288" w:lineRule="auto" w:before="40"/>
+        <w:tc>
+          <w:tcPr>
+            <w:tcW w:type="dxa" w:w="2835"/>
+            <w:tcBorders>
+              <w:top w:val="single" w:sz="4" w:color="C9D4DF"/>
+              <w:left w:val="single" w:sz="4" w:color="C9D4DF"/>
+              <w:bottom w:val="single" w:sz="4" w:color="C9D4DF"/>
+              <w:right w:val="single" w:sz="4" w:color="C9D4DF"/>
+            </w:tcBorders>
+          </w:tcPr>
+          <w:p>
+            <w:pPr>
+              <w:spacing w:line="288" w:lineRule="auto" w:before="60" w:after="60"/>
             </w:pPr>
             <w:r>
               <w:rPr>
@@ -3587,34 +3145,23 @@
                 <w:color w:val="000000"/>
                 <w:sz w:val="21"/>
               </w:rPr>
-              <w:t>随机化加密</w:t>
-            </w:r>
-          </w:p>
-        </w:tc>
-        <w:tc>
-          <w:tcPr>
-            <w:tcW w:type="dxa" w:w="6633"/>
-            <w:vAlign w:val="center"/>
-            <w:tcBorders>
-              <w:top w:val="single" w:sz="4" w:color="D9D9D9"/>
-              <w:left w:val="single" w:sz="4" w:color="D9D9D9"/>
-              <w:bottom w:val="single" w:sz="4" w:color="D9D9D9"/>
-              <w:right w:val="single" w:sz="4" w:color="D9D9D9"/>
-              <w:top w:val="single" w:sz="4" w:color="D9D9D9"/>
-              <w:left w:val="single" w:sz="4" w:color="D9D9D9"/>
-              <w:bottom w:val="single" w:sz="4" w:color="D9D9D9"/>
-              <w:right w:val="single" w:sz="4" w:color="D9D9D9"/>
-            </w:tcBorders>
-            <w:tcMar>
-              <w:top w:w="75" w:type="dxa"/>
-              <w:left w:w="75" w:type="dxa"/>
-              <w:bottom w:w="75" w:type="dxa"/>
-              <w:right w:w="75" w:type="dxa"/>
-            </w:tcMar>
-          </w:tcPr>
-          <w:p>
-            <w:pPr>
-              <w:spacing w:after="40" w:line="288" w:lineRule="auto" w:before="40"/>
+              <w:t>6个独立客户端进程</w:t>
+            </w:r>
+          </w:p>
+        </w:tc>
+        <w:tc>
+          <w:tcPr>
+            <w:tcW w:type="dxa" w:w="6009"/>
+            <w:tcBorders>
+              <w:top w:val="single" w:sz="4" w:color="C9D4DF"/>
+              <w:left w:val="single" w:sz="4" w:color="C9D4DF"/>
+              <w:bottom w:val="single" w:sz="4" w:color="C9D4DF"/>
+              <w:right w:val="single" w:sz="4" w:color="C9D4DF"/>
+            </w:tcBorders>
+          </w:tcPr>
+          <w:p>
+            <w:pPr>
+              <w:spacing w:line="288" w:lineRule="auto" w:before="60" w:after="60"/>
             </w:pPr>
             <w:r>
               <w:rPr>
@@ -3623,37 +3170,25 @@
                 <w:color w:val="000000"/>
                 <w:sz w:val="21"/>
               </w:rPr>
-              <w:t>相同明文两次加密得到不同密文</w:t>
+              <w:t>实际连接同一TLS端口，6票结果[3,2,1]</w:t>
             </w:r>
           </w:p>
         </w:tc>
       </w:tr>
       <w:tr>
-        <w:trPr/>
-        <w:tc>
-          <w:tcPr>
-            <w:tcW w:type="dxa" w:w="2551"/>
-            <w:vAlign w:val="center"/>
-            <w:tcBorders>
-              <w:top w:val="single" w:sz="4" w:color="D9D9D9"/>
-              <w:left w:val="single" w:sz="4" w:color="D9D9D9"/>
-              <w:bottom w:val="single" w:sz="4" w:color="D9D9D9"/>
-              <w:right w:val="single" w:sz="4" w:color="D9D9D9"/>
-              <w:top w:val="single" w:sz="4" w:color="D9D9D9"/>
-              <w:left w:val="single" w:sz="4" w:color="D9D9D9"/>
-              <w:bottom w:val="single" w:sz="4" w:color="D9D9D9"/>
-              <w:right w:val="single" w:sz="4" w:color="D9D9D9"/>
-            </w:tcBorders>
-            <w:tcMar>
-              <w:top w:w="75" w:type="dxa"/>
-              <w:left w:w="75" w:type="dxa"/>
-              <w:bottom w:w="75" w:type="dxa"/>
-              <w:right w:w="75" w:type="dxa"/>
-            </w:tcMar>
-          </w:tcPr>
-          <w:p>
-            <w:pPr>
-              <w:spacing w:after="40" w:line="288" w:lineRule="auto" w:before="40"/>
+        <w:tc>
+          <w:tcPr>
+            <w:tcW w:type="dxa" w:w="2835"/>
+            <w:tcBorders>
+              <w:top w:val="single" w:sz="4" w:color="C9D4DF"/>
+              <w:left w:val="single" w:sz="4" w:color="C9D4DF"/>
+              <w:bottom w:val="single" w:sz="4" w:color="C9D4DF"/>
+              <w:right w:val="single" w:sz="4" w:color="C9D4DF"/>
+            </w:tcBorders>
+          </w:tcPr>
+          <w:p>
+            <w:pPr>
+              <w:spacing w:line="288" w:lineRule="auto" w:before="60" w:after="60"/>
             </w:pPr>
             <w:r>
               <w:rPr>
@@ -3662,34 +3197,23 @@
                 <w:color w:val="000000"/>
                 <w:sz w:val="21"/>
               </w:rPr>
-              <w:t>越界选项拒绝</w:t>
-            </w:r>
-          </w:p>
-        </w:tc>
-        <w:tc>
-          <w:tcPr>
-            <w:tcW w:type="dxa" w:w="6633"/>
-            <w:vAlign w:val="center"/>
-            <w:tcBorders>
-              <w:top w:val="single" w:sz="4" w:color="D9D9D9"/>
-              <w:left w:val="single" w:sz="4" w:color="D9D9D9"/>
-              <w:bottom w:val="single" w:sz="4" w:color="D9D9D9"/>
-              <w:right w:val="single" w:sz="4" w:color="D9D9D9"/>
-              <w:top w:val="single" w:sz="4" w:color="D9D9D9"/>
-              <w:left w:val="single" w:sz="4" w:color="D9D9D9"/>
-              <w:bottom w:val="single" w:sz="4" w:color="D9D9D9"/>
-              <w:right w:val="single" w:sz="4" w:color="D9D9D9"/>
-            </w:tcBorders>
-            <w:tcMar>
-              <w:top w:w="75" w:type="dxa"/>
-              <w:left w:w="75" w:type="dxa"/>
-              <w:bottom w:w="75" w:type="dxa"/>
-              <w:right w:w="75" w:type="dxa"/>
-            </w:tcMar>
-          </w:tcPr>
-          <w:p>
-            <w:pPr>
-              <w:spacing w:after="40" w:line="288" w:lineRule="auto" w:before="40"/>
+              <w:t>同一ID并发8次</w:t>
+            </w:r>
+          </w:p>
+        </w:tc>
+        <w:tc>
+          <w:tcPr>
+            <w:tcW w:type="dxa" w:w="6009"/>
+            <w:tcBorders>
+              <w:top w:val="single" w:sz="4" w:color="C9D4DF"/>
+              <w:left w:val="single" w:sz="4" w:color="C9D4DF"/>
+              <w:bottom w:val="single" w:sz="4" w:color="C9D4DF"/>
+              <w:right w:val="single" w:sz="4" w:color="C9D4DF"/>
+            </w:tcBorders>
+          </w:tcPr>
+          <w:p>
+            <w:pPr>
+              <w:spacing w:line="288" w:lineRule="auto" w:before="60" w:after="60"/>
             </w:pPr>
             <w:r>
               <w:rPr>
@@ -3698,37 +3222,25 @@
                 <w:color w:val="000000"/>
                 <w:sz w:val="21"/>
               </w:rPr>
-              <w:t>必须且只能选择一个有效选项</w:t>
+              <w:t>只接受1次，其余7次拒绝</w:t>
             </w:r>
           </w:p>
         </w:tc>
       </w:tr>
       <w:tr>
-        <w:trPr/>
-        <w:tc>
-          <w:tcPr>
-            <w:tcW w:type="dxa" w:w="2551"/>
-            <w:vAlign w:val="center"/>
-            <w:tcBorders>
-              <w:top w:val="single" w:sz="4" w:color="D9D9D9"/>
-              <w:left w:val="single" w:sz="4" w:color="D9D9D9"/>
-              <w:bottom w:val="single" w:sz="4" w:color="D9D9D9"/>
-              <w:right w:val="single" w:sz="4" w:color="D9D9D9"/>
-              <w:top w:val="single" w:sz="4" w:color="D9D9D9"/>
-              <w:left w:val="single" w:sz="4" w:color="D9D9D9"/>
-              <w:bottom w:val="single" w:sz="4" w:color="D9D9D9"/>
-              <w:right w:val="single" w:sz="4" w:color="D9D9D9"/>
-            </w:tcBorders>
-            <w:tcMar>
-              <w:top w:w="75" w:type="dxa"/>
-              <w:left w:w="75" w:type="dxa"/>
-              <w:bottom w:w="75" w:type="dxa"/>
-              <w:right w:w="75" w:type="dxa"/>
-            </w:tcMar>
-          </w:tcPr>
-          <w:p>
-            <w:pPr>
-              <w:spacing w:after="40" w:line="288" w:lineRule="auto" w:before="40"/>
+        <w:tc>
+          <w:tcPr>
+            <w:tcW w:type="dxa" w:w="2835"/>
+            <w:tcBorders>
+              <w:top w:val="single" w:sz="4" w:color="C9D4DF"/>
+              <w:left w:val="single" w:sz="4" w:color="C9D4DF"/>
+              <w:bottom w:val="single" w:sz="4" w:color="C9D4DF"/>
+              <w:right w:val="single" w:sz="4" w:color="C9D4DF"/>
+            </w:tcBorders>
+          </w:tcPr>
+          <w:p>
+            <w:pPr>
+              <w:spacing w:line="288" w:lineRule="auto" w:before="60" w:after="60"/>
             </w:pPr>
             <w:r>
               <w:rPr>
@@ -3737,34 +3249,23 @@
                 <w:color w:val="000000"/>
                 <w:sz w:val="21"/>
               </w:rPr>
-              <w:t>错误口令拒绝</w:t>
-            </w:r>
-          </w:p>
-        </w:tc>
-        <w:tc>
-          <w:tcPr>
-            <w:tcW w:type="dxa" w:w="6633"/>
-            <w:vAlign w:val="center"/>
-            <w:tcBorders>
-              <w:top w:val="single" w:sz="4" w:color="D9D9D9"/>
-              <w:left w:val="single" w:sz="4" w:color="D9D9D9"/>
-              <w:bottom w:val="single" w:sz="4" w:color="D9D9D9"/>
-              <w:right w:val="single" w:sz="4" w:color="D9D9D9"/>
-              <w:top w:val="single" w:sz="4" w:color="D9D9D9"/>
-              <w:left w:val="single" w:sz="4" w:color="D9D9D9"/>
-              <w:bottom w:val="single" w:sz="4" w:color="D9D9D9"/>
-              <w:right w:val="single" w:sz="4" w:color="D9D9D9"/>
-            </w:tcBorders>
-            <w:tcMar>
-              <w:top w:w="75" w:type="dxa"/>
-              <w:left w:w="75" w:type="dxa"/>
-              <w:bottom w:w="75" w:type="dxa"/>
-              <w:right w:w="75" w:type="dxa"/>
-            </w:tcMar>
-          </w:tcPr>
-          <w:p>
-            <w:pPr>
-              <w:spacing w:after="40" w:line="288" w:lineRule="auto" w:before="40"/>
+              <w:t>凭证冒用、错误指纹</w:t>
+            </w:r>
+          </w:p>
+        </w:tc>
+        <w:tc>
+          <w:tcPr>
+            <w:tcW w:type="dxa" w:w="6009"/>
+            <w:tcBorders>
+              <w:top w:val="single" w:sz="4" w:color="C9D4DF"/>
+              <w:left w:val="single" w:sz="4" w:color="C9D4DF"/>
+              <w:bottom w:val="single" w:sz="4" w:color="C9D4DF"/>
+              <w:right w:val="single" w:sz="4" w:color="C9D4DF"/>
+            </w:tcBorders>
+          </w:tcPr>
+          <w:p>
+            <w:pPr>
+              <w:spacing w:line="288" w:lineRule="auto" w:before="60" w:after="60"/>
             </w:pPr>
             <w:r>
               <w:rPr>
@@ -3773,37 +3274,25 @@
                 <w:color w:val="000000"/>
                 <w:sz w:val="21"/>
               </w:rPr>
-              <w:t>口令错误或密钥文件已损坏</w:t>
+              <w:t>被拒绝；指纹失败时未发送票码</w:t>
             </w:r>
           </w:p>
         </w:tc>
       </w:tr>
       <w:tr>
-        <w:trPr/>
-        <w:tc>
-          <w:tcPr>
-            <w:tcW w:type="dxa" w:w="2551"/>
-            <w:vAlign w:val="center"/>
-            <w:tcBorders>
-              <w:top w:val="single" w:sz="4" w:color="D9D9D9"/>
-              <w:left w:val="single" w:sz="4" w:color="D9D9D9"/>
-              <w:bottom w:val="single" w:sz="4" w:color="D9D9D9"/>
-              <w:right w:val="single" w:sz="4" w:color="D9D9D9"/>
-              <w:top w:val="single" w:sz="4" w:color="D9D9D9"/>
-              <w:left w:val="single" w:sz="4" w:color="D9D9D9"/>
-              <w:bottom w:val="single" w:sz="4" w:color="D9D9D9"/>
-              <w:right w:val="single" w:sz="4" w:color="D9D9D9"/>
-            </w:tcBorders>
-            <w:tcMar>
-              <w:top w:w="75" w:type="dxa"/>
-              <w:left w:w="75" w:type="dxa"/>
-              <w:bottom w:w="75" w:type="dxa"/>
-              <w:right w:w="75" w:type="dxa"/>
-            </w:tcMar>
-          </w:tcPr>
-          <w:p>
-            <w:pPr>
-              <w:spacing w:after="40" w:line="288" w:lineRule="auto" w:before="40"/>
+        <w:tc>
+          <w:tcPr>
+            <w:tcW w:type="dxa" w:w="2835"/>
+            <w:tcBorders>
+              <w:top w:val="single" w:sz="4" w:color="C9D4DF"/>
+              <w:left w:val="single" w:sz="4" w:color="C9D4DF"/>
+              <w:bottom w:val="single" w:sz="4" w:color="C9D4DF"/>
+              <w:right w:val="single" w:sz="4" w:color="C9D4DF"/>
+            </w:tcBorders>
+          </w:tcPr>
+          <w:p>
+            <w:pPr>
+              <w:spacing w:line="288" w:lineRule="auto" w:before="60" w:after="60"/>
             </w:pPr>
             <w:r>
               <w:rPr>
@@ -3812,34 +3301,23 @@
                 <w:color w:val="000000"/>
                 <w:sz w:val="21"/>
               </w:rPr>
-              <w:t>错误维度拒绝</w:t>
-            </w:r>
-          </w:p>
-        </w:tc>
-        <w:tc>
-          <w:tcPr>
-            <w:tcW w:type="dxa" w:w="6633"/>
-            <w:vAlign w:val="center"/>
-            <w:tcBorders>
-              <w:top w:val="single" w:sz="4" w:color="D9D9D9"/>
-              <w:left w:val="single" w:sz="4" w:color="D9D9D9"/>
-              <w:bottom w:val="single" w:sz="4" w:color="D9D9D9"/>
-              <w:right w:val="single" w:sz="4" w:color="D9D9D9"/>
-              <w:top w:val="single" w:sz="4" w:color="D9D9D9"/>
-              <w:left w:val="single" w:sz="4" w:color="D9D9D9"/>
-              <w:bottom w:val="single" w:sz="4" w:color="D9D9D9"/>
-              <w:right w:val="single" w:sz="4" w:color="D9D9D9"/>
-            </w:tcBorders>
-            <w:tcMar>
-              <w:top w:w="75" w:type="dxa"/>
-              <w:left w:w="75" w:type="dxa"/>
-              <w:bottom w:w="75" w:type="dxa"/>
-              <w:right w:w="75" w:type="dxa"/>
-            </w:tcMar>
-          </w:tcPr>
-          <w:p>
-            <w:pPr>
-              <w:spacing w:after="40" w:line="288" w:lineRule="auto" w:before="40"/>
+              <w:t>错误口令、部分汇总、伪造结果</w:t>
+            </w:r>
+          </w:p>
+        </w:tc>
+        <w:tc>
+          <w:tcPr>
+            <w:tcW w:type="dxa" w:w="6009"/>
+            <w:tcBorders>
+              <w:top w:val="single" w:sz="4" w:color="C9D4DF"/>
+              <w:left w:val="single" w:sz="4" w:color="C9D4DF"/>
+              <w:bottom w:val="single" w:sz="4" w:color="C9D4DF"/>
+              <w:right w:val="single" w:sz="4" w:color="C9D4DF"/>
+            </w:tcBorders>
+          </w:tcPr>
+          <w:p>
+            <w:pPr>
+              <w:spacing w:line="288" w:lineRule="auto" w:before="60" w:after="60"/>
             </w:pPr>
             <w:r>
               <w:rPr>
@@ -3848,37 +3326,25 @@
                 <w:color w:val="000000"/>
                 <w:sz w:val="21"/>
               </w:rPr>
-              <w:t>密文向量维度与选项数不一致</w:t>
+              <w:t>被拒绝，不发布错误总票</w:t>
             </w:r>
           </w:p>
         </w:tc>
       </w:tr>
       <w:tr>
-        <w:trPr/>
-        <w:tc>
-          <w:tcPr>
-            <w:tcW w:type="dxa" w:w="2551"/>
-            <w:vAlign w:val="center"/>
-            <w:tcBorders>
-              <w:top w:val="single" w:sz="4" w:color="D9D9D9"/>
-              <w:left w:val="single" w:sz="4" w:color="D9D9D9"/>
-              <w:bottom w:val="single" w:sz="4" w:color="D9D9D9"/>
-              <w:right w:val="single" w:sz="4" w:color="D9D9D9"/>
-              <w:top w:val="single" w:sz="4" w:color="D9D9D9"/>
-              <w:left w:val="single" w:sz="4" w:color="D9D9D9"/>
-              <w:bottom w:val="single" w:sz="4" w:color="D9D9D9"/>
-              <w:right w:val="single" w:sz="4" w:color="D9D9D9"/>
-            </w:tcBorders>
-            <w:tcMar>
-              <w:top w:w="75" w:type="dxa"/>
-              <w:left w:w="75" w:type="dxa"/>
-              <w:bottom w:w="75" w:type="dxa"/>
-              <w:right w:w="75" w:type="dxa"/>
-            </w:tcMar>
-          </w:tcPr>
-          <w:p>
-            <w:pPr>
-              <w:spacing w:after="40" w:line="288" w:lineRule="auto" w:before="40"/>
+        <w:tc>
+          <w:tcPr>
+            <w:tcW w:type="dxa" w:w="2835"/>
+            <w:tcBorders>
+              <w:top w:val="single" w:sz="4" w:color="C9D4DF"/>
+              <w:left w:val="single" w:sz="4" w:color="C9D4DF"/>
+              <w:bottom w:val="single" w:sz="4" w:color="C9D4DF"/>
+              <w:right w:val="single" w:sz="4" w:color="C9D4DF"/>
+            </w:tcBorders>
+          </w:tcPr>
+          <w:p>
+            <w:pPr>
+              <w:spacing w:line="288" w:lineRule="auto" w:before="60" w:after="60"/>
             </w:pPr>
             <w:r>
               <w:rPr>
@@ -3887,34 +3353,23 @@
                 <w:color w:val="000000"/>
                 <w:sz w:val="21"/>
               </w:rPr>
-              <w:t>非法密文空间拒绝</w:t>
-            </w:r>
-          </w:p>
-        </w:tc>
-        <w:tc>
-          <w:tcPr>
-            <w:tcW w:type="dxa" w:w="6633"/>
-            <w:vAlign w:val="center"/>
-            <w:tcBorders>
-              <w:top w:val="single" w:sz="4" w:color="D9D9D9"/>
-              <w:left w:val="single" w:sz="4" w:color="D9D9D9"/>
-              <w:bottom w:val="single" w:sz="4" w:color="D9D9D9"/>
-              <w:right w:val="single" w:sz="4" w:color="D9D9D9"/>
-              <w:top w:val="single" w:sz="4" w:color="D9D9D9"/>
-              <w:left w:val="single" w:sz="4" w:color="D9D9D9"/>
-              <w:bottom w:val="single" w:sz="4" w:color="D9D9D9"/>
-              <w:right w:val="single" w:sz="4" w:color="D9D9D9"/>
-            </w:tcBorders>
-            <w:tcMar>
-              <w:top w:w="75" w:type="dxa"/>
-              <w:left w:w="75" w:type="dxa"/>
-              <w:bottom w:w="75" w:type="dxa"/>
-              <w:right w:w="75" w:type="dxa"/>
-            </w:tcMar>
-          </w:tcPr>
-          <w:p>
-            <w:pPr>
-              <w:spacing w:after="40" w:line="288" w:lineRule="auto" w:before="40"/>
+              <w:t>两窗口实际Qt控件</w:t>
+            </w:r>
+          </w:p>
+        </w:tc>
+        <w:tc>
+          <w:tcPr>
+            <w:tcW w:type="dxa" w:w="6009"/>
+            <w:tcBorders>
+              <w:top w:val="single" w:sz="4" w:color="C9D4DF"/>
+              <w:left w:val="single" w:sz="4" w:color="C9D4DF"/>
+              <w:bottom w:val="single" w:sz="4" w:color="C9D4DF"/>
+              <w:right w:val="single" w:sz="4" w:color="C9D4DF"/>
+            </w:tcBorders>
+          </w:tcPr>
+          <w:p>
+            <w:pPr>
+              <w:spacing w:line="288" w:lineRule="auto" w:before="60" w:after="60"/>
             </w:pPr>
             <w:r>
               <w:rPr>
@@ -3923,37 +3378,25 @@
                 <w:color w:val="000000"/>
                 <w:sz w:val="21"/>
               </w:rPr>
-              <w:t>密文不属于合法密文空间</w:t>
+              <w:t>6次投票，回执与公开结果验签通过</w:t>
             </w:r>
           </w:p>
         </w:tc>
       </w:tr>
       <w:tr>
-        <w:trPr/>
-        <w:tc>
-          <w:tcPr>
-            <w:tcW w:type="dxa" w:w="2551"/>
-            <w:vAlign w:val="center"/>
-            <w:tcBorders>
-              <w:top w:val="single" w:sz="4" w:color="D9D9D9"/>
-              <w:left w:val="single" w:sz="4" w:color="D9D9D9"/>
-              <w:bottom w:val="single" w:sz="4" w:color="D9D9D9"/>
-              <w:right w:val="single" w:sz="4" w:color="D9D9D9"/>
-              <w:top w:val="single" w:sz="4" w:color="D9D9D9"/>
-              <w:left w:val="single" w:sz="4" w:color="D9D9D9"/>
-              <w:bottom w:val="single" w:sz="4" w:color="D9D9D9"/>
-              <w:right w:val="single" w:sz="4" w:color="D9D9D9"/>
-            </w:tcBorders>
-            <w:tcMar>
-              <w:top w:w="75" w:type="dxa"/>
-              <w:left w:w="75" w:type="dxa"/>
-              <w:bottom w:w="75" w:type="dxa"/>
-              <w:right w:w="75" w:type="dxa"/>
-            </w:tcMar>
-          </w:tcPr>
-          <w:p>
-            <w:pPr>
-              <w:spacing w:after="40" w:line="288" w:lineRule="auto" w:before="40"/>
+        <w:tc>
+          <w:tcPr>
+            <w:tcW w:type="dxa" w:w="2835"/>
+            <w:tcBorders>
+              <w:top w:val="single" w:sz="4" w:color="C9D4DF"/>
+              <w:left w:val="single" w:sz="4" w:color="C9D4DF"/>
+              <w:bottom w:val="single" w:sz="4" w:color="C9D4DF"/>
+              <w:right w:val="single" w:sz="4" w:color="C9D4DF"/>
+            </w:tcBorders>
+          </w:tcPr>
+          <w:p>
+            <w:pPr>
+              <w:spacing w:line="288" w:lineRule="auto" w:before="60" w:after="60"/>
             </w:pPr>
             <w:r>
               <w:rPr>
@@ -3962,34 +3405,23 @@
                 <w:color w:val="000000"/>
                 <w:sz w:val="21"/>
               </w:rPr>
-              <w:t>公开选票字段检查</w:t>
-            </w:r>
-          </w:p>
-        </w:tc>
-        <w:tc>
-          <w:tcPr>
-            <w:tcW w:type="dxa" w:w="6633"/>
-            <w:vAlign w:val="center"/>
-            <w:tcBorders>
-              <w:top w:val="single" w:sz="4" w:color="D9D9D9"/>
-              <w:left w:val="single" w:sz="4" w:color="D9D9D9"/>
-              <w:bottom w:val="single" w:sz="4" w:color="D9D9D9"/>
-              <w:right w:val="single" w:sz="4" w:color="D9D9D9"/>
-              <w:top w:val="single" w:sz="4" w:color="D9D9D9"/>
-              <w:left w:val="single" w:sz="4" w:color="D9D9D9"/>
-              <w:bottom w:val="single" w:sz="4" w:color="D9D9D9"/>
-              <w:right w:val="single" w:sz="4" w:color="D9D9D9"/>
-            </w:tcBorders>
-            <w:tcMar>
-              <w:top w:w="75" w:type="dxa"/>
-              <w:left w:w="75" w:type="dxa"/>
-              <w:bottom w:w="75" w:type="dxa"/>
-              <w:right w:w="75" w:type="dxa"/>
-            </w:tcMar>
-          </w:tcPr>
-          <w:p>
-            <w:pPr>
-              <w:spacing w:after="40" w:line="288" w:lineRule="auto" w:before="40"/>
+              <w:t>服务重启</w:t>
+            </w:r>
+          </w:p>
+        </w:tc>
+        <w:tc>
+          <w:tcPr>
+            <w:tcW w:type="dxa" w:w="6009"/>
+            <w:tcBorders>
+              <w:top w:val="single" w:sz="4" w:color="C9D4DF"/>
+              <w:left w:val="single" w:sz="4" w:color="C9D4DF"/>
+              <w:bottom w:val="single" w:sz="4" w:color="C9D4DF"/>
+              <w:right w:val="single" w:sz="4" w:color="C9D4DF"/>
+            </w:tcBorders>
+          </w:tcPr>
+          <w:p>
+            <w:pPr>
+              <w:spacing w:line="288" w:lineRule="auto" w:before="60" w:after="60"/>
             </w:pPr>
             <w:r>
               <w:rPr>
@@ -3998,135 +3430,7 @@
                 <w:color w:val="000000"/>
                 <w:sz w:val="21"/>
               </w:rPr>
-              <w:t>公开选票不含明文选择或私钥字段</w:t>
-            </w:r>
-          </w:p>
-        </w:tc>
-      </w:tr>
-      <w:tr>
-        <w:trPr/>
-        <w:tc>
-          <w:tcPr>
-            <w:tcW w:type="dxa" w:w="2551"/>
-            <w:vAlign w:val="center"/>
-            <w:tcBorders>
-              <w:top w:val="single" w:sz="4" w:color="D9D9D9"/>
-              <w:left w:val="single" w:sz="4" w:color="D9D9D9"/>
-              <w:bottom w:val="single" w:sz="4" w:color="D9D9D9"/>
-              <w:right w:val="single" w:sz="4" w:color="D9D9D9"/>
-              <w:top w:val="single" w:sz="4" w:color="D9D9D9"/>
-              <w:left w:val="single" w:sz="4" w:color="D9D9D9"/>
-              <w:bottom w:val="single" w:sz="4" w:color="D9D9D9"/>
-              <w:right w:val="single" w:sz="4" w:color="D9D9D9"/>
-            </w:tcBorders>
-            <w:tcMar>
-              <w:top w:w="75" w:type="dxa"/>
-              <w:left w:w="75" w:type="dxa"/>
-              <w:bottom w:w="75" w:type="dxa"/>
-              <w:right w:w="75" w:type="dxa"/>
-            </w:tcMar>
-          </w:tcPr>
-          <w:p>
-            <w:pPr>
-              <w:spacing w:after="40" w:line="288" w:lineRule="auto" w:before="40"/>
-            </w:pPr>
-            <w:r>
-              <w:rPr>
-                <w:rFonts w:ascii="Times New Roman" w:hAnsi="Times New Roman" w:eastAsia="宋体"/>
-                <w:b w:val="0"/>
-                <w:color w:val="000000"/>
-                <w:sz w:val="21"/>
-              </w:rPr>
-              <w:t>动态选项数量</w:t>
-            </w:r>
-          </w:p>
-        </w:tc>
-        <w:tc>
-          <w:tcPr>
-            <w:tcW w:type="dxa" w:w="6633"/>
-            <w:vAlign w:val="center"/>
-            <w:tcBorders>
-              <w:top w:val="single" w:sz="4" w:color="D9D9D9"/>
-              <w:left w:val="single" w:sz="4" w:color="D9D9D9"/>
-              <w:bottom w:val="single" w:sz="4" w:color="D9D9D9"/>
-              <w:right w:val="single" w:sz="4" w:color="D9D9D9"/>
-              <w:top w:val="single" w:sz="4" w:color="D9D9D9"/>
-              <w:left w:val="single" w:sz="4" w:color="D9D9D9"/>
-              <w:bottom w:val="single" w:sz="4" w:color="D9D9D9"/>
-              <w:right w:val="single" w:sz="4" w:color="D9D9D9"/>
-            </w:tcBorders>
-            <w:tcMar>
-              <w:top w:w="75" w:type="dxa"/>
-              <w:left w:w="75" w:type="dxa"/>
-              <w:bottom w:w="75" w:type="dxa"/>
-              <w:right w:w="75" w:type="dxa"/>
-            </w:tcMar>
-          </w:tcPr>
-          <w:p>
-            <w:pPr>
-              <w:spacing w:after="40" w:line="288" w:lineRule="auto" w:before="40"/>
-            </w:pPr>
-            <w:r>
-              <w:rPr>
-                <w:rFonts w:ascii="Times New Roman" w:hAnsi="Times New Roman" w:eastAsia="宋体"/>
-                <w:b w:val="0"/>
-                <w:color w:val="000000"/>
-                <w:sz w:val="21"/>
-              </w:rPr>
-              <w:t>动态4选项得到 [1,1,1,1]</w:t>
-            </w:r>
-          </w:p>
-        </w:tc>
-      </w:tr>
-      <w:tr>
-        <w:trPr/>
-        <w:tc>
-          <w:tcPr>
-            <w:tcW w:type="dxa" w:w="2551"/>
-            <w:tcBorders>
-              <w:top w:val="single" w:sz="4" w:color="D9D9D9"/>
-              <w:left w:val="single" w:sz="4" w:color="D9D9D9"/>
-              <w:bottom w:val="single" w:sz="4" w:color="D9D9D9"/>
-              <w:right w:val="single" w:sz="4" w:color="D9D9D9"/>
-            </w:tcBorders>
-          </w:tcPr>
-          <w:p>
-            <w:pPr>
-              <w:spacing w:line="288" w:lineRule="auto" w:after="40" w:before="40"/>
-            </w:pPr>
-            <w:r>
-              <w:rPr>
-                <w:rFonts w:ascii="Times New Roman" w:hAnsi="Times New Roman" w:eastAsia="宋体"/>
-                <w:b w:val="0"/>
-                <w:color w:val="000000"/>
-                <w:sz w:val="21"/>
-              </w:rPr>
-              <w:t>非法选票组合局限</w:t>
-            </w:r>
-          </w:p>
-        </w:tc>
-        <w:tc>
-          <w:tcPr>
-            <w:tcW w:type="dxa" w:w="6633"/>
-            <w:tcBorders>
-              <w:top w:val="single" w:sz="4" w:color="D9D9D9"/>
-              <w:left w:val="single" w:sz="4" w:color="D9D9D9"/>
-              <w:bottom w:val="single" w:sz="4" w:color="D9D9D9"/>
-              <w:right w:val="single" w:sz="4" w:color="D9D9D9"/>
-            </w:tcBorders>
-          </w:tcPr>
-          <w:p>
-            <w:pPr>
-              <w:spacing w:line="288" w:lineRule="auto" w:after="40" w:before="40"/>
-            </w:pPr>
-            <w:r>
-              <w:rPr>
-                <w:rFonts w:ascii="Times New Roman" w:hAnsi="Times New Roman" w:eastAsia="宋体"/>
-                <w:b w:val="0"/>
-                <w:color w:val="000000"/>
-                <w:sz w:val="21"/>
-              </w:rPr>
-              <w:t>两个非独热向量仍可形成满足约束的汇总；需零知识证明</w:t>
+              <w:t>已关闭状态和已发布结果保持一致</w:t>
             </w:r>
           </w:p>
         </w:tc>
@@ -4134,74 +3438,18 @@
     </w:tbl>
     <w:p>
       <w:pPr>
+        <w:pStyle w:val="ReportBody"/>
+      </w:pPr>
+      <w:r>
+        <w:t>网络与GUI测试均使用虚拟ID和合成选票，原始证据在evidence/2026-10-27-network/。独立进程验收在一台电脑上通过真实TLS完成，不代表跨物理电脑实测；教师私有数据和现场小改仍待实际验收。</w:t>
+      </w:r>
+    </w:p>
+    <w:p>
+      <w:pPr>
         <w:pStyle w:val="ReportH2"/>
       </w:pPr>
       <w:r>
-        <w:rPr>
-          <w:rFonts w:ascii="Times New Roman" w:hAnsi="Times New Roman" w:eastAsia="宋体"/>
-          <w:b/>
-          <w:color w:val="000000"/>
-          <w:sz w:val="24"/>
-        </w:rPr>
-        <w:t>5.2 失败案例与误报分析</w:t>
-      </w:r>
-    </w:p>
-    <w:p>
-      <w:pPr>
-        <w:pStyle w:val="ReportBody"/>
-      </w:pPr>
-      <w:r>
-        <w:rPr>
-          <w:rFonts w:ascii="Times New Roman" w:hAnsi="Times New Roman" w:eastAsia="宋体"/>
-          <w:b w:val="0"/>
-          <w:color w:val="000000"/>
-          <w:sz w:val="24"/>
-        </w:rPr>
-        <w:t>失败与边界：越界选项、错误向量维度和非法密文整数被拒绝。完整性校验失败时，界面使用“口令错误或密钥文件损坏”，不会将一次认证失败误判为确定的口令错误。</w:t>
-      </w:r>
-    </w:p>
-    <w:p>
-      <w:pPr>
-        <w:pStyle w:val="ReportBody"/>
-      </w:pPr>
-      <w:r>
-        <w:rPr>
-          <w:rFonts w:ascii="Times New Roman" w:hAnsi="Times New Roman" w:eastAsia="宋体"/>
-          <w:b w:val="0"/>
-          <w:color w:val="000000"/>
-          <w:sz w:val="24"/>
-        </w:rPr>
-        <w:t>误报分析：合法用户输入了错误格式的ID，会被名单校验拒绝。这属于输入校验失败，不是攻击检测率。应展示正确的ID格式并允许重新输入，而不是自动放宽身份规则。</w:t>
-      </w:r>
-    </w:p>
-    <w:p>
-      <w:pPr>
-        <w:pStyle w:val="ReportBody"/>
-      </w:pPr>
-      <w:r>
-        <w:rPr>
-          <w:rFonts w:ascii="Times New Roman" w:hAnsi="Times New Roman" w:eastAsia="宋体"/>
-          <w:b w:val="0"/>
-          <w:color w:val="000000"/>
-          <w:sz w:val="24"/>
-        </w:rPr>
-        <w:t>安全局限：客户端生成合法独热向量，但接收端没有零知识证明，无法从密文证明每项是0或1且总和为1。总票数约束只能发现部分非法选票，不能代替合法性证明。</w:t>
-      </w:r>
-    </w:p>
-    <w:p>
-      <w:pPr>
-        <w:pStyle w:val="ReportH2"/>
-      </w:pPr>
-      <w:r>
-        <w:t>5.3 性能数据与结果分析</w:t>
-      </w:r>
-    </w:p>
-    <w:p>
-      <w:pPr>
-        <w:pStyle w:val="ReportBody"/>
-      </w:pPr>
-      <w:r>
-        <w:t>对10、100、1000名投票者各做3次三选项实验。合成明文使用种子20261026加重复序号，密码学随机数不固定；每次均核对解密计数与预期。表3取本轮JSON中的算术平均值，单位毫秒。</w:t>
+        <w:t>5.3 加密、汇总和解密耗时</w:t>
       </w:r>
     </w:p>
     <w:p>
@@ -4210,53 +3458,332 @@
         <w:keepNext/>
       </w:pPr>
       <w:r>
-        <w:t>表3 加密 汇总与解密实测均值</w:t>
+        <w:t>表3 本轮六端并发实测（毫秒）</w:t>
       </w:r>
     </w:p>
     <w:tbl>
       <w:tblPr>
         <w:tblW w:type="auto" w:w="0"/>
-        <w:jc w:val="center"/>
         <w:tblLayout w:type="fixed"/>
         <w:tblLook w:firstColumn="1" w:firstRow="1" w:lastColumn="0" w:lastRow="0" w:noHBand="0" w:noVBand="1" w:val="04A0"/>
       </w:tblPr>
       <w:tblGrid>
-        <w:gridCol w:w="1191"/>
-        <w:gridCol w:w="2665"/>
-        <w:gridCol w:w="2665"/>
-        <w:gridCol w:w="2665"/>
+        <w:gridCol w:w="4677"/>
+        <w:gridCol w:w="4677"/>
       </w:tblGrid>
       <w:tr>
         <w:trPr>
           <w:tblHeader/>
+        </w:trPr>
+        <w:tc>
+          <w:tcPr>
+            <w:tcW w:type="dxa" w:w="6520"/>
+            <w:tcBorders>
+              <w:top w:val="single" w:sz="4" w:color="C9D4DF"/>
+              <w:left w:val="single" w:sz="4" w:color="C9D4DF"/>
+              <w:bottom w:val="single" w:sz="4" w:color="C9D4DF"/>
+              <w:right w:val="single" w:sz="4" w:color="C9D4DF"/>
+            </w:tcBorders>
+            <w:shd w:fill="E8EEF3"/>
+          </w:tcPr>
+          <w:p>
+            <w:pPr>
+              <w:spacing w:line="288" w:lineRule="auto" w:before="60" w:after="60"/>
+            </w:pPr>
+            <w:r>
+              <w:rPr>
+                <w:rFonts w:ascii="Times New Roman" w:hAnsi="Times New Roman" w:eastAsia="宋体"/>
+                <w:b/>
+                <w:color w:val="000000"/>
+                <w:sz w:val="21"/>
+              </w:rPr>
+              <w:t>测量范围</w:t>
+            </w:r>
+          </w:p>
+        </w:tc>
+        <w:tc>
+          <w:tcPr>
+            <w:tcW w:type="dxa" w:w="2324"/>
+            <w:tcBorders>
+              <w:top w:val="single" w:sz="4" w:color="C9D4DF"/>
+              <w:left w:val="single" w:sz="4" w:color="C9D4DF"/>
+              <w:bottom w:val="single" w:sz="4" w:color="C9D4DF"/>
+              <w:right w:val="single" w:sz="4" w:color="C9D4DF"/>
+            </w:tcBorders>
+            <w:shd w:fill="E8EEF3"/>
+          </w:tcPr>
+          <w:p>
+            <w:pPr>
+              <w:spacing w:line="288" w:lineRule="auto" w:before="60" w:after="60"/>
+            </w:pPr>
+            <w:r>
+              <w:rPr>
+                <w:rFonts w:ascii="Times New Roman" w:hAnsi="Times New Roman" w:eastAsia="宋体"/>
+                <w:b/>
+                <w:color w:val="000000"/>
+                <w:sz w:val="21"/>
+              </w:rPr>
+              <w:t>数值</w:t>
+            </w:r>
+          </w:p>
+        </w:tc>
+      </w:tr>
+      <w:tr>
+        <w:tc>
+          <w:tcPr>
+            <w:tcW w:type="dxa" w:w="6520"/>
+            <w:tcBorders>
+              <w:top w:val="single" w:sz="4" w:color="C9D4DF"/>
+              <w:left w:val="single" w:sz="4" w:color="C9D4DF"/>
+              <w:bottom w:val="single" w:sz="4" w:color="C9D4DF"/>
+              <w:right w:val="single" w:sz="4" w:color="C9D4DF"/>
+            </w:tcBorders>
+          </w:tcPr>
+          <w:p>
+            <w:pPr>
+              <w:spacing w:line="288" w:lineRule="auto" w:before="60" w:after="60"/>
+            </w:pPr>
+            <w:r>
+              <w:rPr>
+                <w:rFonts w:ascii="Times New Roman" w:hAnsi="Times New Roman" w:eastAsia="宋体"/>
+                <w:b w:val="0"/>
+                <w:color w:val="000000"/>
+                <w:sz w:val="21"/>
+              </w:rPr>
+              <w:t>每端一票的本地加密，六端算术均值</w:t>
+            </w:r>
+          </w:p>
+        </w:tc>
+        <w:tc>
+          <w:tcPr>
+            <w:tcW w:type="dxa" w:w="2324"/>
+            <w:tcBorders>
+              <w:top w:val="single" w:sz="4" w:color="C9D4DF"/>
+              <w:left w:val="single" w:sz="4" w:color="C9D4DF"/>
+              <w:bottom w:val="single" w:sz="4" w:color="C9D4DF"/>
+              <w:right w:val="single" w:sz="4" w:color="C9D4DF"/>
+            </w:tcBorders>
+          </w:tcPr>
+          <w:p>
+            <w:pPr>
+              <w:spacing w:line="288" w:lineRule="auto" w:before="60" w:after="60"/>
+            </w:pPr>
+            <w:r>
+              <w:rPr>
+                <w:rFonts w:ascii="Times New Roman" w:hAnsi="Times New Roman" w:eastAsia="宋体"/>
+                <w:b w:val="0"/>
+                <w:color w:val="000000"/>
+                <w:sz w:val="21"/>
+              </w:rPr>
+              <w:t>19.34</w:t>
+            </w:r>
+          </w:p>
+        </w:tc>
+      </w:tr>
+      <w:tr>
+        <w:tc>
+          <w:tcPr>
+            <w:tcW w:type="dxa" w:w="6520"/>
+            <w:tcBorders>
+              <w:top w:val="single" w:sz="4" w:color="C9D4DF"/>
+              <w:left w:val="single" w:sz="4" w:color="C9D4DF"/>
+              <w:bottom w:val="single" w:sz="4" w:color="C9D4DF"/>
+              <w:right w:val="single" w:sz="4" w:color="C9D4DF"/>
+            </w:tcBorders>
+          </w:tcPr>
+          <w:p>
+            <w:pPr>
+              <w:spacing w:line="288" w:lineRule="auto" w:before="60" w:after="60"/>
+            </w:pPr>
+            <w:r>
+              <w:rPr>
+                <w:rFonts w:ascii="Times New Roman" w:hAnsi="Times New Roman" w:eastAsia="宋体"/>
+                <w:b w:val="0"/>
+                <w:color w:val="000000"/>
+                <w:sz w:val="21"/>
+              </w:rPr>
+              <w:t>提交密文至收到回执，六端均值</w:t>
+            </w:r>
+          </w:p>
+        </w:tc>
+        <w:tc>
+          <w:tcPr>
+            <w:tcW w:type="dxa" w:w="2324"/>
+            <w:tcBorders>
+              <w:top w:val="single" w:sz="4" w:color="C9D4DF"/>
+              <w:left w:val="single" w:sz="4" w:color="C9D4DF"/>
+              <w:bottom w:val="single" w:sz="4" w:color="C9D4DF"/>
+              <w:right w:val="single" w:sz="4" w:color="C9D4DF"/>
+            </w:tcBorders>
+          </w:tcPr>
+          <w:p>
+            <w:pPr>
+              <w:spacing w:line="288" w:lineRule="auto" w:before="60" w:after="60"/>
+            </w:pPr>
+            <w:r>
+              <w:rPr>
+                <w:rFonts w:ascii="Times New Roman" w:hAnsi="Times New Roman" w:eastAsia="宋体"/>
+                <w:b w:val="0"/>
+                <w:color w:val="000000"/>
+                <w:sz w:val="21"/>
+              </w:rPr>
+              <w:t>151.91</w:t>
+            </w:r>
+          </w:p>
+        </w:tc>
+      </w:tr>
+      <w:tr>
+        <w:tc>
+          <w:tcPr>
+            <w:tcW w:type="dxa" w:w="6520"/>
+            <w:tcBorders>
+              <w:top w:val="single" w:sz="4" w:color="C9D4DF"/>
+              <w:left w:val="single" w:sz="4" w:color="C9D4DF"/>
+              <w:bottom w:val="single" w:sz="4" w:color="C9D4DF"/>
+              <w:right w:val="single" w:sz="4" w:color="C9D4DF"/>
+            </w:tcBorders>
+          </w:tcPr>
+          <w:p>
+            <w:pPr>
+              <w:spacing w:line="288" w:lineRule="auto" w:before="60" w:after="60"/>
+            </w:pPr>
+            <w:r>
+              <w:rPr>
+                <w:rFonts w:ascii="Times New Roman" w:hAnsi="Times New Roman" w:eastAsia="宋体"/>
+                <w:b w:val="0"/>
+                <w:color w:val="000000"/>
+                <w:sz w:val="21"/>
+              </w:rPr>
+              <w:t>服务器6票列乘积（不含审计）</w:t>
+            </w:r>
+          </w:p>
+        </w:tc>
+        <w:tc>
+          <w:tcPr>
+            <w:tcW w:type="dxa" w:w="2324"/>
+            <w:tcBorders>
+              <w:top w:val="single" w:sz="4" w:color="C9D4DF"/>
+              <w:left w:val="single" w:sz="4" w:color="C9D4DF"/>
+              <w:bottom w:val="single" w:sz="4" w:color="C9D4DF"/>
+              <w:right w:val="single" w:sz="4" w:color="C9D4DF"/>
+            </w:tcBorders>
+          </w:tcPr>
+          <w:p>
+            <w:pPr>
+              <w:spacing w:line="288" w:lineRule="auto" w:before="60" w:after="60"/>
+            </w:pPr>
+            <w:r>
+              <w:rPr>
+                <w:rFonts w:ascii="Times New Roman" w:hAnsi="Times New Roman" w:eastAsia="宋体"/>
+                <w:b w:val="0"/>
+                <w:color w:val="000000"/>
+                <w:sz w:val="21"/>
+              </w:rPr>
+              <w:t>0.59</w:t>
+            </w:r>
+          </w:p>
+        </w:tc>
+      </w:tr>
+      <w:tr>
+        <w:tc>
+          <w:tcPr>
+            <w:tcW w:type="dxa" w:w="6520"/>
+            <w:tcBorders>
+              <w:top w:val="single" w:sz="4" w:color="C9D4DF"/>
+              <w:left w:val="single" w:sz="4" w:color="C9D4DF"/>
+              <w:bottom w:val="single" w:sz="4" w:color="C9D4DF"/>
+              <w:right w:val="single" w:sz="4" w:color="C9D4DF"/>
+            </w:tcBorders>
+          </w:tcPr>
+          <w:p>
+            <w:pPr>
+              <w:spacing w:line="288" w:lineRule="auto" w:before="60" w:after="60"/>
+            </w:pPr>
+            <w:r>
+              <w:rPr>
+                <w:rFonts w:ascii="Times New Roman" w:hAnsi="Times New Roman" w:eastAsia="宋体"/>
+                <w:b w:val="0"/>
+                <w:color w:val="000000"/>
+                <w:sz w:val="21"/>
+              </w:rPr>
+              <w:t>保管端3列总票解密</w:t>
+            </w:r>
+          </w:p>
+        </w:tc>
+        <w:tc>
+          <w:tcPr>
+            <w:tcW w:type="dxa" w:w="2324"/>
+            <w:tcBorders>
+              <w:top w:val="single" w:sz="4" w:color="C9D4DF"/>
+              <w:left w:val="single" w:sz="4" w:color="C9D4DF"/>
+              <w:bottom w:val="single" w:sz="4" w:color="C9D4DF"/>
+              <w:right w:val="single" w:sz="4" w:color="C9D4DF"/>
+            </w:tcBorders>
+          </w:tcPr>
+          <w:p>
+            <w:pPr>
+              <w:spacing w:line="288" w:lineRule="auto" w:before="60" w:after="60"/>
+            </w:pPr>
+            <w:r>
+              <w:rPr>
+                <w:rFonts w:ascii="Times New Roman" w:hAnsi="Times New Roman" w:eastAsia="宋体"/>
+                <w:b w:val="0"/>
+                <w:color w:val="000000"/>
+                <w:sz w:val="21"/>
+              </w:rPr>
+              <w:t>5.16</w:t>
+            </w:r>
+          </w:p>
+        </w:tc>
+      </w:tr>
+    </w:tbl>
+    <w:p>
+      <w:pPr>
+        <w:pStyle w:val="ReportBody"/>
+      </w:pPr>
+      <w:r>
+        <w:t>加密计时包含独热向量构造与三分量随机加密，提交往返包含TLS、服务器事务和响应；汇总与解密计时只覆盖各自运算。六端在同一机器并发，包含CPU竞争；不能把一次运行当作网络部署性能保证。逐端原始值、进程耗时与源码哈希均保存在network-processes.json。</w:t>
+      </w:r>
+    </w:p>
+    <w:p>
+      <w:pPr>
+        <w:pStyle w:val="ReportCaption"/>
+        <w:keepNext/>
+      </w:pPr>
+      <w:r>
+        <w:t>表4 历史原语性能对照（各三次均值，毫秒）</w:t>
+      </w:r>
+    </w:p>
+    <w:tbl>
+      <w:tblPr>
+        <w:tblW w:type="auto" w:w="0"/>
+        <w:tblLayout w:type="fixed"/>
+        <w:tblLook w:firstColumn="1" w:firstRow="1" w:lastColumn="0" w:lastRow="0" w:noHBand="0" w:noVBand="1" w:val="04A0"/>
+      </w:tblPr>
+      <w:tblGrid>
+        <w:gridCol w:w="2338"/>
+        <w:gridCol w:w="2338"/>
+        <w:gridCol w:w="2338"/>
+        <w:gridCol w:w="2338"/>
+      </w:tblGrid>
+      <w:tr>
+        <w:trPr>
           <w:tblHeader/>
         </w:trPr>
         <w:tc>
           <w:tcPr>
-            <w:tcW w:type="dxa" w:w="1191"/>
-            <w:vAlign w:val="center"/>
-            <w:tcBorders>
-              <w:top w:val="single" w:sz="4" w:color="D9D9D9"/>
-              <w:left w:val="single" w:sz="4" w:color="D9D9D9"/>
-              <w:bottom w:val="single" w:sz="4" w:color="D9D9D9"/>
-              <w:right w:val="single" w:sz="4" w:color="D9D9D9"/>
-              <w:top w:val="single" w:sz="4" w:color="D9D9D9"/>
-              <w:left w:val="single" w:sz="4" w:color="D9D9D9"/>
-              <w:bottom w:val="single" w:sz="4" w:color="D9D9D9"/>
-              <w:right w:val="single" w:sz="4" w:color="D9D9D9"/>
-            </w:tcBorders>
-            <w:tcMar>
-              <w:top w:w="75" w:type="dxa"/>
-              <w:left w:w="75" w:type="dxa"/>
-              <w:bottom w:w="75" w:type="dxa"/>
-              <w:right w:w="75" w:type="dxa"/>
-            </w:tcMar>
-            <w:shd w:fill="E8EDF1"/>
-          </w:tcPr>
-          <w:p>
-            <w:pPr>
-              <w:keepNext/>
-              <w:spacing w:after="40" w:line="288" w:lineRule="auto" w:before="40"/>
+            <w:tcW w:type="dxa" w:w="1361"/>
+            <w:tcBorders>
+              <w:top w:val="single" w:sz="4" w:color="C9D4DF"/>
+              <w:left w:val="single" w:sz="4" w:color="C9D4DF"/>
+              <w:bottom w:val="single" w:sz="4" w:color="C9D4DF"/>
+              <w:right w:val="single" w:sz="4" w:color="C9D4DF"/>
+            </w:tcBorders>
+            <w:shd w:fill="E8EEF3"/>
+          </w:tcPr>
+          <w:p>
+            <w:pPr>
+              <w:spacing w:line="288" w:lineRule="auto" w:before="60" w:after="60"/>
             </w:pPr>
             <w:r>
               <w:rPr>
@@ -4271,146 +3798,97 @@
         </w:tc>
         <w:tc>
           <w:tcPr>
-            <w:tcW w:type="dxa" w:w="2665"/>
-            <w:vAlign w:val="center"/>
-            <w:tcBorders>
-              <w:top w:val="single" w:sz="4" w:color="D9D9D9"/>
-              <w:left w:val="single" w:sz="4" w:color="D9D9D9"/>
-              <w:bottom w:val="single" w:sz="4" w:color="D9D9D9"/>
-              <w:right w:val="single" w:sz="4" w:color="D9D9D9"/>
-              <w:top w:val="single" w:sz="4" w:color="D9D9D9"/>
-              <w:left w:val="single" w:sz="4" w:color="D9D9D9"/>
-              <w:bottom w:val="single" w:sz="4" w:color="D9D9D9"/>
-              <w:right w:val="single" w:sz="4" w:color="D9D9D9"/>
-            </w:tcBorders>
-            <w:tcMar>
-              <w:top w:w="75" w:type="dxa"/>
-              <w:left w:w="75" w:type="dxa"/>
-              <w:bottom w:w="75" w:type="dxa"/>
-              <w:right w:w="75" w:type="dxa"/>
-            </w:tcMar>
-            <w:shd w:fill="E8EDF1"/>
-          </w:tcPr>
-          <w:p>
-            <w:pPr>
-              <w:keepNext/>
-              <w:spacing w:after="40" w:line="288" w:lineRule="auto" w:before="40"/>
-            </w:pPr>
-            <w:r>
-              <w:rPr>
-                <w:rFonts w:ascii="Times New Roman" w:hAnsi="Times New Roman" w:eastAsia="宋体"/>
-                <w:b/>
-                <w:color w:val="000000"/>
-                <w:sz w:val="21"/>
-              </w:rPr>
-              <w:t>加密均值 ms</w:t>
-            </w:r>
-          </w:p>
-        </w:tc>
-        <w:tc>
-          <w:tcPr>
-            <w:tcW w:type="dxa" w:w="2665"/>
-            <w:vAlign w:val="center"/>
-            <w:tcBorders>
-              <w:top w:val="single" w:sz="4" w:color="D9D9D9"/>
-              <w:left w:val="single" w:sz="4" w:color="D9D9D9"/>
-              <w:bottom w:val="single" w:sz="4" w:color="D9D9D9"/>
-              <w:right w:val="single" w:sz="4" w:color="D9D9D9"/>
-              <w:top w:val="single" w:sz="4" w:color="D9D9D9"/>
-              <w:left w:val="single" w:sz="4" w:color="D9D9D9"/>
-              <w:bottom w:val="single" w:sz="4" w:color="D9D9D9"/>
-              <w:right w:val="single" w:sz="4" w:color="D9D9D9"/>
-            </w:tcBorders>
-            <w:tcMar>
-              <w:top w:w="75" w:type="dxa"/>
-              <w:left w:w="75" w:type="dxa"/>
-              <w:bottom w:w="75" w:type="dxa"/>
-              <w:right w:w="75" w:type="dxa"/>
-            </w:tcMar>
-            <w:shd w:fill="E8EDF1"/>
-          </w:tcPr>
-          <w:p>
-            <w:pPr>
-              <w:keepNext/>
-              <w:spacing w:after="40" w:line="288" w:lineRule="auto" w:before="40"/>
-            </w:pPr>
-            <w:r>
-              <w:rPr>
-                <w:rFonts w:ascii="Times New Roman" w:hAnsi="Times New Roman" w:eastAsia="宋体"/>
-                <w:b/>
-                <w:color w:val="000000"/>
-                <w:sz w:val="21"/>
-              </w:rPr>
-              <w:t>汇总均值 ms</w:t>
-            </w:r>
-          </w:p>
-        </w:tc>
-        <w:tc>
-          <w:tcPr>
-            <w:tcW w:type="dxa" w:w="2665"/>
-            <w:vAlign w:val="center"/>
-            <w:tcBorders>
-              <w:top w:val="single" w:sz="4" w:color="D9D9D9"/>
-              <w:left w:val="single" w:sz="4" w:color="D9D9D9"/>
-              <w:bottom w:val="single" w:sz="4" w:color="D9D9D9"/>
-              <w:right w:val="single" w:sz="4" w:color="D9D9D9"/>
-              <w:top w:val="single" w:sz="4" w:color="D9D9D9"/>
-              <w:left w:val="single" w:sz="4" w:color="D9D9D9"/>
-              <w:bottom w:val="single" w:sz="4" w:color="D9D9D9"/>
-              <w:right w:val="single" w:sz="4" w:color="D9D9D9"/>
-            </w:tcBorders>
-            <w:tcMar>
-              <w:top w:w="75" w:type="dxa"/>
-              <w:left w:w="75" w:type="dxa"/>
-              <w:bottom w:w="75" w:type="dxa"/>
-              <w:right w:w="75" w:type="dxa"/>
-            </w:tcMar>
-            <w:shd w:fill="E8EDF1"/>
-          </w:tcPr>
-          <w:p>
-            <w:pPr>
-              <w:keepNext/>
-              <w:spacing w:after="40" w:line="288" w:lineRule="auto" w:before="40"/>
-            </w:pPr>
-            <w:r>
-              <w:rPr>
-                <w:rFonts w:ascii="Times New Roman" w:hAnsi="Times New Roman" w:eastAsia="宋体"/>
-                <w:b/>
-                <w:color w:val="000000"/>
-                <w:sz w:val="21"/>
-              </w:rPr>
-              <w:t>解密均值 ms</w:t>
+            <w:tcW w:type="dxa" w:w="2494"/>
+            <w:tcBorders>
+              <w:top w:val="single" w:sz="4" w:color="C9D4DF"/>
+              <w:left w:val="single" w:sz="4" w:color="C9D4DF"/>
+              <w:bottom w:val="single" w:sz="4" w:color="C9D4DF"/>
+              <w:right w:val="single" w:sz="4" w:color="C9D4DF"/>
+            </w:tcBorders>
+            <w:shd w:fill="E8EEF3"/>
+          </w:tcPr>
+          <w:p>
+            <w:pPr>
+              <w:spacing w:line="288" w:lineRule="auto" w:before="60" w:after="60"/>
+            </w:pPr>
+            <w:r>
+              <w:rPr>
+                <w:rFonts w:ascii="Times New Roman" w:hAnsi="Times New Roman" w:eastAsia="宋体"/>
+                <w:b/>
+                <w:color w:val="000000"/>
+                <w:sz w:val="21"/>
+              </w:rPr>
+              <w:t>加密</w:t>
+            </w:r>
+          </w:p>
+        </w:tc>
+        <w:tc>
+          <w:tcPr>
+            <w:tcW w:type="dxa" w:w="2494"/>
+            <w:tcBorders>
+              <w:top w:val="single" w:sz="4" w:color="C9D4DF"/>
+              <w:left w:val="single" w:sz="4" w:color="C9D4DF"/>
+              <w:bottom w:val="single" w:sz="4" w:color="C9D4DF"/>
+              <w:right w:val="single" w:sz="4" w:color="C9D4DF"/>
+            </w:tcBorders>
+            <w:shd w:fill="E8EEF3"/>
+          </w:tcPr>
+          <w:p>
+            <w:pPr>
+              <w:spacing w:line="288" w:lineRule="auto" w:before="60" w:after="60"/>
+            </w:pPr>
+            <w:r>
+              <w:rPr>
+                <w:rFonts w:ascii="Times New Roman" w:hAnsi="Times New Roman" w:eastAsia="宋体"/>
+                <w:b/>
+                <w:color w:val="000000"/>
+                <w:sz w:val="21"/>
+              </w:rPr>
+              <w:t>汇总</w:t>
+            </w:r>
+          </w:p>
+        </w:tc>
+        <w:tc>
+          <w:tcPr>
+            <w:tcW w:type="dxa" w:w="2494"/>
+            <w:tcBorders>
+              <w:top w:val="single" w:sz="4" w:color="C9D4DF"/>
+              <w:left w:val="single" w:sz="4" w:color="C9D4DF"/>
+              <w:bottom w:val="single" w:sz="4" w:color="C9D4DF"/>
+              <w:right w:val="single" w:sz="4" w:color="C9D4DF"/>
+            </w:tcBorders>
+            <w:shd w:fill="E8EEF3"/>
+          </w:tcPr>
+          <w:p>
+            <w:pPr>
+              <w:spacing w:line="288" w:lineRule="auto" w:before="60" w:after="60"/>
+            </w:pPr>
+            <w:r>
+              <w:rPr>
+                <w:rFonts w:ascii="Times New Roman" w:hAnsi="Times New Roman" w:eastAsia="宋体"/>
+                <w:b/>
+                <w:color w:val="000000"/>
+                <w:sz w:val="21"/>
+              </w:rPr>
+              <w:t>解密</w:t>
             </w:r>
           </w:p>
         </w:tc>
       </w:tr>
       <w:tr>
-        <w:trPr/>
-        <w:tc>
-          <w:tcPr>
-            <w:tcW w:type="dxa" w:w="1191"/>
-            <w:vAlign w:val="center"/>
-            <w:tcBorders>
-              <w:top w:val="single" w:sz="4" w:color="D9D9D9"/>
-              <w:left w:val="single" w:sz="4" w:color="D9D9D9"/>
-              <w:bottom w:val="single" w:sz="4" w:color="D9D9D9"/>
-              <w:right w:val="single" w:sz="4" w:color="D9D9D9"/>
-              <w:top w:val="single" w:sz="4" w:color="D9D9D9"/>
-              <w:left w:val="single" w:sz="4" w:color="D9D9D9"/>
-              <w:bottom w:val="single" w:sz="4" w:color="D9D9D9"/>
-              <w:right w:val="single" w:sz="4" w:color="D9D9D9"/>
-            </w:tcBorders>
-            <w:tcMar>
-              <w:top w:w="75" w:type="dxa"/>
-              <w:left w:w="75" w:type="dxa"/>
-              <w:bottom w:w="75" w:type="dxa"/>
-              <w:right w:w="75" w:type="dxa"/>
-            </w:tcMar>
-          </w:tcPr>
-          <w:p>
-            <w:pPr>
-              <w:keepNext/>
-              <w:spacing w:line="288" w:lineRule="auto" w:after="40" w:before="40"/>
+        <w:tc>
+          <w:tcPr>
+            <w:tcW w:type="dxa" w:w="1361"/>
+            <w:tcBorders>
+              <w:top w:val="single" w:sz="4" w:color="C9D4DF"/>
+              <w:left w:val="single" w:sz="4" w:color="C9D4DF"/>
+              <w:bottom w:val="single" w:sz="4" w:color="C9D4DF"/>
+              <w:right w:val="single" w:sz="4" w:color="C9D4DF"/>
+            </w:tcBorders>
+          </w:tcPr>
+          <w:p>
+            <w:pPr>
+              <w:spacing w:line="288" w:lineRule="auto" w:before="60" w:after="60"/>
             </w:pPr>
             <w:r>
               <w:rPr>
@@ -4425,29 +3903,17 @@
         </w:tc>
         <w:tc>
           <w:tcPr>
-            <w:tcW w:type="dxa" w:w="2665"/>
-            <w:vAlign w:val="center"/>
-            <w:tcBorders>
-              <w:top w:val="single" w:sz="4" w:color="D9D9D9"/>
-              <w:left w:val="single" w:sz="4" w:color="D9D9D9"/>
-              <w:bottom w:val="single" w:sz="4" w:color="D9D9D9"/>
-              <w:right w:val="single" w:sz="4" w:color="D9D9D9"/>
-              <w:top w:val="single" w:sz="4" w:color="D9D9D9"/>
-              <w:left w:val="single" w:sz="4" w:color="D9D9D9"/>
-              <w:bottom w:val="single" w:sz="4" w:color="D9D9D9"/>
-              <w:right w:val="single" w:sz="4" w:color="D9D9D9"/>
-            </w:tcBorders>
-            <w:tcMar>
-              <w:top w:w="75" w:type="dxa"/>
-              <w:left w:w="75" w:type="dxa"/>
-              <w:bottom w:w="75" w:type="dxa"/>
-              <w:right w:w="75" w:type="dxa"/>
-            </w:tcMar>
-          </w:tcPr>
-          <w:p>
-            <w:pPr>
-              <w:keepNext/>
-              <w:spacing w:line="288" w:lineRule="auto" w:after="40" w:before="40"/>
+            <w:tcW w:type="dxa" w:w="2494"/>
+            <w:tcBorders>
+              <w:top w:val="single" w:sz="4" w:color="C9D4DF"/>
+              <w:left w:val="single" w:sz="4" w:color="C9D4DF"/>
+              <w:bottom w:val="single" w:sz="4" w:color="C9D4DF"/>
+              <w:right w:val="single" w:sz="4" w:color="C9D4DF"/>
+            </w:tcBorders>
+          </w:tcPr>
+          <w:p>
+            <w:pPr>
+              <w:spacing w:line="288" w:lineRule="auto" w:before="60" w:after="60"/>
             </w:pPr>
             <w:r>
               <w:rPr>
@@ -4462,29 +3928,17 @@
         </w:tc>
         <w:tc>
           <w:tcPr>
-            <w:tcW w:type="dxa" w:w="2665"/>
-            <w:vAlign w:val="center"/>
-            <w:tcBorders>
-              <w:top w:val="single" w:sz="4" w:color="D9D9D9"/>
-              <w:left w:val="single" w:sz="4" w:color="D9D9D9"/>
-              <w:bottom w:val="single" w:sz="4" w:color="D9D9D9"/>
-              <w:right w:val="single" w:sz="4" w:color="D9D9D9"/>
-              <w:top w:val="single" w:sz="4" w:color="D9D9D9"/>
-              <w:left w:val="single" w:sz="4" w:color="D9D9D9"/>
-              <w:bottom w:val="single" w:sz="4" w:color="D9D9D9"/>
-              <w:right w:val="single" w:sz="4" w:color="D9D9D9"/>
-            </w:tcBorders>
-            <w:tcMar>
-              <w:top w:w="75" w:type="dxa"/>
-              <w:left w:w="75" w:type="dxa"/>
-              <w:bottom w:w="75" w:type="dxa"/>
-              <w:right w:w="75" w:type="dxa"/>
-            </w:tcMar>
-          </w:tcPr>
-          <w:p>
-            <w:pPr>
-              <w:keepNext/>
-              <w:spacing w:line="288" w:lineRule="auto" w:after="40" w:before="40"/>
+            <w:tcW w:type="dxa" w:w="2494"/>
+            <w:tcBorders>
+              <w:top w:val="single" w:sz="4" w:color="C9D4DF"/>
+              <w:left w:val="single" w:sz="4" w:color="C9D4DF"/>
+              <w:bottom w:val="single" w:sz="4" w:color="C9D4DF"/>
+              <w:right w:val="single" w:sz="4" w:color="C9D4DF"/>
+            </w:tcBorders>
+          </w:tcPr>
+          <w:p>
+            <w:pPr>
+              <w:spacing w:line="288" w:lineRule="auto" w:before="60" w:after="60"/>
             </w:pPr>
             <w:r>
               <w:rPr>
@@ -4499,29 +3953,17 @@
         </w:tc>
         <w:tc>
           <w:tcPr>
-            <w:tcW w:type="dxa" w:w="2665"/>
-            <w:vAlign w:val="center"/>
-            <w:tcBorders>
-              <w:top w:val="single" w:sz="4" w:color="D9D9D9"/>
-              <w:left w:val="single" w:sz="4" w:color="D9D9D9"/>
-              <w:bottom w:val="single" w:sz="4" w:color="D9D9D9"/>
-              <w:right w:val="single" w:sz="4" w:color="D9D9D9"/>
-              <w:top w:val="single" w:sz="4" w:color="D9D9D9"/>
-              <w:left w:val="single" w:sz="4" w:color="D9D9D9"/>
-              <w:bottom w:val="single" w:sz="4" w:color="D9D9D9"/>
-              <w:right w:val="single" w:sz="4" w:color="D9D9D9"/>
-            </w:tcBorders>
-            <w:tcMar>
-              <w:top w:w="75" w:type="dxa"/>
-              <w:left w:w="75" w:type="dxa"/>
-              <w:bottom w:w="75" w:type="dxa"/>
-              <w:right w:w="75" w:type="dxa"/>
-            </w:tcMar>
-          </w:tcPr>
-          <w:p>
-            <w:pPr>
-              <w:keepNext/>
-              <w:spacing w:line="288" w:lineRule="auto" w:after="40" w:before="40"/>
+            <w:tcW w:type="dxa" w:w="2494"/>
+            <w:tcBorders>
+              <w:top w:val="single" w:sz="4" w:color="C9D4DF"/>
+              <w:left w:val="single" w:sz="4" w:color="C9D4DF"/>
+              <w:bottom w:val="single" w:sz="4" w:color="C9D4DF"/>
+              <w:right w:val="single" w:sz="4" w:color="C9D4DF"/>
+            </w:tcBorders>
+          </w:tcPr>
+          <w:p>
+            <w:pPr>
+              <w:spacing w:line="288" w:lineRule="auto" w:before="60" w:after="60"/>
             </w:pPr>
             <w:r>
               <w:rPr>
@@ -4536,32 +3978,19 @@
         </w:tc>
       </w:tr>
       <w:tr>
-        <w:trPr/>
-        <w:tc>
-          <w:tcPr>
-            <w:tcW w:type="dxa" w:w="1191"/>
-            <w:vAlign w:val="center"/>
-            <w:tcBorders>
-              <w:top w:val="single" w:sz="4" w:color="D9D9D9"/>
-              <w:left w:val="single" w:sz="4" w:color="D9D9D9"/>
-              <w:bottom w:val="single" w:sz="4" w:color="D9D9D9"/>
-              <w:right w:val="single" w:sz="4" w:color="D9D9D9"/>
-              <w:top w:val="single" w:sz="4" w:color="D9D9D9"/>
-              <w:left w:val="single" w:sz="4" w:color="D9D9D9"/>
-              <w:bottom w:val="single" w:sz="4" w:color="D9D9D9"/>
-              <w:right w:val="single" w:sz="4" w:color="D9D9D9"/>
-            </w:tcBorders>
-            <w:tcMar>
-              <w:top w:w="75" w:type="dxa"/>
-              <w:left w:w="75" w:type="dxa"/>
-              <w:bottom w:w="75" w:type="dxa"/>
-              <w:right w:w="75" w:type="dxa"/>
-            </w:tcMar>
-          </w:tcPr>
-          <w:p>
-            <w:pPr>
-              <w:keepNext/>
-              <w:spacing w:line="288" w:lineRule="auto" w:after="40" w:before="40"/>
+        <w:tc>
+          <w:tcPr>
+            <w:tcW w:type="dxa" w:w="1361"/>
+            <w:tcBorders>
+              <w:top w:val="single" w:sz="4" w:color="C9D4DF"/>
+              <w:left w:val="single" w:sz="4" w:color="C9D4DF"/>
+              <w:bottom w:val="single" w:sz="4" w:color="C9D4DF"/>
+              <w:right w:val="single" w:sz="4" w:color="C9D4DF"/>
+            </w:tcBorders>
+          </w:tcPr>
+          <w:p>
+            <w:pPr>
+              <w:spacing w:line="288" w:lineRule="auto" w:before="60" w:after="60"/>
             </w:pPr>
             <w:r>
               <w:rPr>
@@ -4576,29 +4005,17 @@
         </w:tc>
         <w:tc>
           <w:tcPr>
-            <w:tcW w:type="dxa" w:w="2665"/>
-            <w:vAlign w:val="center"/>
-            <w:tcBorders>
-              <w:top w:val="single" w:sz="4" w:color="D9D9D9"/>
-              <w:left w:val="single" w:sz="4" w:color="D9D9D9"/>
-              <w:bottom w:val="single" w:sz="4" w:color="D9D9D9"/>
-              <w:right w:val="single" w:sz="4" w:color="D9D9D9"/>
-              <w:top w:val="single" w:sz="4" w:color="D9D9D9"/>
-              <w:left w:val="single" w:sz="4" w:color="D9D9D9"/>
-              <w:bottom w:val="single" w:sz="4" w:color="D9D9D9"/>
-              <w:right w:val="single" w:sz="4" w:color="D9D9D9"/>
-            </w:tcBorders>
-            <w:tcMar>
-              <w:top w:w="75" w:type="dxa"/>
-              <w:left w:w="75" w:type="dxa"/>
-              <w:bottom w:w="75" w:type="dxa"/>
-              <w:right w:w="75" w:type="dxa"/>
-            </w:tcMar>
-          </w:tcPr>
-          <w:p>
-            <w:pPr>
-              <w:keepNext/>
-              <w:spacing w:line="288" w:lineRule="auto" w:after="40" w:before="40"/>
+            <w:tcW w:type="dxa" w:w="2494"/>
+            <w:tcBorders>
+              <w:top w:val="single" w:sz="4" w:color="C9D4DF"/>
+              <w:left w:val="single" w:sz="4" w:color="C9D4DF"/>
+              <w:bottom w:val="single" w:sz="4" w:color="C9D4DF"/>
+              <w:right w:val="single" w:sz="4" w:color="C9D4DF"/>
+            </w:tcBorders>
+          </w:tcPr>
+          <w:p>
+            <w:pPr>
+              <w:spacing w:line="288" w:lineRule="auto" w:before="60" w:after="60"/>
             </w:pPr>
             <w:r>
               <w:rPr>
@@ -4613,29 +4030,17 @@
         </w:tc>
         <w:tc>
           <w:tcPr>
-            <w:tcW w:type="dxa" w:w="2665"/>
-            <w:vAlign w:val="center"/>
-            <w:tcBorders>
-              <w:top w:val="single" w:sz="4" w:color="D9D9D9"/>
-              <w:left w:val="single" w:sz="4" w:color="D9D9D9"/>
-              <w:bottom w:val="single" w:sz="4" w:color="D9D9D9"/>
-              <w:right w:val="single" w:sz="4" w:color="D9D9D9"/>
-              <w:top w:val="single" w:sz="4" w:color="D9D9D9"/>
-              <w:left w:val="single" w:sz="4" w:color="D9D9D9"/>
-              <w:bottom w:val="single" w:sz="4" w:color="D9D9D9"/>
-              <w:right w:val="single" w:sz="4" w:color="D9D9D9"/>
-            </w:tcBorders>
-            <w:tcMar>
-              <w:top w:w="75" w:type="dxa"/>
-              <w:left w:w="75" w:type="dxa"/>
-              <w:bottom w:w="75" w:type="dxa"/>
-              <w:right w:w="75" w:type="dxa"/>
-            </w:tcMar>
-          </w:tcPr>
-          <w:p>
-            <w:pPr>
-              <w:keepNext/>
-              <w:spacing w:line="288" w:lineRule="auto" w:after="40" w:before="40"/>
+            <w:tcW w:type="dxa" w:w="2494"/>
+            <w:tcBorders>
+              <w:top w:val="single" w:sz="4" w:color="C9D4DF"/>
+              <w:left w:val="single" w:sz="4" w:color="C9D4DF"/>
+              <w:bottom w:val="single" w:sz="4" w:color="C9D4DF"/>
+              <w:right w:val="single" w:sz="4" w:color="C9D4DF"/>
+            </w:tcBorders>
+          </w:tcPr>
+          <w:p>
+            <w:pPr>
+              <w:spacing w:line="288" w:lineRule="auto" w:before="60" w:after="60"/>
             </w:pPr>
             <w:r>
               <w:rPr>
@@ -4650,29 +4055,17 @@
         </w:tc>
         <w:tc>
           <w:tcPr>
-            <w:tcW w:type="dxa" w:w="2665"/>
-            <w:vAlign w:val="center"/>
-            <w:tcBorders>
-              <w:top w:val="single" w:sz="4" w:color="D9D9D9"/>
-              <w:left w:val="single" w:sz="4" w:color="D9D9D9"/>
-              <w:bottom w:val="single" w:sz="4" w:color="D9D9D9"/>
-              <w:right w:val="single" w:sz="4" w:color="D9D9D9"/>
-              <w:top w:val="single" w:sz="4" w:color="D9D9D9"/>
-              <w:left w:val="single" w:sz="4" w:color="D9D9D9"/>
-              <w:bottom w:val="single" w:sz="4" w:color="D9D9D9"/>
-              <w:right w:val="single" w:sz="4" w:color="D9D9D9"/>
-            </w:tcBorders>
-            <w:tcMar>
-              <w:top w:w="75" w:type="dxa"/>
-              <w:left w:w="75" w:type="dxa"/>
-              <w:bottom w:w="75" w:type="dxa"/>
-              <w:right w:w="75" w:type="dxa"/>
-            </w:tcMar>
-          </w:tcPr>
-          <w:p>
-            <w:pPr>
-              <w:keepNext/>
-              <w:spacing w:line="288" w:lineRule="auto" w:after="40" w:before="40"/>
+            <w:tcW w:type="dxa" w:w="2494"/>
+            <w:tcBorders>
+              <w:top w:val="single" w:sz="4" w:color="C9D4DF"/>
+              <w:left w:val="single" w:sz="4" w:color="C9D4DF"/>
+              <w:bottom w:val="single" w:sz="4" w:color="C9D4DF"/>
+              <w:right w:val="single" w:sz="4" w:color="C9D4DF"/>
+            </w:tcBorders>
+          </w:tcPr>
+          <w:p>
+            <w:pPr>
+              <w:spacing w:line="288" w:lineRule="auto" w:before="60" w:after="60"/>
             </w:pPr>
             <w:r>
               <w:rPr>
@@ -4687,32 +4080,19 @@
         </w:tc>
       </w:tr>
       <w:tr>
-        <w:trPr/>
-        <w:tc>
-          <w:tcPr>
-            <w:tcW w:type="dxa" w:w="1191"/>
-            <w:vAlign w:val="center"/>
-            <w:tcBorders>
-              <w:top w:val="single" w:sz="4" w:color="D9D9D9"/>
-              <w:left w:val="single" w:sz="4" w:color="D9D9D9"/>
-              <w:bottom w:val="single" w:sz="4" w:color="D9D9D9"/>
-              <w:right w:val="single" w:sz="4" w:color="D9D9D9"/>
-              <w:top w:val="single" w:sz="4" w:color="D9D9D9"/>
-              <w:left w:val="single" w:sz="4" w:color="D9D9D9"/>
-              <w:bottom w:val="single" w:sz="4" w:color="D9D9D9"/>
-              <w:right w:val="single" w:sz="4" w:color="D9D9D9"/>
-            </w:tcBorders>
-            <w:tcMar>
-              <w:top w:w="75" w:type="dxa"/>
-              <w:left w:w="75" w:type="dxa"/>
-              <w:bottom w:w="75" w:type="dxa"/>
-              <w:right w:w="75" w:type="dxa"/>
-            </w:tcMar>
-          </w:tcPr>
-          <w:p>
-            <w:pPr>
-              <w:keepNext w:val="0"/>
-              <w:spacing w:line="288" w:lineRule="auto" w:after="40" w:before="40"/>
+        <w:tc>
+          <w:tcPr>
+            <w:tcW w:type="dxa" w:w="1361"/>
+            <w:tcBorders>
+              <w:top w:val="single" w:sz="4" w:color="C9D4DF"/>
+              <w:left w:val="single" w:sz="4" w:color="C9D4DF"/>
+              <w:bottom w:val="single" w:sz="4" w:color="C9D4DF"/>
+              <w:right w:val="single" w:sz="4" w:color="C9D4DF"/>
+            </w:tcBorders>
+          </w:tcPr>
+          <w:p>
+            <w:pPr>
+              <w:spacing w:line="288" w:lineRule="auto" w:before="60" w:after="60"/>
             </w:pPr>
             <w:r>
               <w:rPr>
@@ -4727,29 +4107,17 @@
         </w:tc>
         <w:tc>
           <w:tcPr>
-            <w:tcW w:type="dxa" w:w="2665"/>
-            <w:vAlign w:val="center"/>
-            <w:tcBorders>
-              <w:top w:val="single" w:sz="4" w:color="D9D9D9"/>
-              <w:left w:val="single" w:sz="4" w:color="D9D9D9"/>
-              <w:bottom w:val="single" w:sz="4" w:color="D9D9D9"/>
-              <w:right w:val="single" w:sz="4" w:color="D9D9D9"/>
-              <w:top w:val="single" w:sz="4" w:color="D9D9D9"/>
-              <w:left w:val="single" w:sz="4" w:color="D9D9D9"/>
-              <w:bottom w:val="single" w:sz="4" w:color="D9D9D9"/>
-              <w:right w:val="single" w:sz="4" w:color="D9D9D9"/>
-            </w:tcBorders>
-            <w:tcMar>
-              <w:top w:w="75" w:type="dxa"/>
-              <w:left w:w="75" w:type="dxa"/>
-              <w:bottom w:w="75" w:type="dxa"/>
-              <w:right w:w="75" w:type="dxa"/>
-            </w:tcMar>
-          </w:tcPr>
-          <w:p>
-            <w:pPr>
-              <w:keepNext w:val="0"/>
-              <w:spacing w:line="288" w:lineRule="auto" w:after="40" w:before="40"/>
+            <w:tcW w:type="dxa" w:w="2494"/>
+            <w:tcBorders>
+              <w:top w:val="single" w:sz="4" w:color="C9D4DF"/>
+              <w:left w:val="single" w:sz="4" w:color="C9D4DF"/>
+              <w:bottom w:val="single" w:sz="4" w:color="C9D4DF"/>
+              <w:right w:val="single" w:sz="4" w:color="C9D4DF"/>
+            </w:tcBorders>
+          </w:tcPr>
+          <w:p>
+            <w:pPr>
+              <w:spacing w:line="288" w:lineRule="auto" w:before="60" w:after="60"/>
             </w:pPr>
             <w:r>
               <w:rPr>
@@ -4764,29 +4132,17 @@
         </w:tc>
         <w:tc>
           <w:tcPr>
-            <w:tcW w:type="dxa" w:w="2665"/>
-            <w:vAlign w:val="center"/>
-            <w:tcBorders>
-              <w:top w:val="single" w:sz="4" w:color="D9D9D9"/>
-              <w:left w:val="single" w:sz="4" w:color="D9D9D9"/>
-              <w:bottom w:val="single" w:sz="4" w:color="D9D9D9"/>
-              <w:right w:val="single" w:sz="4" w:color="D9D9D9"/>
-              <w:top w:val="single" w:sz="4" w:color="D9D9D9"/>
-              <w:left w:val="single" w:sz="4" w:color="D9D9D9"/>
-              <w:bottom w:val="single" w:sz="4" w:color="D9D9D9"/>
-              <w:right w:val="single" w:sz="4" w:color="D9D9D9"/>
-            </w:tcBorders>
-            <w:tcMar>
-              <w:top w:w="75" w:type="dxa"/>
-              <w:left w:w="75" w:type="dxa"/>
-              <w:bottom w:w="75" w:type="dxa"/>
-              <w:right w:w="75" w:type="dxa"/>
-            </w:tcMar>
-          </w:tcPr>
-          <w:p>
-            <w:pPr>
-              <w:keepNext w:val="0"/>
-              <w:spacing w:line="288" w:lineRule="auto" w:after="40" w:before="40"/>
+            <w:tcW w:type="dxa" w:w="2494"/>
+            <w:tcBorders>
+              <w:top w:val="single" w:sz="4" w:color="C9D4DF"/>
+              <w:left w:val="single" w:sz="4" w:color="C9D4DF"/>
+              <w:bottom w:val="single" w:sz="4" w:color="C9D4DF"/>
+              <w:right w:val="single" w:sz="4" w:color="C9D4DF"/>
+            </w:tcBorders>
+          </w:tcPr>
+          <w:p>
+            <w:pPr>
+              <w:spacing w:line="288" w:lineRule="auto" w:before="60" w:after="60"/>
             </w:pPr>
             <w:r>
               <w:rPr>
@@ -4801,29 +4157,17 @@
         </w:tc>
         <w:tc>
           <w:tcPr>
-            <w:tcW w:type="dxa" w:w="2665"/>
-            <w:vAlign w:val="center"/>
-            <w:tcBorders>
-              <w:top w:val="single" w:sz="4" w:color="D9D9D9"/>
-              <w:left w:val="single" w:sz="4" w:color="D9D9D9"/>
-              <w:bottom w:val="single" w:sz="4" w:color="D9D9D9"/>
-              <w:right w:val="single" w:sz="4" w:color="D9D9D9"/>
-              <w:top w:val="single" w:sz="4" w:color="D9D9D9"/>
-              <w:left w:val="single" w:sz="4" w:color="D9D9D9"/>
-              <w:bottom w:val="single" w:sz="4" w:color="D9D9D9"/>
-              <w:right w:val="single" w:sz="4" w:color="D9D9D9"/>
-            </w:tcBorders>
-            <w:tcMar>
-              <w:top w:w="75" w:type="dxa"/>
-              <w:left w:w="75" w:type="dxa"/>
-              <w:bottom w:w="75" w:type="dxa"/>
-              <w:right w:w="75" w:type="dxa"/>
-            </w:tcMar>
-          </w:tcPr>
-          <w:p>
-            <w:pPr>
-              <w:keepNext w:val="0"/>
-              <w:spacing w:line="288" w:lineRule="auto" w:after="40" w:before="40"/>
+            <w:tcW w:type="dxa" w:w="2494"/>
+            <w:tcBorders>
+              <w:top w:val="single" w:sz="4" w:color="C9D4DF"/>
+              <w:left w:val="single" w:sz="4" w:color="C9D4DF"/>
+              <w:bottom w:val="single" w:sz="4" w:color="C9D4DF"/>
+              <w:right w:val="single" w:sz="4" w:color="C9D4DF"/>
+            </w:tcBorders>
+          </w:tcPr>
+          <w:p>
+            <w:pPr>
+              <w:spacing w:line="288" w:lineRule="auto" w:before="60" w:after="60"/>
             </w:pPr>
             <w:r>
               <w:rPr>
@@ -4843,7 +4187,15 @@
         <w:pStyle w:val="ReportBody"/>
       </w:pPr>
       <w:r>
-        <w:t>计时仅覆盖Paillier原语，不包括文件、签名、口令派生、进程及GUI；界面耗时则来自当前轮次的实际审计和解密端复算，二者口径不同。测试期间计算机有其他任务，三次原始记录保存在JSON中，均值不能当作部署保证。</w:t>
+        <w:t>表4来自本次架构修正前保留的完整原语实验evidence/2026-10-27/full/，仅作规模对照。它不包含联网、事务和TLS开销，也不是重新执行的联网千人测试；原始运行环境和哈希在其JSON中保留。</w:t>
+      </w:r>
+    </w:p>
+    <w:p>
+      <w:pPr>
+        <w:pStyle w:val="ReportH2"/>
+      </w:pPr>
+      <w:r>
+        <w:t>5.4 失败、误报与安全局限</w:t>
       </w:r>
     </w:p>
     <w:p>
@@ -4851,13 +4203,31 @@
         <w:pStyle w:val="ReportBody"/>
       </w:pPr>
       <w:r>
-        <w:rPr>
-          <w:rFonts w:ascii="Times New Roman" w:hAnsi="Times New Roman" w:eastAsia="宋体"/>
-          <w:b w:val="0"/>
-          <w:color w:val="000000"/>
-          <w:sz w:val="24"/>
-        </w:rPr>
-        <w:t>加密工作量与投票人数和选项数共同增长。固定3个选项时，每新增一名投票者需进行3次随机化Paillier加密，因此加密阶段占据主要计算时间。相同明文两次密文不同证明实现使用了随机化，但不能仅靠这项测试宣称密码实现已经获得安全审计。</w:t>
+        <w:t>文件损坏、网络断开、错误凭证与攻击可能出现相似提示，程序只报告可验证的失败原因。数据库内容与签名不一致时拒绝继续；连接中断时通过回执确认是否已接收，而不是直接重新计票。首次打包复测发现Windows重定向输出使用GBK，已统一管道输出UTF-8，再通过实际EXE进程验证。</w:t>
+      </w:r>
+    </w:p>
+    <w:p>
+      <w:pPr>
+        <w:pStyle w:val="ReportBody"/>
+      </w:pPr>
+      <w:r>
+        <w:t>未实现逐票独热零知识证明，[2,0]与[0,0]等非法组合可能仍满足总票数约束。单人结果会暴露选择。一次批准只限制同轮重复解密不同集合；若恶意服务器重新签署删票集合，首次集合是否完整仍需独立回执或外部见证，不能只靠服务器自己的签名。</w:t>
+      </w:r>
+    </w:p>
+    <w:p>
+      <w:pPr>
+        <w:pStyle w:val="ReportH1"/>
+      </w:pPr>
+      <w:r>
+        <w:t>六、总结</w:t>
+      </w:r>
+    </w:p>
+    <w:p>
+      <w:pPr>
+        <w:pStyle w:val="ReportBody"/>
+      </w:pPr>
+      <w:r>
+        <w:t>本模块将个人选择与Paillier私钥留在各自端点，建立了实际的客户端加密入口。服务端只得到随机密文；凭证分发和端点可信仍是前提。后续应完善凭证撤销与密文独热合法性证明。</w:t>
       </w:r>
     </w:p>
     <w:p>
@@ -4865,7 +4235,7 @@
         <w:pStyle w:val="ReportH2"/>
       </w:pPr>
       <w:r>
-        <w:t>5.4 准确性与可重复性</w:t>
+        <w:t>6.1 威胁模型与后续改进</w:t>
       </w:r>
     </w:p>
     <w:p>
@@ -4873,7 +4243,7 @@
         <w:pStyle w:val="ReportBody"/>
       </w:pPr>
       <w:r>
-        <w:t>基准6票序列[0,1,0,2,0,1]得到[3,2,1]；2、4、8选项各投一票均得到全1向量，零票返回全0。原生Qt测试记录在evidence/2026-10-27/ui/，验证6次控件投票、子进程计票和两种审计演示。图2采用本轮实际截图。</w:t>
+        <w:t>主要模型是服务器按协议收票与汇总、但可能试图了解个人选择；在Paillier私钥留在可信保管端、客户端可信的条件下，服务器无法直接解密单票。该模型不覆盖客户端中毒、私钥泄露、组织者错误分发凭证或服务器与保管者串通。后续可增加独热证明、门限解密、独立透明日志、凭证撤销与抗拒绝服务措施。</w:t>
       </w:r>
     </w:p>
     <w:p>
@@ -4881,7 +4251,7 @@
         <w:pStyle w:val="ReportH2"/>
       </w:pPr>
       <w:r>
-        <w:t>5.5 本轮发现的问题与处理</w:t>
+        <w:t>6.2 分工验收与个人复核</w:t>
       </w:r>
     </w:p>
     <w:p>
@@ -4889,21 +4259,7 @@
         <w:pStyle w:val="ReportBody"/>
       </w:pPr>
       <w:r>
-        <w:t>新增边界实验表明，客户端正确生成独热向量不等于接收端能证明密文合法。两名恶意客户端分别提交[2,0]与[0,0]的加密向量，最终总票为[2,0]，仍满足总和等于两票。处理方法是保留总和检查作为有限检测，明确合法性证明尚未实现，不把它写成“所有非法票都能被发现”。</w:t>
-      </w:r>
-    </w:p>
-    <w:p>
-      <w:pPr>
-        <w:pStyle w:val="ReportH1"/>
-      </w:pPr>
-      <w:r>
-        <w:rPr>
-          <w:rFonts w:ascii="Times New Roman" w:hAnsi="Times New Roman" w:eastAsia="宋体"/>
-          <w:b/>
-          <w:color w:val="000000"/>
-          <w:sz w:val="28"/>
-        </w:rPr>
-        <w:t>六、总结</w:t>
+        <w:t>为何不能把choice发送到服务器后再加密？为何公开nonce不能复用为r？证书指纹与配置摘要分别保护什么？凭证被转交后，服务器还能证明操作者身份吗？</w:t>
       </w:r>
     </w:p>
     <w:p>
@@ -4911,13 +4267,7 @@
         <w:pStyle w:val="ReportBody"/>
       </w:pPr>
       <w:r>
-        <w:rPr>
-          <w:rFonts w:ascii="Times New Roman" w:hAnsi="Times New Roman" w:eastAsia="宋体"/>
-          <w:b w:val="0"/>
-          <w:color w:val="000000"/>
-          <w:sz w:val="24"/>
-        </w:rPr>
-        <w:t>本模块完成了从单选输入到随机密文向量的转换，并通过真实测试验证了同态性、随机化和参数边界。后续改进应优先引入独热合法性证明和独立密钥保管，再考虑增加多选票型。</w:t>
+        <w:t>成员应在自己的电脑复跑相关实验，补全姓名学号、实际贡献与本人修改记录，并现场解释代码、完成教师要求的小改。当前分工是模块划分，不代替个人完成证明。</w:t>
       </w:r>
     </w:p>
     <w:p>
@@ -4925,13 +4275,7 @@
         <w:pStyle w:val="ReportH2"/>
       </w:pPr>
       <w:r>
-        <w:rPr>
-          <w:rFonts w:ascii="Times New Roman" w:hAnsi="Times New Roman" w:eastAsia="宋体"/>
-          <w:b/>
-          <w:color w:val="000000"/>
-          <w:sz w:val="24"/>
-        </w:rPr>
-        <w:t>6.1 安全局限与后续改进</w:t>
+        <w:t>6.3 AI使用声明</w:t>
       </w:r>
     </w:p>
     <w:p>
@@ -4939,13 +4283,7 @@
         <w:pStyle w:val="ReportBody"/>
       </w:pPr>
       <w:r>
-        <w:rPr>
-          <w:rFonts w:ascii="Times New Roman" w:hAnsi="Times New Roman" w:eastAsia="宋体"/>
-          <w:b w:val="0"/>
-          <w:color w:val="000000"/>
-          <w:sz w:val="24"/>
-        </w:rPr>
-        <w:t>系统未实现零知识证明、门限解密、证书认证及完整状态回滚保护。名单ID不是身份认证；私钥持有者能在程序之外解密单票；小群体结果可能暴露个体偏好。签名验证依赖最初可信配置，攻击者若同时替换所有配置、密钥与历史数据，本地应用无法自行建立原始信任。单文件原子写入不等于跨文件事务，当前只支持单机单写入者。</w:t>
+        <w:t>本项目使用OpenAI Codex辅助需求对照、代码与界面实现、联网架构修正、测试执行、报告修订及Git提交。测试数据来自实际运行的合成选票，AI参与范围详见根目录AI使用声明.txt；教师评分、签名和个人复核记录由实际参与者填写。</w:t>
       </w:r>
     </w:p>
     <w:p>
@@ -4953,110 +4291,6 @@
         <w:pStyle w:val="ReportH2"/>
       </w:pPr>
       <w:r>
-        <w:rPr>
-          <w:rFonts w:ascii="Times New Roman" w:hAnsi="Times New Roman" w:eastAsia="宋体"/>
-          <w:b/>
-          <w:color w:val="000000"/>
-          <w:sz w:val="24"/>
-        </w:rPr>
-        <w:t>6.2 分工验收与口试准备</w:t>
-      </w:r>
-    </w:p>
-    <w:p>
-      <w:pPr>
-        <w:pStyle w:val="ReportBody"/>
-      </w:pPr>
-      <w:r>
-        <w:t>为什么相同明文两次加密不同？r参与</w:t>
-      </w:r>
-      <w:r>
-        <w:t>r</w:t>
-      </w:r>
-      <w:r>
-        <w:rPr>
-          <w:vertAlign w:val="superscript"/>
-        </w:rPr>
-        <w:t>n</w:t>
-      </w:r>
-      <w:r>
-        <w:t>随机化。</w:t>
-      </w:r>
-    </w:p>
-    <w:p>
-      <w:pPr>
-        <w:pStyle w:val="ReportBody"/>
-      </w:pPr>
-      <w:r>
-        <w:rPr>
-          <w:rFonts w:ascii="Times New Roman" w:hAnsi="Times New Roman" w:eastAsia="宋体"/>
-          <w:b w:val="0"/>
-          <w:color w:val="000000"/>
-          <w:sz w:val="24"/>
-        </w:rPr>
-        <w:t>nonce与Paillier的r是否相同？不是；前者是公开选票标识，后者是加密内部随机数。</w:t>
-      </w:r>
-    </w:p>
-    <w:p>
-      <w:pPr>
-        <w:pStyle w:val="ReportBody"/>
-      </w:pPr>
-      <w:r>
-        <w:rPr>
-          <w:rFonts w:ascii="Times New Roman" w:hAnsi="Times New Roman" w:eastAsia="宋体"/>
-          <w:b w:val="0"/>
-          <w:color w:val="000000"/>
-          <w:sz w:val="24"/>
-        </w:rPr>
-        <w:t>增加一个选项如何处理？创建新轮次并增大向量维度，旧票不能混入。</w:t>
-      </w:r>
-    </w:p>
-    <w:p>
-      <w:pPr>
-        <w:pStyle w:val="ReportBody"/>
-      </w:pPr>
-      <w:r>
-        <w:rPr>
-          <w:rFonts w:ascii="Times New Roman" w:hAnsi="Times New Roman" w:eastAsia="宋体"/>
-          <w:b w:val="0"/>
-          <w:color w:val="000000"/>
-          <w:sz w:val="24"/>
-        </w:rPr>
-        <w:t>个人验收建议：在自己电脑上重新运行本模块实验，保存截图和测试记录；现场修改一个参数或校验条件，说明修改影响；根据真实参与情况补全姓名、学号与个人总结。</w:t>
-      </w:r>
-    </w:p>
-    <w:p>
-      <w:pPr>
-        <w:pStyle w:val="ReportH2"/>
-      </w:pPr>
-      <w:r>
-        <w:rPr>
-          <w:rFonts w:ascii="Times New Roman" w:hAnsi="Times New Roman" w:eastAsia="宋体"/>
-          <w:b/>
-          <w:color w:val="000000"/>
-          <w:sz w:val="24"/>
-        </w:rPr>
-        <w:t>6.3 AI使用声明</w:t>
-      </w:r>
-    </w:p>
-    <w:p>
-      <w:pPr>
-        <w:pStyle w:val="ReportBody"/>
-      </w:pPr>
-      <w:r>
-        <w:t>本次使用OpenAI Codex辅助审查代码、修订报告、执行实验和拆分Git提交。初稿与本轮修改均有仓库记录，AI参与范围详见根目录AI使用声明.txt。A/B/C为模块责任标识，学生需据真实贡献补全个人信息和复核记录，并独立解释代码。</w:t>
-      </w:r>
-    </w:p>
-    <w:p>
-      <w:pPr>
-        <w:pStyle w:val="ReportH2"/>
-      </w:pPr>
-      <w:r>
-        <w:rPr>
-          <w:rFonts w:ascii="Times New Roman" w:hAnsi="Times New Roman" w:eastAsia="宋体"/>
-          <w:b/>
-          <w:color w:val="000000"/>
-          <w:sz w:val="24"/>
-        </w:rPr>
         <w:t>参考资料</w:t>
       </w:r>
     </w:p>
@@ -5074,7 +4308,7 @@
           <w:color w:val="000000"/>
           <w:sz w:val="21"/>
         </w:rPr>
-        <w:t>[1] 专业课程设计任务书 B230414 2026—2027第一学期。</w:t>
+        <w:t>[1] 专业课程设计任务书，B230414，2026—2027学年第一学期。</w:t>
       </w:r>
     </w:p>
     <w:p>
@@ -5091,7 +4325,7 @@
           <w:color w:val="000000"/>
           <w:sz w:val="21"/>
         </w:rPr>
-        <w:t>[2] python-paillier API Documentation. https://python-paillier.readthedocs.io/en/stable/phe.html</w:t>
+        <w:t>[2] python-paillier API. https://python-paillier.readthedocs.io/en/stable/phe.html</w:t>
       </w:r>
     </w:p>
     <w:p>
@@ -5108,7 +4342,7 @@
           <w:color w:val="000000"/>
           <w:sz w:val="21"/>
         </w:rPr>
-        <w:t>[3] Cryptography Ed25519 signing. https://cryptography.io/en/latest/hazmat/primitives/asymmetric/ed25519/</w:t>
+        <w:t>[3] Cryptography Ed25519. https://cryptography.io/en/latest/hazmat/primitives/asymmetric/ed25519/</w:t>
       </w:r>
     </w:p>
     <w:p>
@@ -5125,7 +4359,24 @@
           <w:color w:val="000000"/>
           <w:sz w:val="21"/>
         </w:rPr>
-        <w:t>[4] PyInstaller Using PyInstaller. https://pyinstaller.org/en/stable/usage.html</w:t>
+        <w:t>[4] Python sqlite3. https://docs.python.org/3/library/sqlite3.html</w:t>
+      </w:r>
+    </w:p>
+    <w:p>
+      <w:pPr>
+        <w:pStyle w:val="ReportBody"/>
+        <w:spacing w:line="288" w:lineRule="auto"/>
+        <w:ind w:firstLine="0"/>
+        <w:jc w:val="left"/>
+      </w:pPr>
+      <w:r>
+        <w:rPr>
+          <w:rFonts w:ascii="Times New Roman" w:hAnsi="Times New Roman" w:eastAsia="宋体"/>
+          <w:b w:val="0"/>
+          <w:color w:val="000000"/>
+          <w:sz w:val="21"/>
+        </w:rPr>
+        <w:t>[5] Python ssl. https://docs.python.org/3/library/ssl.html</w:t>
       </w:r>
     </w:p>
     <w:sectPr>
@@ -5749,7 +5000,7 @@
       <w:keepLines/>
       <w:widowControl/>
       <w:spacing w:after="0" w:before="0" w:line="240" w:lineRule="auto"/>
-      <w:ind w:firstLine="0" w:left="240"/>
+      <w:ind w:left="240" w:firstLine="0"/>
       <w:jc w:val="left"/>
     </w:pPr>
     <w:rPr>

</xml_diff>